<commit_message>
Fix stale alpha=0 values in 07 table + generate docx for 05/06/07
- 07 §3.3 table: Update alpha=0 row (4 edges → 0, 17.8% → N/A, ~50% → N/A)
  to reflect np.sign() noise fix
- Generate 05_explainer.docx (5 figures inline, general audience)
- Generate 06_academic.docx (5 figures inline, §8.5-8.8 included)
- Generate 07_comparison.docx (3 figures inline, §4-8 ECD/transition/workflow)

Co-Authored-By: Tatsuki Onishi <bougtoir@gmail.com>
</commit_message>
<xml_diff>
--- a/spectral-causality-brainstorm/05_spectral_causality_explainer.docx
+++ b/spectral-causality-brainstorm/05_spectral_causality_explainer.docx
@@ -4,52 +4,52 @@
   <w:body>
     <w:p>
       <w:pPr>
+        <w:pStyle w:val="Title"/>
         <w:jc w:val="center"/>
       </w:pPr>
       <w:r>
-        <w:rPr>
-          <w:b/>
-          <w:sz w:val="32"/>
-        </w:rPr>
         <w:t>スペクトル因果性 — 「音の科学」で因果関係を見つける</w:t>
       </w:r>
     </w:p>
     <w:p>
       <w:pPr>
-        <w:jc w:val="center"/>
+        <w:pStyle w:val="Heading1"/>
       </w:pPr>
       <w:r>
-        <w:rPr>
-          <w:i/>
-          <w:color w:val="646464"/>
-          <w:sz w:val="24"/>
-        </w:rPr>
-        <w:t>Spectral Causality: Finding Causal Relations Through the Science of Sound</w:t>
+        <w:t>この文書の目的</w:t>
       </w:r>
     </w:p>
     <w:p>
       <w:r>
-        <w:t># スペクトル因果性 — 「音の科学」で因果関係を見つける</w:t>
+        <w:t>「因果推論」と聞くと、統計学や疫学の専門用語が飛び交い、敷居が高く感じるかもしれません。本稿では、</w:t>
+      </w:r>
+      <w:r>
+        <w:rPr>
+          <w:b/>
+        </w:rPr>
+        <w:t>音楽のたとえ</w:t>
+      </w:r>
+      <w:r>
+        <w:t>を使いながら、「スペクトル因果性」という新しいアプローチを、専門外の方にも伝わるように解説します。</w:t>
       </w:r>
     </w:p>
     <w:p>
       <w:r>
-        <w:t>「因果推論」と聞くと、統計学や疫学の専門用語が飛び交い、敷居が高く感じるかもしれません。本稿では、音楽のたとえを使いながら、「スペクトル因果性」という新しいアプローチを、専門外の方にも伝わるように解説します。</w:t>
+        <w:t>さらに、</w:t>
       </w:r>
-    </w:p>
-    <w:p>
       <w:r>
-        <w:t>さらに、実際の心疾患データ（UCI Heart Disease Dataset, 297名） を用いた解析結果を示し、既存手法（LiNGAM）との比較も行います。</w:t>
+        <w:rPr>
+          <w:b/>
+        </w:rPr>
+        <w:t>実際の心疾患データ（UCI Heart Disease Dataset, 297名）</w:t>
       </w:r>
-    </w:p>
-    <w:p>
       <w:r>
-        <w:t>---</w:t>
+        <w:t xml:space="preserve"> を用いた解析結果を示し、既存手法（LiNGAM）との比較も行います。</w:t>
       </w:r>
     </w:p>
     <w:p>
       <w:pPr>
-        <w:pStyle w:val="Heading2"/>
+        <w:pStyle w:val="Heading1"/>
       </w:pPr>
       <w:r>
         <w:t>1. そもそも「因果関係」とは何か？ — 3つのレベル</w:t>
@@ -57,7 +57,16 @@
     </w:p>
     <w:p>
       <w:r>
-        <w:t>まず、「因果関係」には深さのレベルがあります。Judea Pearlが提唱した「因果の梯子（Ladder of Causation）」で整理すると（図6参照）:</w:t>
+        <w:t>まず、「因果関係」には</w:t>
+      </w:r>
+      <w:r>
+        <w:rPr>
+          <w:b/>
+        </w:rPr>
+        <w:t>深さのレベル</w:t>
+      </w:r>
+      <w:r>
+        <w:t>があります。Judea Pearlが提唱した「因果の梯子（Ladder of Causation）」で整理すると（図6参照）:</w:t>
       </w:r>
     </w:p>
     <w:p>
@@ -102,7 +111,7 @@
     </w:p>
     <w:p>
       <w:pPr>
-        <w:pStyle w:val="Heading3"/>
+        <w:pStyle w:val="Heading2"/>
       </w:pPr>
       <w:r>
         <w:t>「情報的因果」とは？</w:t>
@@ -131,17 +140,38 @@
         <w:pStyle w:val="ListBullet"/>
       </w:pPr>
       <w:r>
-        <w:t>Level 1（関連）よりは深い — 単に相関があるだけでなく、病態生理学的な理由がある</w:t>
+        <w:t>Level 1（関連）よりは深い — 単に相関があるだけでなく、</w:t>
+      </w:r>
+      <w:r>
+        <w:rPr>
+          <w:b/>
+        </w:rPr>
+        <w:t>病態生理学的な理由</w:t>
+      </w:r>
+      <w:r>
+        <w:t>がある</w:t>
       </w:r>
     </w:p>
     <w:p>
       <w:r>
-        <w:t>この「知れば何が分かるか」という関係が Level 1.5: 情報的因果 です。</w:t>
+        <w:t xml:space="preserve">この「知れば何が分かるか」という関係が </w:t>
+      </w:r>
+      <w:r>
+        <w:rPr>
+          <w:b/>
+        </w:rPr>
+        <w:t>Level 1.5: 情報的因果</w:t>
+      </w:r>
+      <w:r>
+        <w:t xml:space="preserve"> です。</w:t>
       </w:r>
     </w:p>
     <w:p>
+      <w:pPr>
+        <w:pStyle w:val="Heading1"/>
+      </w:pPr>
       <w:r>
-        <w:t>---</w:t>
+        <w:t>2. 「音」のたとえ — なぜ「スペクトル」なのか</w:t>
       </w:r>
     </w:p>
     <w:p>
@@ -149,26 +179,37 @@
         <w:pStyle w:val="Heading2"/>
       </w:pPr>
       <w:r>
-        <w:t>2. 「音」のたとえ — なぜ「スペクトル」なのか</w:t>
-      </w:r>
-    </w:p>
-    <w:p>
-      <w:pPr>
-        <w:pStyle w:val="Heading3"/>
-      </w:pPr>
-      <w:r>
         <w:t>音の三要素とデータの三要素</w:t>
       </w:r>
     </w:p>
     <w:p>
       <w:r>
-        <w:t>音楽を聞くとき、私たちは個々の音波を聞いているのではなく、和音（コード）やメロディを聞いています。</w:t>
+        <w:t>音楽を聞くとき、私たちは</w:t>
+      </w:r>
+      <w:r>
+        <w:rPr>
+          <w:b/>
+        </w:rPr>
+        <w:t>個々の音波</w:t>
+      </w:r>
+      <w:r>
+        <w:t>を聞いているのではなく、</w:t>
+      </w:r>
+      <w:r>
+        <w:rPr>
+          <w:b/>
+        </w:rPr>
+        <w:t>和音（コード）やメロディ</w:t>
+      </w:r>
+      <w:r>
+        <w:t>を聞いています。</w:t>
       </w:r>
     </w:p>
     <w:tbl>
       <w:tblPr>
         <w:tblStyle w:val="TableGrid"/>
         <w:tblW w:type="auto" w:w="0"/>
+        <w:jc w:val="center"/>
         <w:tblLook w:firstColumn="1" w:firstRow="1" w:lastColumn="0" w:lastRow="0" w:noHBand="0" w:noVBand="1" w:val="04A0"/>
       </w:tblPr>
       <w:tblGrid>
@@ -181,6 +222,10 @@
             <w:tcW w:type="dxa" w:w="4320"/>
           </w:tcPr>
           <w:p>
+            <w:pPr>
+              <w:jc w:val="left"/>
+            </w:pPr>
+            <w:r/>
             <w:r>
               <w:rPr>
                 <w:b/>
@@ -195,6 +240,10 @@
             <w:tcW w:type="dxa" w:w="4320"/>
           </w:tcPr>
           <w:p>
+            <w:pPr>
+              <w:jc w:val="left"/>
+            </w:pPr>
+            <w:r/>
             <w:r>
               <w:rPr>
                 <w:b/>
@@ -211,8 +260,13 @@
             <w:tcW w:type="dxa" w:w="4320"/>
           </w:tcPr>
           <w:p>
+            <w:pPr>
+              <w:jc w:val="left"/>
+            </w:pPr>
+            <w:r/>
             <w:r>
               <w:rPr>
+                <w:b w:val="0"/>
                 <w:sz w:val="18"/>
               </w:rPr>
               <w:t>個々の音波（周波数）</w:t>
@@ -224,8 +278,13 @@
             <w:tcW w:type="dxa" w:w="4320"/>
           </w:tcPr>
           <w:p>
+            <w:pPr>
+              <w:jc w:val="left"/>
+            </w:pPr>
+            <w:r/>
             <w:r>
               <w:rPr>
+                <w:b w:val="0"/>
                 <w:sz w:val="18"/>
               </w:rPr>
               <w:t>個々の検査値（血圧、コレステロール...）</w:t>
@@ -239,8 +298,13 @@
             <w:tcW w:type="dxa" w:w="4320"/>
           </w:tcPr>
           <w:p>
+            <w:pPr>
+              <w:jc w:val="left"/>
+            </w:pPr>
+            <w:r/>
             <w:r>
               <w:rPr>
+                <w:b w:val="0"/>
                 <w:sz w:val="18"/>
               </w:rPr>
               <w:t>和音（複数の音の重ね合わせ）</w:t>
@@ -252,8 +316,13 @@
             <w:tcW w:type="dxa" w:w="4320"/>
           </w:tcPr>
           <w:p>
+            <w:pPr>
+              <w:jc w:val="left"/>
+            </w:pPr>
+            <w:r/>
             <w:r>
               <w:rPr>
+                <w:b w:val="0"/>
                 <w:sz w:val="18"/>
               </w:rPr>
               <w:t>臨床テーマ（「心血管リスク」「代謝異常」...）</w:t>
@@ -267,8 +336,13 @@
             <w:tcW w:type="dxa" w:w="4320"/>
           </w:tcPr>
           <w:p>
+            <w:pPr>
+              <w:jc w:val="left"/>
+            </w:pPr>
+            <w:r/>
             <w:r>
               <w:rPr>
+                <w:b w:val="0"/>
                 <w:sz w:val="18"/>
               </w:rPr>
               <w:t>メロディ（和音の時間的変化）</w:t>
@@ -280,8 +354,13 @@
             <w:tcW w:type="dxa" w:w="4320"/>
           </w:tcPr>
           <w:p>
+            <w:pPr>
+              <w:jc w:val="left"/>
+            </w:pPr>
+            <w:r/>
             <w:r>
               <w:rPr>
+                <w:b w:val="0"/>
                 <w:sz w:val="18"/>
               </w:rPr>
               <w:t>疾患の進行パターン</w:t>
@@ -295,8 +374,13 @@
             <w:tcW w:type="dxa" w:w="4320"/>
           </w:tcPr>
           <w:p>
+            <w:pPr>
+              <w:jc w:val="left"/>
+            </w:pPr>
+            <w:r/>
             <w:r>
               <w:rPr>
+                <w:b w:val="0"/>
                 <w:sz w:val="18"/>
               </w:rPr>
               <w:t>楽譜のフーリエ解析</w:t>
@@ -308,8 +392,13 @@
             <w:tcW w:type="dxa" w:w="4320"/>
           </w:tcPr>
           <w:p>
+            <w:pPr>
+              <w:jc w:val="left"/>
+            </w:pPr>
+            <w:r/>
             <w:r>
               <w:rPr>
+                <w:b w:val="0"/>
                 <w:sz w:val="18"/>
               </w:rPr>
               <w:t>ユーティリティグラフのスペクトル分解</w:t>
@@ -321,12 +410,27 @@
     <w:p/>
     <w:p>
       <w:r>
-        <w:t>スペクトル分解 = 複雑な波形を基本周波数に分解すること。音の世界のフーリエ変換を、データのネットワークに適用するのが「スペクトル因果性」の核心です。</w:t>
+        <w:rPr>
+          <w:b/>
+        </w:rPr>
+        <w:t>スペクトル分解</w:t>
+      </w:r>
+      <w:r>
+        <w:t xml:space="preserve"> = 複雑な波形を基本周波数に分解すること。音の世界のフーリエ変換を、</w:t>
+      </w:r>
+      <w:r>
+        <w:rPr>
+          <w:b/>
+        </w:rPr>
+        <w:t>データのネットワーク</w:t>
+      </w:r>
+      <w:r>
+        <w:t>に適用するのが「スペクトル因果性」の核心です。</w:t>
       </w:r>
     </w:p>
     <w:p>
       <w:pPr>
-        <w:pStyle w:val="Heading3"/>
+        <w:pStyle w:val="Heading2"/>
       </w:pPr>
       <w:r>
         <w:t>なぜこれが因果関係と関係するのか？</w:t>
@@ -334,7 +438,16 @@
     </w:p>
     <w:p>
       <w:r>
-        <w:t>ギターの弦を弾くと、振動は一方向に伝わります。低い弦（太い弦）から高い弦に振動が伝わることはあっても、逆は起きにくい。</w:t>
+        <w:t>ギターの弦を弾くと、振動は</w:t>
+      </w:r>
+      <w:r>
+        <w:rPr>
+          <w:b/>
+        </w:rPr>
+        <w:t>一方向に</w:t>
+      </w:r>
+      <w:r>
+        <w:t>伝わります。低い弦（太い弦）から高い弦に振動が伝わることはあっても、逆は起きにくい。</w:t>
       </w:r>
     </w:p>
     <w:p>
@@ -347,7 +460,13 @@
         <w:pStyle w:val="ListBullet"/>
       </w:pPr>
       <w:r>
-        <w:t>年齢 → 血圧（年齢が上がると血圧も上がる傾向）</w:t>
+        <w:rPr>
+          <w:b/>
+        </w:rPr>
+        <w:t>年齢</w:t>
+      </w:r>
+      <w:r>
+        <w:t xml:space="preserve"> → 血圧（年齢が上がると血圧も上がる傾向）</w:t>
       </w:r>
     </w:p>
     <w:p>
@@ -355,22 +474,32 @@
         <w:pStyle w:val="ListBullet"/>
       </w:pPr>
       <w:r>
-        <w:t>血圧 → ST低下（血圧が心臓に負荷をかけ、心電図変化を引き起こす）</w:t>
+        <w:rPr>
+          <w:b/>
+        </w:rPr>
+        <w:t>血圧</w:t>
+      </w:r>
+      <w:r>
+        <w:t xml:space="preserve"> → ST低下（血圧が心臓に負荷をかけ、心電図変化を引き起こす）</w:t>
       </w:r>
     </w:p>
     <w:p>
       <w:r>
-        <w:t>この「流れの方向」を、ネットワークのスペクトル（固有値・固有ベクトル）から読み取ろうというのがスペクトル因果性です。</w:t>
+        <w:t>この「流れの方向」を、ネットワークのスペクトル（固有値・固有ベクトル）から読み取ろうというのが</w:t>
       </w:r>
-    </w:p>
-    <w:p>
       <w:r>
-        <w:t>---</w:t>
+        <w:rPr>
+          <w:b/>
+        </w:rPr>
+        <w:t>スペクトル因果性</w:t>
+      </w:r>
+      <w:r>
+        <w:t>です。</w:t>
       </w:r>
     </w:p>
     <w:p>
       <w:pPr>
-        <w:pStyle w:val="Heading2"/>
+        <w:pStyle w:val="Heading1"/>
       </w:pPr>
       <w:r>
         <w:t>3. 3つのアプローチ — 実データで比較</w:t>
@@ -383,7 +512,13 @@
     </w:p>
     <w:p>
       <w:r>
-        <w:t>使用した変数:</w:t>
+        <w:rPr>
+          <w:b/>
+        </w:rPr>
+        <w:t>使用した変数</w:t>
+      </w:r>
+      <w:r>
+        <w:t>:</w:t>
       </w:r>
     </w:p>
     <w:p>
@@ -428,7 +563,7 @@
     </w:p>
     <w:p>
       <w:pPr>
-        <w:pStyle w:val="Heading3"/>
+        <w:pStyle w:val="Heading2"/>
       </w:pPr>
       <w:r>
         <w:t>(A) 従来のアプローチ: バラバラの変数</w:t>
@@ -436,13 +571,162 @@
     </w:p>
     <w:p>
       <w:r>
-        <w:t>変数を個々に見るだけでは、変数間の関係は見えません。「血圧が高い人はコレステロールも高い傾向がある」程度のことしか分かりません（図1A）。</w:t>
+        <w:t>変数を個々に見るだけでは、変数間の関係は見えません。「血圧が高い人はコレステロールも高い</w:t>
+      </w:r>
+      <w:r>
+        <w:rPr>
+          <w:b/>
+        </w:rPr>
+        <w:t>傾向がある</w:t>
+      </w:r>
+      <w:r>
+        <w:t>」程度のことしか分かりません（図1A）。</w:t>
       </w:r>
     </w:p>
     <w:p>
       <w:pPr>
-        <w:spacing w:before="240"/>
+        <w:pStyle w:val="Heading2"/>
       </w:pPr>
+      <w:r>
+        <w:t>(B) LiNGAM: 変数レベルの因果DAG</w:t>
+      </w:r>
+    </w:p>
+    <w:p>
+      <w:r>
+        <w:t>LiNGAM（Linear Non-Gaussian Acyclic Model）は、データの</w:t>
+      </w:r>
+      <w:r>
+        <w:rPr>
+          <w:b/>
+        </w:rPr>
+        <w:t>非ガウス性</w:t>
+      </w:r>
+      <w:r>
+        <w:t>（分布の歪み）を利用して因果の方向を推定します。</w:t>
+      </w:r>
+    </w:p>
+    <w:p>
+      <w:r>
+        <w:t>実際の解析結果:</w:t>
+      </w:r>
+    </w:p>
+    <w:p>
+      <w:pPr>
+        <w:ind w:left="567"/>
+      </w:pPr>
+      <w:r>
+        <w:rPr>
+          <w:rFonts w:ascii="Courier New" w:hAnsi="Courier New"/>
+          <w:sz w:val="18"/>
+        </w:rPr>
+        <w:t>年齢 → 最大心拍数 (係数: -0.395)  ← 年齢が上がると最大心拍数が下がる</w:t>
+        <w:br/>
+        <w:t>年齢 → 安静時血圧 (係数: +0.309)  ← 年齢が上がると血圧が上がる</w:t>
+        <w:br/>
+        <w:t>年齢 → コレステロール (係数: +0.203)</w:t>
+        <w:br/>
+        <w:t>最大心拍数 → ST低下 (係数: -0.348)  ← 運動能力の低下が心筋虚血に</w:t>
+      </w:r>
+    </w:p>
+    <w:p>
+      <w:r>
+        <w:t>これは変数レベルの「XがYの原因」を明確に示します（図1B）。</w:t>
+      </w:r>
+      <w:r>
+        <w:rPr>
+          <w:b/>
+        </w:rPr>
+        <w:t>しかし</w:t>
+      </w:r>
+      <w:r>
+        <w:t>、この結果は「なぜそうなるのか」（メカニズム）については何も教えてくれません。</w:t>
+      </w:r>
+    </w:p>
+    <w:p>
+      <w:pPr>
+        <w:pStyle w:val="Heading2"/>
+      </w:pPr>
+      <w:r>
+        <w:t>(C) スペクトル因果性: テーマレベルの因果フロー</w:t>
+      </w:r>
+    </w:p>
+    <w:p>
+      <w:r>
+        <w:t>スペクトル因果性では、まず変数を「</w:t>
+      </w:r>
+      <w:r>
+        <w:rPr>
+          <w:b/>
+        </w:rPr>
+        <w:t>臨床的に何に役立つか</w:t>
+      </w:r>
+      <w:r>
+        <w:t>」で結びつけます。</w:t>
+      </w:r>
+    </w:p>
+    <w:p>
+      <w:r>
+        <w:t>例えば:</w:t>
+      </w:r>
+    </w:p>
+    <w:p>
+      <w:pPr>
+        <w:pStyle w:val="ListBullet"/>
+      </w:pPr>
+      <w:r>
+        <w:t xml:space="preserve">「年齢」は → 心血管リスク評価、代謝年齢推定、治療候補判定 </w:t>
+      </w:r>
+      <w:r>
+        <w:rPr>
+          <w:b/>
+        </w:rPr>
+        <w:t>に役立つ</w:t>
+      </w:r>
+    </w:p>
+    <w:p>
+      <w:pPr>
+        <w:pStyle w:val="ListBullet"/>
+      </w:pPr>
+      <w:r>
+        <w:t xml:space="preserve">「ST低下」は → 心筋虚血の検出、冠動脈疾患の重症度評価 </w:t>
+      </w:r>
+      <w:r>
+        <w:rPr>
+          <w:b/>
+        </w:rPr>
+        <w:t>に役立つ</w:t>
+      </w:r>
+    </w:p>
+    <w:p>
+      <w:pPr>
+        <w:pStyle w:val="ListBullet"/>
+      </w:pPr>
+      <w:r>
+        <w:t>両者は「</w:t>
+      </w:r>
+      <w:r>
+        <w:rPr>
+          <w:b/>
+        </w:rPr>
+        <w:t>心血管リスク評価</w:t>
+      </w:r>
+      <w:r>
+        <w:t>」という共通テーマで結びつく</w:t>
+      </w:r>
+    </w:p>
+    <w:p>
+      <w:r>
+        <w:t>この「何に役立つか」の関係をネットワーク化し、スペクトル分解すると、</w:t>
+      </w:r>
+      <w:r>
+        <w:rPr>
+          <w:b/>
+        </w:rPr>
+        <w:t>テーマレベルの因果フロー</w:t>
+      </w:r>
+      <w:r>
+        <w:t>が見えてきます（図1C）。</w:t>
+      </w:r>
     </w:p>
     <w:p>
       <w:pPr>
@@ -493,100 +777,15 @@
           <w:i/>
           <w:sz w:val="18"/>
         </w:rPr>
-        <w:t>Figure 1: (A) Conventional approach — isolated variables. (B) LiNGAM — variable-level causal DAG. (C) Spectral Causality — theme-level causal flow. Vertical position represents causal potential: higher = more upstream (cause), lower = more downstream (effect).</w:t>
+        <w:t>図1: (A) 従来のバラバラな変数、(B) LiNGAMの変数レベル因果DAG、(C) スペクトル因果性のテーマレベル因果フロー。縦軸の位置が「因果ポテンシャル」を表し、上ほど「原因側」（年齢）、下ほど「結果側」（ST低下）。</w:t>
       </w:r>
     </w:p>
     <w:p>
       <w:pPr>
-        <w:pStyle w:val="Heading3"/>
+        <w:pStyle w:val="Heading1"/>
       </w:pPr>
       <w:r>
-        <w:t>(B) LiNGAM: 変数レベルの因果DAG</w:t>
-      </w:r>
-    </w:p>
-    <w:p>
-      <w:r>
-        <w:t>LiNGAM（Linear Non-Gaussian Acyclic Model）は、データの非ガウス性（分布の歪み）を利用して因果の方向を推定します。</w:t>
-      </w:r>
-    </w:p>
-    <w:p>
-      <w:r>
-        <w:t>実際の解析結果:</w:t>
-      </w:r>
-    </w:p>
-    <w:p>
-      <w:pPr>
-        <w:ind w:left="567"/>
-      </w:pPr>
-      <w:r>
-        <w:rPr>
-          <w:rFonts w:ascii="Courier New" w:hAnsi="Courier New"/>
-          <w:sz w:val="18"/>
-        </w:rPr>
-        <w:t>年齢 → 最大心拍数 (係数: -0.395)  ← 年齢が上がると最大心拍数が下がる</w:t>
-        <w:br/>
-        <w:t>年齢 → 安静時血圧 (係数: +0.309)  ← 年齢が上がると血圧が上がる</w:t>
-        <w:br/>
-        <w:t>年齢 → コレステロール (係数: +0.203)</w:t>
-        <w:br/>
-        <w:t>最大心拍数 → ST低下 (係数: -0.348)  ← 運動能力の低下が心筋虚血に</w:t>
-      </w:r>
-    </w:p>
-    <w:p>
-      <w:r>
-        <w:t>これは変数レベルの「XがYの原因」を明確に示します（図1B）。しかし、この結果は「なぜそうなるのか」（メカニズム）については何も教えてくれません。</w:t>
-      </w:r>
-    </w:p>
-    <w:p>
-      <w:pPr>
-        <w:pStyle w:val="Heading3"/>
-      </w:pPr>
-      <w:r>
-        <w:t>(C) スペクトル因果性: テーマレベルの因果フロー</w:t>
-      </w:r>
-    </w:p>
-    <w:p>
-      <w:r>
-        <w:t>スペクトル因果性では、まず変数を「臨床的に何に役立つか」で結びつけます。</w:t>
-      </w:r>
-    </w:p>
-    <w:p>
-      <w:r>
-        <w:t>例えば:</w:t>
-      </w:r>
-    </w:p>
-    <w:p>
-      <w:pPr>
-        <w:pStyle w:val="ListBullet"/>
-      </w:pPr>
-      <w:r>
-        <w:t>「年齢」は → 心血管リスク評価、代謝年齢推定、治療候補判定 に役立つ</w:t>
-      </w:r>
-    </w:p>
-    <w:p>
-      <w:pPr>
-        <w:pStyle w:val="ListBullet"/>
-      </w:pPr>
-      <w:r>
-        <w:t>「ST低下」は → 心筋虚血の検出、冠動脈疾患の重症度評価 に役立つ</w:t>
-      </w:r>
-    </w:p>
-    <w:p>
-      <w:pPr>
-        <w:pStyle w:val="ListBullet"/>
-      </w:pPr>
-      <w:r>
-        <w:t>両者は「心血管リスク評価」という共通テーマで結びつく</w:t>
-      </w:r>
-    </w:p>
-    <w:p>
-      <w:r>
-        <w:t>この「何に役立つか」の関係をネットワーク化し、スペクトル分解すると、テーマレベルの因果フローが見えてきます（図1C）。</w:t>
-      </w:r>
-    </w:p>
-    <w:p>
-      <w:r>
-        <w:t>---</w:t>
+        <w:t>4. 磁気ラプラシアン — 方向を「位相」で表す</w:t>
       </w:r>
     </w:p>
     <w:p>
@@ -594,20 +793,21 @@
         <w:pStyle w:val="Heading2"/>
       </w:pPr>
       <w:r>
-        <w:t>4. 磁気ラプラシアン — 方向を「位相」で表す</w:t>
-      </w:r>
-    </w:p>
-    <w:p>
-      <w:pPr>
-        <w:pStyle w:val="Heading3"/>
-      </w:pPr>
-      <w:r>
         <w:t>核心的アイデア: 磁場中の電子のたとえ</w:t>
       </w:r>
     </w:p>
     <w:p>
       <w:r>
-        <w:t>電子が磁場中のネットワーク上を移動するとき、経路によって位相（波の「ずれ」）が変わります。右回りと左回りで位相のずれ方が異なる — これが「方向性」の情報を持ちます。</w:t>
+        <w:t>電子が磁場中のネットワーク上を移動するとき、経路によって</w:t>
+      </w:r>
+      <w:r>
+        <w:rPr>
+          <w:b/>
+        </w:rPr>
+        <w:t>位相</w:t>
+      </w:r>
+      <w:r>
+        <w:t>（波の「ずれ」）が変わります。右回りと左回りで位相のずれ方が異なる — これが「方向性」の情報を持ちます。</w:t>
       </w:r>
     </w:p>
     <w:p>
@@ -628,7 +828,25 @@
         <w:pStyle w:val="ListNumber"/>
       </w:pPr>
       <w:r>
-        <w:t>有用性の非対称性（年齢のデータは血圧の予測に役立つが、逆はあまり成り立たない）を複素数の位相として符号化</w:t>
+        <w:t>有用性の</w:t>
+      </w:r>
+      <w:r>
+        <w:rPr>
+          <w:b/>
+        </w:rPr>
+        <w:t>非対称性</w:t>
+      </w:r>
+      <w:r>
+        <w:t>（年齢のデータは血圧の予測に役立つが、逆はあまり成り立たない）を</w:t>
+      </w:r>
+      <w:r>
+        <w:rPr>
+          <w:b/>
+        </w:rPr>
+        <w:t>複素数の位相</w:t>
+      </w:r>
+      <w:r>
+        <w:t>として符号化</w:t>
       </w:r>
     </w:p>
     <w:p>
@@ -641,7 +859,16 @@
     </w:p>
     <w:p>
       <w:r>
-        <w:t>パラメータ q が方向性の感度を制御します:</w:t>
+        <w:t xml:space="preserve">パラメータ </w:t>
+      </w:r>
+      <w:r>
+        <w:rPr>
+          <w:b/>
+        </w:rPr>
+        <w:t>q</w:t>
+      </w:r>
+      <w:r>
+        <w:t xml:space="preserve"> が方向性の感度を制御します:</w:t>
       </w:r>
     </w:p>
     <w:p>
@@ -649,7 +876,13 @@
         <w:pStyle w:val="ListBullet"/>
       </w:pPr>
       <w:r>
-        <w:t>q = 0: 方向性を完全無視（従来のスペクトル分解と同じ）</w:t>
+        <w:rPr>
+          <w:b/>
+        </w:rPr>
+        <w:t>q = 0</w:t>
+      </w:r>
+      <w:r>
+        <w:t>: 方向性を完全無視（従来のスペクトル分解と同じ）</w:t>
       </w:r>
     </w:p>
     <w:p>
@@ -657,26 +890,14 @@
         <w:pStyle w:val="ListBullet"/>
       </w:pPr>
       <w:r>
-        <w:t>q = 0.25: 方向性を最大限考慮</w:t>
+        <w:rPr>
+          <w:b/>
+        </w:rPr>
+        <w:t>q = 0.25</w:t>
       </w:r>
-    </w:p>
-    <w:p>
-      <w:pPr>
-        <w:pStyle w:val="Heading3"/>
-      </w:pPr>
       <w:r>
-        <w:t>何が読み取れるか</w:t>
+        <w:t>: 方向性を最大限考慮</w:t>
       </w:r>
-    </w:p>
-    <w:p>
-      <w:r>
-        <w:t>q = 0.25（図2右）で、各変数の位相角を見ると:</w:t>
-      </w:r>
-    </w:p>
-    <w:p>
-      <w:pPr>
-        <w:spacing w:before="240"/>
-      </w:pPr>
     </w:p>
     <w:p>
       <w:pPr>
@@ -727,7 +948,20 @@
           <w:i/>
           <w:sz w:val="18"/>
         </w:rPr>
-        <w:t>Figure 2: Second eigenvector of the magnetic Laplacian plotted on the complex plane. At q=0, all points lie on the real axis (no directionality). At q=0.1 and q=0.25, variables spread into the complex plane, with phase angle ordering encoding causal flow direction.</w:t>
+        <w:t>図2: 磁気ラプラシアンの第2固有ベクトルを複素平面上にプロットしたもの。q=0では全ての点が実軸上に並ぶ（方向性なし）。q=0.1, 0.25と上げると、各変数が複素平面上に散らばり、**偏角（角度）の順序が因果的な流れの方向**を符号化する。</w:t>
+      </w:r>
+    </w:p>
+    <w:p>
+      <w:pPr>
+        <w:pStyle w:val="Heading2"/>
+      </w:pPr>
+      <w:r>
+        <w:t>何が読み取れるか</w:t>
+      </w:r>
+    </w:p>
+    <w:p>
+      <w:r>
+        <w:t>q = 0.25（図2右）で、各変数の位相角を見ると:</w:t>
       </w:r>
     </w:p>
     <w:p>
@@ -735,7 +969,13 @@
         <w:pStyle w:val="ListBullet"/>
       </w:pPr>
       <w:r>
-        <w:t>Resting BP が上方（正の虚部）</w:t>
+        <w:rPr>
+          <w:b/>
+        </w:rPr>
+        <w:t>Resting BP</w:t>
+      </w:r>
+      <w:r>
+        <w:t xml:space="preserve"> が上方（正の虚部）</w:t>
       </w:r>
     </w:p>
     <w:p>
@@ -743,7 +983,22 @@
         <w:pStyle w:val="ListBullet"/>
       </w:pPr>
       <w:r>
-        <w:t>ST Depression, Cholesterol が下方（負の虚部）</w:t>
+        <w:rPr>
+          <w:b/>
+        </w:rPr>
+        <w:t>ST Depression</w:t>
+      </w:r>
+      <w:r>
+        <w:t xml:space="preserve">, </w:t>
+      </w:r>
+      <w:r>
+        <w:rPr>
+          <w:b/>
+        </w:rPr>
+        <w:t>Cholesterol</w:t>
+      </w:r>
+      <w:r>
+        <w:t xml:space="preserve"> が下方（負の虚部）</w:t>
       </w:r>
     </w:p>
     <w:p>
@@ -752,8 +1007,11 @@
       </w:r>
     </w:p>
     <w:p>
+      <w:pPr>
+        <w:pStyle w:val="Heading1"/>
+      </w:pPr>
       <w:r>
-        <w:t>---</w:t>
+        <w:t>5. Hodge分解 — 因果フローとフィードバックを分離する</w:t>
       </w:r>
     </w:p>
     <w:p>
@@ -761,20 +1019,21 @@
         <w:pStyle w:val="Heading2"/>
       </w:pPr>
       <w:r>
-        <w:t>5. Hodge分解 — 因果フローとフィードバックを分離する</w:t>
-      </w:r>
-    </w:p>
-    <w:p>
-      <w:pPr>
-        <w:pStyle w:val="Heading3"/>
-      </w:pPr>
-      <w:r>
         <w:t>水の流れのたとえ</w:t>
       </w:r>
     </w:p>
     <w:p>
       <w:r>
-        <w:t>山から海に流れる水は、基本的に一方向（高い所から低い所へ）です。しかし、渦（うず）も存在します。</w:t>
+        <w:t>山から海に流れる水は、基本的に</w:t>
+      </w:r>
+      <w:r>
+        <w:rPr>
+          <w:b/>
+        </w:rPr>
+        <w:t>一方向</w:t>
+      </w:r>
+      <w:r>
+        <w:t>（高い所から低い所へ）です。しかし、渦（うず）も存在します。</w:t>
       </w:r>
     </w:p>
     <w:p>
@@ -787,7 +1046,19 @@
         <w:pStyle w:val="ListBullet"/>
       </w:pPr>
       <w:r>
-        <w:t>勾配フロー（gradient） = 「原因 → 結果」の一方向の流れ = 因果的</w:t>
+        <w:rPr>
+          <w:b/>
+        </w:rPr>
+        <w:t>勾配フロー（gradient）</w:t>
+      </w:r>
+      <w:r>
+        <w:t xml:space="preserve"> = 「原因 → 結果」の一方向の流れ = </w:t>
+      </w:r>
+      <w:r>
+        <w:rPr>
+          <w:b/>
+        </w:rPr>
+        <w:t>因果的</w:t>
       </w:r>
     </w:p>
     <w:p>
@@ -795,7 +1066,19 @@
         <w:pStyle w:val="ListBullet"/>
       </w:pPr>
       <w:r>
-        <w:t>カールフロー（curl） = 局所的な循環 = フィードバックループ</w:t>
+        <w:rPr>
+          <w:b/>
+        </w:rPr>
+        <w:t>カールフロー（curl）</w:t>
+      </w:r>
+      <w:r>
+        <w:t xml:space="preserve"> = 局所的な循環 = </w:t>
+      </w:r>
+      <w:r>
+        <w:rPr>
+          <w:b/>
+        </w:rPr>
+        <w:t>フィードバックループ</w:t>
       </w:r>
     </w:p>
     <w:p>
@@ -805,7 +1088,7 @@
     </w:p>
     <w:p>
       <w:pPr>
-        <w:pStyle w:val="Heading3"/>
+        <w:pStyle w:val="Heading2"/>
       </w:pPr>
       <w:r>
         <w:t>実データの結果</w:t>
@@ -818,8 +1101,128 @@
     </w:p>
     <w:p>
       <w:pPr>
-        <w:spacing w:before="240"/>
+        <w:pStyle w:val="ListBullet"/>
       </w:pPr>
+      <w:r>
+        <w:rPr>
+          <w:b/>
+        </w:rPr>
+        <w:t>85.9%</w:t>
+      </w:r>
+      <w:r>
+        <w:t xml:space="preserve"> が勾配フロー（因果的な一方向フロー）</w:t>
+      </w:r>
+    </w:p>
+    <w:p>
+      <w:pPr>
+        <w:pStyle w:val="ListBullet"/>
+      </w:pPr>
+      <w:r>
+        <w:rPr>
+          <w:b/>
+        </w:rPr>
+        <w:t>14.1%</w:t>
+      </w:r>
+      <w:r>
+        <w:t xml:space="preserve"> がカールフロー（フィードバックループ）</w:t>
+      </w:r>
+    </w:p>
+    <w:p>
+      <w:r>
+        <w:t>→ この心疾患データでは、変数間の情報の流れの大部分が「原因→結果」の一方向的な構造であり、DAG（有向非循環グラフ）で十分に表現できることを示唆しています。</w:t>
+      </w:r>
+    </w:p>
+    <w:p>
+      <w:pPr>
+        <w:pStyle w:val="Heading2"/>
+      </w:pPr>
+      <w:r>
+        <w:t>因果ポテンシャル — 「標高」のようなもの</w:t>
+      </w:r>
+    </w:p>
+    <w:p>
+      <w:r>
+        <w:t>Hodge分解から得られる</w:t>
+      </w:r>
+      <w:r>
+        <w:rPr>
+          <w:b/>
+        </w:rPr>
+        <w:t>因果ポテンシャル（phi）</w:t>
+      </w:r>
+      <w:r>
+        <w:t xml:space="preserve"> は、各変数の「因果的な標高」を表します（図3B）:</w:t>
+      </w:r>
+    </w:p>
+    <w:p>
+      <w:pPr>
+        <w:pStyle w:val="ListNumber"/>
+      </w:pPr>
+      <w:r>
+        <w:rPr>
+          <w:b/>
+        </w:rPr>
+        <w:t>年齢（Age）</w:t>
+      </w:r>
+      <w:r>
+        <w:t>: 最も上流（標高が高い）— 他の全変数に影響を与える根本的な因子</w:t>
+      </w:r>
+    </w:p>
+    <w:p>
+      <w:pPr>
+        <w:pStyle w:val="ListNumber"/>
+      </w:pPr>
+      <w:r>
+        <w:rPr>
+          <w:b/>
+        </w:rPr>
+        <w:t>コレステロール</w:t>
+      </w:r>
+      <w:r>
+        <w:t>: 2番目に上流</w:t>
+      </w:r>
+    </w:p>
+    <w:p>
+      <w:pPr>
+        <w:pStyle w:val="ListNumber"/>
+      </w:pPr>
+      <w:r>
+        <w:rPr>
+          <w:b/>
+        </w:rPr>
+        <w:t>安静時血圧 / 最大心拍数</w:t>
+      </w:r>
+      <w:r>
+        <w:t>: 中流</w:t>
+      </w:r>
+    </w:p>
+    <w:p>
+      <w:pPr>
+        <w:pStyle w:val="ListNumber"/>
+      </w:pPr>
+      <w:r>
+        <w:rPr>
+          <w:b/>
+        </w:rPr>
+        <w:t>ST低下</w:t>
+      </w:r>
+      <w:r>
+        <w:t>: 最も下流（標高が低い）— 他の因子の結果として現れる</w:t>
+      </w:r>
+    </w:p>
+    <w:p>
+      <w:r>
+        <w:t>これは臨床的に非常に</w:t>
+      </w:r>
+      <w:r>
+        <w:rPr>
+          <w:b/>
+        </w:rPr>
+        <w:t>直感的</w:t>
+      </w:r>
+      <w:r>
+        <w:t>です。年齢は変えられない根本因子、ST低下は心臓への負荷の結果として現れる指標です。</w:t>
+      </w:r>
     </w:p>
     <w:p>
       <w:pPr>
@@ -870,88 +1273,12 @@
           <w:i/>
           <w:sz w:val="18"/>
         </w:rPr>
-        <w:t>Figure 3: (A) Hodge decomposition of information flow: 85.9% gradient (causal, one-directional) vs 14.1% curl (feedback loops). (B) Causal potential for each variable. Age is most upstream; ST Depression is most downstream.</w:t>
+        <w:t>図3: (A) 情報フローのHodge分解。85.9%が勾配成分（因果的）、14.1%がカール成分（フィードバック）。(B) 各変数の因果ポテンシャル。年齢が最上流、ST低下が最下流。</w:t>
       </w:r>
     </w:p>
     <w:p>
       <w:pPr>
-        <w:pStyle w:val="ListBullet"/>
-      </w:pPr>
-      <w:r>
-        <w:t>85.9% が勾配フロー（因果的な一方向フロー）</w:t>
-      </w:r>
-    </w:p>
-    <w:p>
-      <w:pPr>
-        <w:pStyle w:val="ListBullet"/>
-      </w:pPr>
-      <w:r>
-        <w:t>14.1% がカールフロー（フィードバックループ）</w:t>
-      </w:r>
-    </w:p>
-    <w:p>
-      <w:r>
-        <w:t>→ この心疾患データでは、変数間の情報の流れの大部分が「原因→結果」の一方向的な構造であり、DAG（有向非循環グラフ）で十分に表現できることを示唆しています。</w:t>
-      </w:r>
-    </w:p>
-    <w:p>
-      <w:pPr>
-        <w:pStyle w:val="Heading3"/>
-      </w:pPr>
-      <w:r>
-        <w:t>因果ポテンシャル — 「標高」のようなもの</w:t>
-      </w:r>
-    </w:p>
-    <w:p>
-      <w:r>
-        <w:t>Hodge分解から得られる因果ポテンシャル（phi） は、各変数の「因果的な標高」を表します（図3B）:</w:t>
-      </w:r>
-    </w:p>
-    <w:p>
-      <w:pPr>
-        <w:pStyle w:val="ListNumber"/>
-      </w:pPr>
-      <w:r>
-        <w:t>年齢（Age）: 最も上流（標高が高い）— 他の全変数に影響を与える根本的な因子</w:t>
-      </w:r>
-    </w:p>
-    <w:p>
-      <w:pPr>
-        <w:pStyle w:val="ListNumber"/>
-      </w:pPr>
-      <w:r>
-        <w:t>コレステロール: 2番目に上流</w:t>
-      </w:r>
-    </w:p>
-    <w:p>
-      <w:pPr>
-        <w:pStyle w:val="ListNumber"/>
-      </w:pPr>
-      <w:r>
-        <w:t>安静時血圧 / 最大心拍数: 中流</w:t>
-      </w:r>
-    </w:p>
-    <w:p>
-      <w:pPr>
-        <w:pStyle w:val="ListNumber"/>
-      </w:pPr>
-      <w:r>
-        <w:t>ST低下: 最も下流（標高が低い）— 他の因子の結果として現れる</w:t>
-      </w:r>
-    </w:p>
-    <w:p>
-      <w:r>
-        <w:t>これは臨床的に非常に直感的です。年齢は変えられない根本因子、ST低下は心臓への負荷の結果として現れる指標です。</w:t>
-      </w:r>
-    </w:p>
-    <w:p>
-      <w:r>
-        <w:t>---</w:t>
-      </w:r>
-    </w:p>
-    <w:p>
-      <w:pPr>
-        <w:pStyle w:val="Heading2"/>
+        <w:pStyle w:val="Heading1"/>
       </w:pPr>
       <w:r>
         <w:t>6. 3手法の比較 — 一致と不一致が語ること</w:t>
@@ -964,8 +1291,114 @@
     </w:p>
     <w:p>
       <w:pPr>
-        <w:spacing w:before="240"/>
+        <w:pStyle w:val="Heading2"/>
       </w:pPr>
+      <w:r>
+        <w:t>一致したペア（高信頼）</w:t>
+      </w:r>
+    </w:p>
+    <w:p>
+      <w:r>
+        <w:t>いくつかのペアでは、3手法すべてが同じ方向を指しました:</w:t>
+      </w:r>
+    </w:p>
+    <w:p>
+      <w:pPr>
+        <w:pStyle w:val="ListBullet"/>
+      </w:pPr>
+      <w:r>
+        <w:rPr>
+          <w:b/>
+        </w:rPr>
+        <w:t>年齢 → コレステロール</w:t>
+      </w:r>
+      <w:r>
+        <w:t>: 全手法一致。加齢によるコレステロール上昇は医学的に確立。</w:t>
+      </w:r>
+    </w:p>
+    <w:p>
+      <w:pPr>
+        <w:pStyle w:val="ListBullet"/>
+      </w:pPr>
+      <w:r>
+        <w:rPr>
+          <w:b/>
+        </w:rPr>
+        <w:t>年齢 → 安静時血圧</w:t>
+      </w:r>
+      <w:r>
+        <w:t>: 全手法一致。加齢による動脈硬化→血圧上昇。</w:t>
+      </w:r>
+    </w:p>
+    <w:p>
+      <w:pPr>
+        <w:pStyle w:val="Heading2"/>
+      </w:pPr>
+      <w:r>
+        <w:t>不一致のペア（興味深い発見）</w:t>
+      </w:r>
+    </w:p>
+    <w:p>
+      <w:r>
+        <w:t>一部のペアでは方向が食い違いました:</w:t>
+      </w:r>
+    </w:p>
+    <w:p>
+      <w:pPr>
+        <w:pStyle w:val="ListBullet"/>
+      </w:pPr>
+      <w:r>
+        <w:rPr>
+          <w:b/>
+        </w:rPr>
+        <w:t>年齢 vs 最大心拍数</w:t>
+      </w:r>
+      <w:r>
+        <w:t>: LiNGAMは「年齢→最大心拍数」（加齢で心拍数↓）を検出。スペクトル手法は逆方向。これはスペクトル手法が「最大心拍数→年齢推定に役立つ」という</w:t>
+      </w:r>
+      <w:r>
+        <w:rPr>
+          <w:b/>
+        </w:rPr>
+        <w:t>情報的方向</w:t>
+      </w:r>
+      <w:r>
+        <w:t>を捉えている可能性。</w:t>
+      </w:r>
+    </w:p>
+    <w:p>
+      <w:pPr>
+        <w:pStyle w:val="ListBullet"/>
+      </w:pPr>
+      <w:r>
+        <w:rPr>
+          <w:b/>
+        </w:rPr>
+        <w:t>安静時血圧 vs コレステロール</w:t>
+      </w:r>
+      <w:r>
+        <w:t>: LiNGAMは「BP→Chol」を検出できないが、スペクトル手法は弱い方向性を検出。フィードバック（脂質代謝と血管機能の相互作用）の存在を示唆。</w:t>
+      </w:r>
+    </w:p>
+    <w:p>
+      <w:r>
+        <w:rPr>
+          <w:b/>
+        </w:rPr>
+        <w:t>核心的な洞察</w:t>
+      </w:r>
+      <w:r>
+        <w:t>: 手法間の</w:t>
+      </w:r>
+      <w:r>
+        <w:rPr>
+          <w:b/>
+        </w:rPr>
+        <w:t>不一致そのものが情報</w:t>
+      </w:r>
+      <w:r>
+        <w:t>です。不一致は「単純な一方向因果ではない」ことを示し、フィードバックや交絡変数の存在を示唆します。</w:t>
+      </w:r>
     </w:p>
     <w:p>
       <w:pPr>
@@ -1016,80 +1449,12 @@
           <w:i/>
           <w:sz w:val="18"/>
         </w:rPr>
-        <w:t>Figure 4: Causal direction for all 10 variable pairs comparing LiNGAM (red), Spectral Causal Direction SCD (blue), and Hodge potential (green). +1 = first variable causes second; -1 = reverse. Green background = all three methods agree.</w:t>
+        <w:t>図4: 全10変数ペアについて、LiNGAM（赤）、スペクトル因果方向SCD（青）、Hodgeポテンシャル（緑）の因果方向を比較。+1=第1変数→第2変数、-1=逆方向。緑の背景は3手法が一致したペア。</w:t>
       </w:r>
     </w:p>
     <w:p>
       <w:pPr>
-        <w:pStyle w:val="Heading3"/>
-      </w:pPr>
-      <w:r>
-        <w:t>一致したペア（高信頼）</w:t>
-      </w:r>
-    </w:p>
-    <w:p>
-      <w:r>
-        <w:t>いくつかのペアでは、3手法すべてが同じ方向を指しました:</w:t>
-      </w:r>
-    </w:p>
-    <w:p>
-      <w:pPr>
-        <w:pStyle w:val="ListBullet"/>
-      </w:pPr>
-      <w:r>
-        <w:t>年齢 → コレステロール: 全手法一致。加齢によるコレステロール上昇は医学的に確立。</w:t>
-      </w:r>
-    </w:p>
-    <w:p>
-      <w:pPr>
-        <w:pStyle w:val="ListBullet"/>
-      </w:pPr>
-      <w:r>
-        <w:t>年齢 → 安静時血圧: 全手法一致。加齢による動脈硬化→血圧上昇。</w:t>
-      </w:r>
-    </w:p>
-    <w:p>
-      <w:pPr>
-        <w:pStyle w:val="Heading3"/>
-      </w:pPr>
-      <w:r>
-        <w:t>不一致のペア（興味深い発見）</w:t>
-      </w:r>
-    </w:p>
-    <w:p>
-      <w:r>
-        <w:t>一部のペアでは方向が食い違いました:</w:t>
-      </w:r>
-    </w:p>
-    <w:p>
-      <w:pPr>
-        <w:pStyle w:val="ListBullet"/>
-      </w:pPr>
-      <w:r>
-        <w:t>年齢 vs 最大心拍数: LiNGAMは「年齢→最大心拍数」（加齢で心拍数↓）を検出。スペクトル手法は逆方向。これはスペクトル手法が「最大心拍数→年齢推定に役立つ」という情報的方向を捉えている可能性。</w:t>
-      </w:r>
-    </w:p>
-    <w:p>
-      <w:pPr>
-        <w:pStyle w:val="ListBullet"/>
-      </w:pPr>
-      <w:r>
-        <w:t>安静時血圧 vs コレステロール: LiNGAMは「BP→Chol」を検出できないが、スペクトル手法は弱い方向性を検出。フィードバック（脂質代謝と血管機能の相互作用）の存在を示唆。</w:t>
-      </w:r>
-    </w:p>
-    <w:p>
-      <w:r>
-        <w:t>核心的な洞察: 手法間の不一致そのものが情報です。不一致は「単純な一方向因果ではない」ことを示し、フィードバックや交絡変数の存在を示唆します。</w:t>
-      </w:r>
-    </w:p>
-    <w:p>
-      <w:r>
-        <w:t>---</w:t>
-      </w:r>
-    </w:p>
-    <w:p>
-      <w:pPr>
-        <w:pStyle w:val="Heading2"/>
+        <w:pStyle w:val="Heading1"/>
       </w:pPr>
       <w:r>
         <w:t>7. Hill の9基準 — それぞれの手法は何を扱えるか</w:t>
@@ -1097,12 +1462,21 @@
     </w:p>
     <w:p>
       <w:r>
-        <w:t>1965年にBradford Hillが提唱した因果判断の9基準は、疫学における因果推論の金字塔です。しかし、既存の統計手法はこの9基準のうち一部しかカバーしていません。</w:t>
+        <w:t>1965年にBradford Hillが提唱した</w:t>
+      </w:r>
+      <w:r>
+        <w:rPr>
+          <w:b/>
+        </w:rPr>
+        <w:t>因果判断の9基準</w:t>
+      </w:r>
+      <w:r>
+        <w:t>は、疫学における因果推論の金字塔です。しかし、既存の統計手法はこの9基準のうち一部しかカバーしていません。</w:t>
       </w:r>
     </w:p>
     <w:p>
       <w:pPr>
-        <w:pStyle w:val="Heading3"/>
+        <w:pStyle w:val="Heading2"/>
       </w:pPr>
       <w:r>
         <w:t>9基準の簡単な解説</w:t>
@@ -1112,6 +1486,7 @@
       <w:tblPr>
         <w:tblStyle w:val="TableGrid"/>
         <w:tblW w:type="auto" w:w="0"/>
+        <w:jc w:val="center"/>
         <w:tblLook w:firstColumn="1" w:firstRow="1" w:lastColumn="0" w:lastRow="0" w:noHBand="0" w:noVBand="1" w:val="04A0"/>
       </w:tblPr>
       <w:tblGrid>
@@ -1125,6 +1500,10 @@
             <w:tcW w:type="dxa" w:w="2880"/>
           </w:tcPr>
           <w:p>
+            <w:pPr>
+              <w:jc w:val="left"/>
+            </w:pPr>
+            <w:r/>
             <w:r>
               <w:rPr>
                 <w:b/>
@@ -1139,6 +1518,10 @@
             <w:tcW w:type="dxa" w:w="2880"/>
           </w:tcPr>
           <w:p>
+            <w:pPr>
+              <w:jc w:val="left"/>
+            </w:pPr>
+            <w:r/>
             <w:r>
               <w:rPr>
                 <w:b/>
@@ -1153,6 +1536,10 @@
             <w:tcW w:type="dxa" w:w="2880"/>
           </w:tcPr>
           <w:p>
+            <w:pPr>
+              <w:jc w:val="left"/>
+            </w:pPr>
+            <w:r/>
             <w:r>
               <w:rPr>
                 <w:b/>
@@ -1169,8 +1556,13 @@
             <w:tcW w:type="dxa" w:w="2880"/>
           </w:tcPr>
           <w:p>
+            <w:pPr>
+              <w:jc w:val="left"/>
+            </w:pPr>
+            <w:r/>
             <w:r>
               <w:rPr>
+                <w:b w:val="0"/>
                 <w:sz w:val="18"/>
               </w:rPr>
               <w:t>H1</w:t>
@@ -1182,11 +1574,16 @@
             <w:tcW w:type="dxa" w:w="2880"/>
           </w:tcPr>
           <w:p>
+            <w:pPr>
+              <w:jc w:val="left"/>
+            </w:pPr>
+            <w:r/>
             <w:r>
               <w:rPr>
+                <w:b w:val="0"/>
                 <w:sz w:val="18"/>
               </w:rPr>
-              <w:t>強さ</w:t>
+              <w:t>**強さ**</w:t>
             </w:r>
           </w:p>
         </w:tc>
@@ -1195,8 +1592,13 @@
             <w:tcW w:type="dxa" w:w="2880"/>
           </w:tcPr>
           <w:p>
+            <w:pPr>
+              <w:jc w:val="left"/>
+            </w:pPr>
+            <w:r/>
             <w:r>
               <w:rPr>
+                <w:b w:val="0"/>
                 <w:sz w:val="18"/>
               </w:rPr>
               <w:t>効果がどれだけ大きいか（煙と火の量の関係）</w:t>
@@ -1210,8 +1612,13 @@
             <w:tcW w:type="dxa" w:w="2880"/>
           </w:tcPr>
           <w:p>
+            <w:pPr>
+              <w:jc w:val="left"/>
+            </w:pPr>
+            <w:r/>
             <w:r>
               <w:rPr>
+                <w:b w:val="0"/>
                 <w:sz w:val="18"/>
               </w:rPr>
               <w:t>H2</w:t>
@@ -1223,11 +1630,16 @@
             <w:tcW w:type="dxa" w:w="2880"/>
           </w:tcPr>
           <w:p>
+            <w:pPr>
+              <w:jc w:val="left"/>
+            </w:pPr>
+            <w:r/>
             <w:r>
               <w:rPr>
+                <w:b w:val="0"/>
                 <w:sz w:val="18"/>
               </w:rPr>
-              <w:t>一貫性</w:t>
+              <w:t>**一貫性**</w:t>
             </w:r>
           </w:p>
         </w:tc>
@@ -1236,8 +1648,13 @@
             <w:tcW w:type="dxa" w:w="2880"/>
           </w:tcPr>
           <w:p>
+            <w:pPr>
+              <w:jc w:val="left"/>
+            </w:pPr>
+            <w:r/>
             <w:r>
               <w:rPr>
+                <w:b w:val="0"/>
                 <w:sz w:val="18"/>
               </w:rPr>
               <w:t>別の場所・集団でも同じ結果か（日本でもアメリカでも同じか）</w:t>
@@ -1251,8 +1668,13 @@
             <w:tcW w:type="dxa" w:w="2880"/>
           </w:tcPr>
           <w:p>
+            <w:pPr>
+              <w:jc w:val="left"/>
+            </w:pPr>
+            <w:r/>
             <w:r>
               <w:rPr>
+                <w:b w:val="0"/>
                 <w:sz w:val="18"/>
               </w:rPr>
               <w:t>H3</w:t>
@@ -1264,11 +1686,16 @@
             <w:tcW w:type="dxa" w:w="2880"/>
           </w:tcPr>
           <w:p>
+            <w:pPr>
+              <w:jc w:val="left"/>
+            </w:pPr>
+            <w:r/>
             <w:r>
               <w:rPr>
+                <w:b w:val="0"/>
                 <w:sz w:val="18"/>
               </w:rPr>
-              <w:t>特異性</w:t>
+              <w:t>**特異性**</w:t>
             </w:r>
           </w:p>
         </w:tc>
@@ -1277,8 +1704,13 @@
             <w:tcW w:type="dxa" w:w="2880"/>
           </w:tcPr>
           <w:p>
+            <w:pPr>
+              <w:jc w:val="left"/>
+            </w:pPr>
+            <w:r/>
             <w:r>
               <w:rPr>
+                <w:b w:val="0"/>
                 <w:sz w:val="18"/>
               </w:rPr>
               <w:t>特定の原因が特定の結果を生むか（喫煙→肺がん、であって全ての癌ではない）</w:t>
@@ -1292,8 +1724,13 @@
             <w:tcW w:type="dxa" w:w="2880"/>
           </w:tcPr>
           <w:p>
+            <w:pPr>
+              <w:jc w:val="left"/>
+            </w:pPr>
+            <w:r/>
             <w:r>
               <w:rPr>
+                <w:b w:val="0"/>
                 <w:sz w:val="18"/>
               </w:rPr>
               <w:t>H4</w:t>
@@ -1305,11 +1742,16 @@
             <w:tcW w:type="dxa" w:w="2880"/>
           </w:tcPr>
           <w:p>
+            <w:pPr>
+              <w:jc w:val="left"/>
+            </w:pPr>
+            <w:r/>
             <w:r>
               <w:rPr>
+                <w:b w:val="0"/>
                 <w:sz w:val="18"/>
               </w:rPr>
-              <w:t>時間性</w:t>
+              <w:t>**時間性**</w:t>
             </w:r>
           </w:p>
         </w:tc>
@@ -1318,8 +1760,13 @@
             <w:tcW w:type="dxa" w:w="2880"/>
           </w:tcPr>
           <w:p>
+            <w:pPr>
+              <w:jc w:val="left"/>
+            </w:pPr>
+            <w:r/>
             <w:r>
               <w:rPr>
+                <w:b w:val="0"/>
                 <w:sz w:val="18"/>
               </w:rPr>
               <w:t>原因が結果より先に起きるか（卵が先か鶏が先か）</w:t>
@@ -1333,8 +1780,13 @@
             <w:tcW w:type="dxa" w:w="2880"/>
           </w:tcPr>
           <w:p>
+            <w:pPr>
+              <w:jc w:val="left"/>
+            </w:pPr>
+            <w:r/>
             <w:r>
               <w:rPr>
+                <w:b w:val="0"/>
                 <w:sz w:val="18"/>
               </w:rPr>
               <w:t>H5</w:t>
@@ -1346,11 +1798,16 @@
             <w:tcW w:type="dxa" w:w="2880"/>
           </w:tcPr>
           <w:p>
+            <w:pPr>
+              <w:jc w:val="left"/>
+            </w:pPr>
+            <w:r/>
             <w:r>
               <w:rPr>
+                <w:b w:val="0"/>
                 <w:sz w:val="18"/>
               </w:rPr>
-              <w:t>量反応</w:t>
+              <w:t>**量反応**</w:t>
             </w:r>
           </w:p>
         </w:tc>
@@ -1359,8 +1816,13 @@
             <w:tcW w:type="dxa" w:w="2880"/>
           </w:tcPr>
           <w:p>
+            <w:pPr>
+              <w:jc w:val="left"/>
+            </w:pPr>
+            <w:r/>
             <w:r>
               <w:rPr>
+                <w:b w:val="0"/>
                 <w:sz w:val="18"/>
               </w:rPr>
               <w:t>原因が多いほど結果も大きいか（タバコ1本と20本の差）</w:t>
@@ -1374,8 +1836,13 @@
             <w:tcW w:type="dxa" w:w="2880"/>
           </w:tcPr>
           <w:p>
+            <w:pPr>
+              <w:jc w:val="left"/>
+            </w:pPr>
+            <w:r/>
             <w:r>
               <w:rPr>
+                <w:b w:val="0"/>
                 <w:sz w:val="18"/>
               </w:rPr>
               <w:t>H6</w:t>
@@ -1387,11 +1854,16 @@
             <w:tcW w:type="dxa" w:w="2880"/>
           </w:tcPr>
           <w:p>
+            <w:pPr>
+              <w:jc w:val="left"/>
+            </w:pPr>
+            <w:r/>
             <w:r>
               <w:rPr>
+                <w:b w:val="0"/>
                 <w:sz w:val="18"/>
               </w:rPr>
-              <w:t>妥当性</w:t>
+              <w:t>**妥当性**</w:t>
             </w:r>
           </w:p>
         </w:tc>
@@ -1400,8 +1872,13 @@
             <w:tcW w:type="dxa" w:w="2880"/>
           </w:tcPr>
           <w:p>
+            <w:pPr>
+              <w:jc w:val="left"/>
+            </w:pPr>
+            <w:r/>
             <w:r>
               <w:rPr>
+                <w:b w:val="0"/>
                 <w:sz w:val="18"/>
               </w:rPr>
               <w:t>メカニズムが生物学的に説明できるか（なぜそうなるか）</w:t>
@@ -1415,8 +1892,13 @@
             <w:tcW w:type="dxa" w:w="2880"/>
           </w:tcPr>
           <w:p>
+            <w:pPr>
+              <w:jc w:val="left"/>
+            </w:pPr>
+            <w:r/>
             <w:r>
               <w:rPr>
+                <w:b w:val="0"/>
                 <w:sz w:val="18"/>
               </w:rPr>
               <w:t>H7</w:t>
@@ -1428,11 +1910,16 @@
             <w:tcW w:type="dxa" w:w="2880"/>
           </w:tcPr>
           <w:p>
+            <w:pPr>
+              <w:jc w:val="left"/>
+            </w:pPr>
+            <w:r/>
             <w:r>
               <w:rPr>
+                <w:b w:val="0"/>
                 <w:sz w:val="18"/>
               </w:rPr>
-              <w:t>整合性</w:t>
+              <w:t>**整合性**</w:t>
             </w:r>
           </w:p>
         </w:tc>
@@ -1441,8 +1928,13 @@
             <w:tcW w:type="dxa" w:w="2880"/>
           </w:tcPr>
           <w:p>
+            <w:pPr>
+              <w:jc w:val="left"/>
+            </w:pPr>
+            <w:r/>
             <w:r>
               <w:rPr>
+                <w:b w:val="0"/>
                 <w:sz w:val="18"/>
               </w:rPr>
               <w:t>既知の医学知識と矛盾しないか</w:t>
@@ -1456,8 +1948,13 @@
             <w:tcW w:type="dxa" w:w="2880"/>
           </w:tcPr>
           <w:p>
+            <w:pPr>
+              <w:jc w:val="left"/>
+            </w:pPr>
+            <w:r/>
             <w:r>
               <w:rPr>
+                <w:b w:val="0"/>
                 <w:sz w:val="18"/>
               </w:rPr>
               <w:t>H8</w:t>
@@ -1469,11 +1966,16 @@
             <w:tcW w:type="dxa" w:w="2880"/>
           </w:tcPr>
           <w:p>
+            <w:pPr>
+              <w:jc w:val="left"/>
+            </w:pPr>
+            <w:r/>
             <w:r>
               <w:rPr>
+                <w:b w:val="0"/>
                 <w:sz w:val="18"/>
               </w:rPr>
-              <w:t>実験</w:t>
+              <w:t>**実験**</w:t>
             </w:r>
           </w:p>
         </w:tc>
@@ -1482,8 +1984,13 @@
             <w:tcW w:type="dxa" w:w="2880"/>
           </w:tcPr>
           <w:p>
+            <w:pPr>
+              <w:jc w:val="left"/>
+            </w:pPr>
+            <w:r/>
             <w:r>
               <w:rPr>
+                <w:b w:val="0"/>
                 <w:sz w:val="18"/>
               </w:rPr>
               <w:t>介入的な証拠があるか（RCTの結果）</w:t>
@@ -1497,8 +2004,13 @@
             <w:tcW w:type="dxa" w:w="2880"/>
           </w:tcPr>
           <w:p>
+            <w:pPr>
+              <w:jc w:val="left"/>
+            </w:pPr>
+            <w:r/>
             <w:r>
               <w:rPr>
+                <w:b w:val="0"/>
                 <w:sz w:val="18"/>
               </w:rPr>
               <w:t>H9</w:t>
@@ -1510,11 +2022,16 @@
             <w:tcW w:type="dxa" w:w="2880"/>
           </w:tcPr>
           <w:p>
+            <w:pPr>
+              <w:jc w:val="left"/>
+            </w:pPr>
+            <w:r/>
             <w:r>
               <w:rPr>
+                <w:b w:val="0"/>
                 <w:sz w:val="18"/>
               </w:rPr>
-              <w:t>類似性</w:t>
+              <w:t>**類似性**</w:t>
             </w:r>
           </w:p>
         </w:tc>
@@ -1523,8 +2040,13 @@
             <w:tcW w:type="dxa" w:w="2880"/>
           </w:tcPr>
           <w:p>
+            <w:pPr>
+              <w:jc w:val="left"/>
+            </w:pPr>
+            <w:r/>
             <w:r>
               <w:rPr>
+                <w:b w:val="0"/>
                 <w:sz w:val="18"/>
               </w:rPr>
               <w:t>似た原因が似た結果を生むか（DDTとタリドマイドの類似性）</w:t>
@@ -1536,7 +2058,7 @@
     <w:p/>
     <w:p>
       <w:pPr>
-        <w:pStyle w:val="Heading3"/>
+        <w:pStyle w:val="Heading2"/>
       </w:pPr>
       <w:r>
         <w:t>既存手法の「手薄な領域」</w:t>
@@ -1548,9 +2070,125 @@
       </w:r>
     </w:p>
     <w:p>
+      <w:r>
+        <w:rPr>
+          <w:b/>
+        </w:rPr>
+        <w:t>DirectLiNGAM</w:t>
+      </w:r>
+      <w:r>
+        <w:t>（図5左）:</w:t>
+      </w:r>
+    </w:p>
+    <w:p>
       <w:pPr>
-        <w:spacing w:before="240"/>
+        <w:pStyle w:val="ListBullet"/>
       </w:pPr>
+      <w:r>
+        <w:t>H1（効果量を定量化）、H3（変数ペアの特定）に</w:t>
+      </w:r>
+      <w:r>
+        <w:rPr>
+          <w:b/>
+        </w:rPr>
+        <w:t>強い</w:t>
+      </w:r>
+    </w:p>
+    <w:p>
+      <w:pPr>
+        <w:pStyle w:val="ListBullet"/>
+      </w:pPr>
+      <w:r>
+        <w:t>しかし H6（生物学的妥当性）、H7（整合性）、H9（類似性）は</w:t>
+      </w:r>
+      <w:r>
+        <w:rPr>
+          <w:b/>
+        </w:rPr>
+        <w:t>空白</w:t>
+      </w:r>
+    </w:p>
+    <w:p>
+      <w:pPr>
+        <w:pStyle w:val="ListBullet"/>
+      </w:pPr>
+      <w:r>
+        <w:t>→ 「数字は出るが、なぜそうなるかは分からない」</w:t>
+      </w:r>
+    </w:p>
+    <w:p>
+      <w:r>
+        <w:rPr>
+          <w:b/>
+        </w:rPr>
+        <w:t>Utility Causality</w:t>
+      </w:r>
+      <w:r>
+        <w:t>（図5中）:</w:t>
+      </w:r>
+    </w:p>
+    <w:p>
+      <w:pPr>
+        <w:pStyle w:val="ListBullet"/>
+      </w:pPr>
+      <w:r>
+        <w:t>H6（LLMが臨床知識をグラフに注入）、H7（Eigenthemeが既知の疾患概念と整合）、H9（類似パターンの体系的検出）に</w:t>
+      </w:r>
+      <w:r>
+        <w:rPr>
+          <w:b/>
+        </w:rPr>
+        <w:t>強い</w:t>
+      </w:r>
+    </w:p>
+    <w:p>
+      <w:pPr>
+        <w:pStyle w:val="ListBullet"/>
+      </w:pPr>
+      <w:r>
+        <w:t>しかし H8（介入的証拠はない）</w:t>
+      </w:r>
+    </w:p>
+    <w:p>
+      <w:pPr>
+        <w:pStyle w:val="ListBullet"/>
+      </w:pPr>
+      <w:r>
+        <w:t>→ 「メカニズムは分かるが、操作的因果は証明できない」</w:t>
+      </w:r>
+    </w:p>
+    <w:p>
+      <w:r>
+        <w:rPr>
+          <w:b/>
+        </w:rPr>
+        <w:t>アンサンブル（ECD）</w:t>
+      </w:r>
+      <w:r>
+        <w:t>（図5右）:</w:t>
+      </w:r>
+    </w:p>
+    <w:p>
+      <w:pPr>
+        <w:pStyle w:val="ListBullet"/>
+      </w:pPr>
+      <w:r>
+        <w:t>複数手法を組み合わせることで、</w:t>
+      </w:r>
+      <w:r>
+        <w:rPr>
+          <w:b/>
+        </w:rPr>
+        <w:t>ほぼ全基準をカバー</w:t>
+      </w:r>
+    </w:p>
+    <w:p>
+      <w:pPr>
+        <w:pStyle w:val="ListBullet"/>
+      </w:pPr>
+      <w:r>
+        <w:t>特に H2（手法間一致=一貫性）と H7（整合性）が自動的に評価される</w:t>
+      </w:r>
     </w:p>
     <w:p>
       <w:pPr>
@@ -1601,91 +2239,12 @@
           <w:i/>
           <w:sz w:val="18"/>
         </w:rPr>
-        <w:t>Figure 5: Radar plots showing coverage of Hill's 9 causal criteria. LiNGAM excels at H1 (strength) and H3 (specificity) but lacks H6/H7/H9. Utility Causality covers H6 (plausibility), H7 (coherence), H9 (analogy). Ensemble (ECD) combines both, covering nearly all criteria.</w:t>
-      </w:r>
-    </w:p>
-    <w:p>
-      <w:r>
-        <w:t>DirectLiNGAM（図5左）:</w:t>
+        <w:t>図5: Hillの9基準に対する各手法のカバレッジ。LiNGAMはH1/H3に強いがH6/H7/H9が空白。Utility CausalityはH6/H7/H9に強いがH8が空白。アンサンブル（ECD）は両者を補完し、ほぼ全基準をカバーする。</w:t>
       </w:r>
     </w:p>
     <w:p>
       <w:pPr>
-        <w:pStyle w:val="ListBullet"/>
-      </w:pPr>
-      <w:r>
-        <w:t>H1（効果量を定量化）、H3（変数ペアの特定）に強い</w:t>
-      </w:r>
-    </w:p>
-    <w:p>
-      <w:pPr>
-        <w:pStyle w:val="ListBullet"/>
-      </w:pPr>
-      <w:r>
-        <w:t>しかし H6（生物学的妥当性）、H7（整合性）、H9（類似性）は空白</w:t>
-      </w:r>
-    </w:p>
-    <w:p>
-      <w:pPr>
-        <w:pStyle w:val="ListBullet"/>
-      </w:pPr>
-      <w:r>
-        <w:t>→ 「数字は出るが、なぜそうなるかは分からない」</w:t>
-      </w:r>
-    </w:p>
-    <w:p>
-      <w:r>
-        <w:t>Utility Causality（図5中）:</w:t>
-      </w:r>
-    </w:p>
-    <w:p>
-      <w:pPr>
-        <w:pStyle w:val="ListBullet"/>
-      </w:pPr>
-      <w:r>
-        <w:t>H6（LLMが臨床知識をグラフに注入）、H7（Eigenthemeが既知の疾患概念と整合）、H9（類似パターンの体系的検出）に強い</w:t>
-      </w:r>
-    </w:p>
-    <w:p>
-      <w:pPr>
-        <w:pStyle w:val="ListBullet"/>
-      </w:pPr>
-      <w:r>
-        <w:t>しかし H8（介入的証拠はない）</w:t>
-      </w:r>
-    </w:p>
-    <w:p>
-      <w:pPr>
-        <w:pStyle w:val="ListBullet"/>
-      </w:pPr>
-      <w:r>
-        <w:t>→ 「メカニズムは分かるが、操作的因果は証明できない」</w:t>
-      </w:r>
-    </w:p>
-    <w:p>
-      <w:r>
-        <w:t>アンサンブル（ECD）（図5右）:</w:t>
-      </w:r>
-    </w:p>
-    <w:p>
-      <w:pPr>
-        <w:pStyle w:val="ListBullet"/>
-      </w:pPr>
-      <w:r>
-        <w:t>複数手法を組み合わせることで、ほぼ全基準をカバー</w:t>
-      </w:r>
-    </w:p>
-    <w:p>
-      <w:pPr>
-        <w:pStyle w:val="ListBullet"/>
-      </w:pPr>
-      <w:r>
-        <w:t>特に H2（手法間一致=一貫性）と H7（整合性）が自動的に評価される</w:t>
-      </w:r>
-    </w:p>
-    <w:p>
-      <w:pPr>
-        <w:pStyle w:val="Heading3"/>
+        <w:pStyle w:val="Heading2"/>
       </w:pPr>
       <w:r>
         <w:t>核心的発見: 既存手法は半分しか使っていなかった</w:t>
@@ -1714,17 +2273,18 @@
     </w:p>
     <w:p>
       <w:r>
-        <w:t>スペクトル因果性/Utility Causalityの最大の貢献は、この「主観に頼っていた基準」を計算可能にすることです。</w:t>
+        <w:rPr>
+          <w:b/>
+        </w:rPr>
+        <w:t>スペクトル因果性/Utility Causalityの最大の貢献は、この「主観に頼っていた基準」を計算可能にすること</w:t>
       </w:r>
-    </w:p>
-    <w:p>
       <w:r>
-        <w:t>---</w:t>
+        <w:t>です。</w:t>
       </w:r>
     </w:p>
     <w:p>
       <w:pPr>
-        <w:pStyle w:val="Heading2"/>
+        <w:pStyle w:val="Heading1"/>
       </w:pPr>
       <w:r>
         <w:t>8. 因果の梯子と Hill基準の統合的理解</w:t>
@@ -1732,7 +2292,7 @@
     </w:p>
     <w:p>
       <w:pPr>
-        <w:pStyle w:val="Heading3"/>
+        <w:pStyle w:val="Heading2"/>
       </w:pPr>
       <w:r>
         <w:t>Pearlの梯子のどの段に、どのHill基準が対応するか</w:t>
@@ -1758,22 +2318,41 @@
     </w:p>
     <w:p>
       <w:r>
-        <w:t>重要な気づき: Hillの9基準のうち、H6/H7/H9は実はLevel 1.5に属しているのです。Hillは1965年に、まだ「介入」や「反事実」の数学的定義が確立する前に、直感的にこの中間層の存在を見抜いていたと解釈できます。</w:t>
+        <w:rPr>
+          <w:b/>
+        </w:rPr>
+        <w:t>重要な気づき</w:t>
+      </w:r>
+      <w:r>
+        <w:t>: Hillの9基準のうち、H6/H7/H9は実は</w:t>
+      </w:r>
+      <w:r>
+        <w:rPr>
+          <w:b/>
+        </w:rPr>
+        <w:t>Level 1.5に属している</w:t>
+      </w:r>
+      <w:r>
+        <w:t>のです。Hillは1965年に、まだ「介入」や「反事実」の数学的定義が確立する前に、直感的にこの中間層の存在を見抜いていたと解釈できます。</w:t>
       </w:r>
     </w:p>
     <w:p>
       <w:r>
-        <w:t>そして、60年間この中間層には計算手法がなかった。スペクトル因果性は、この空白を埋める最初の試みです。</w:t>
+        <w:t>そして、60年間この中間層には</w:t>
       </w:r>
-    </w:p>
-    <w:p>
       <w:r>
-        <w:t>---</w:t>
+        <w:rPr>
+          <w:b/>
+        </w:rPr>
+        <w:t>計算手法がなかった</w:t>
+      </w:r>
+      <w:r>
+        <w:t>。スペクトル因果性は、この空白を埋める最初の試みです。</w:t>
       </w:r>
     </w:p>
     <w:p>
       <w:pPr>
-        <w:pStyle w:val="Heading2"/>
+        <w:pStyle w:val="Heading1"/>
       </w:pPr>
       <w:r>
         <w:t>9. まとめ: スペクトル因果性は何が新しいか</w:t>
@@ -1783,6 +2362,7 @@
       <w:tblPr>
         <w:tblStyle w:val="TableGrid"/>
         <w:tblW w:type="auto" w:w="0"/>
+        <w:jc w:val="center"/>
         <w:tblLook w:firstColumn="1" w:firstRow="1" w:lastColumn="0" w:lastRow="0" w:noHBand="0" w:noVBand="1" w:val="04A0"/>
       </w:tblPr>
       <w:tblGrid>
@@ -1796,6 +2376,10 @@
             <w:tcW w:type="dxa" w:w="2880"/>
           </w:tcPr>
           <w:p>
+            <w:pPr>
+              <w:jc w:val="left"/>
+            </w:pPr>
+            <w:r/>
             <w:r>
               <w:rPr>
                 <w:b/>
@@ -1810,6 +2394,10 @@
             <w:tcW w:type="dxa" w:w="2880"/>
           </w:tcPr>
           <w:p>
+            <w:pPr>
+              <w:jc w:val="left"/>
+            </w:pPr>
+            <w:r/>
             <w:r>
               <w:rPr>
                 <w:b/>
@@ -1824,6 +2412,10 @@
             <w:tcW w:type="dxa" w:w="2880"/>
           </w:tcPr>
           <w:p>
+            <w:pPr>
+              <w:jc w:val="left"/>
+            </w:pPr>
+            <w:r/>
             <w:r>
               <w:rPr>
                 <w:b/>
@@ -1840,11 +2432,16 @@
             <w:tcW w:type="dxa" w:w="2880"/>
           </w:tcPr>
           <w:p>
+            <w:pPr>
+              <w:jc w:val="left"/>
+            </w:pPr>
+            <w:r/>
             <w:r>
               <w:rPr>
+                <w:b w:val="0"/>
                 <w:sz w:val="18"/>
               </w:rPr>
-              <w:t>入力</w:t>
+              <w:t>**入力**</w:t>
             </w:r>
           </w:p>
         </w:tc>
@@ -1853,8 +2450,13 @@
             <w:tcW w:type="dxa" w:w="2880"/>
           </w:tcPr>
           <w:p>
+            <w:pPr>
+              <w:jc w:val="left"/>
+            </w:pPr>
+            <w:r/>
             <w:r>
               <w:rPr>
+                <w:b w:val="0"/>
                 <w:sz w:val="18"/>
               </w:rPr>
               <w:t>データ（数値）のみ</w:t>
@@ -1866,8 +2468,13 @@
             <w:tcW w:type="dxa" w:w="2880"/>
           </w:tcPr>
           <w:p>
+            <w:pPr>
+              <w:jc w:val="left"/>
+            </w:pPr>
+            <w:r/>
             <w:r>
               <w:rPr>
+                <w:b w:val="0"/>
                 <w:sz w:val="18"/>
               </w:rPr>
               <w:t>データ + 臨床知識（LLM経由）</w:t>
@@ -1881,11 +2488,16 @@
             <w:tcW w:type="dxa" w:w="2880"/>
           </w:tcPr>
           <w:p>
+            <w:pPr>
+              <w:jc w:val="left"/>
+            </w:pPr>
+            <w:r/>
             <w:r>
               <w:rPr>
+                <w:b w:val="0"/>
                 <w:sz w:val="18"/>
               </w:rPr>
-              <w:t>出力</w:t>
+              <w:t>**出力**</w:t>
             </w:r>
           </w:p>
         </w:tc>
@@ -1894,8 +2506,13 @@
             <w:tcW w:type="dxa" w:w="2880"/>
           </w:tcPr>
           <w:p>
+            <w:pPr>
+              <w:jc w:val="left"/>
+            </w:pPr>
+            <w:r/>
             <w:r>
               <w:rPr>
+                <w:b w:val="0"/>
                 <w:sz w:val="18"/>
               </w:rPr>
               <w:t>変数ペアの因果方向</w:t>
@@ -1907,8 +2524,13 @@
             <w:tcW w:type="dxa" w:w="2880"/>
           </w:tcPr>
           <w:p>
+            <w:pPr>
+              <w:jc w:val="left"/>
+            </w:pPr>
+            <w:r/>
             <w:r>
               <w:rPr>
+                <w:b w:val="0"/>
                 <w:sz w:val="18"/>
               </w:rPr>
               <w:t>テーマレベルの因果フロー + ポテンシャル</w:t>
@@ -1922,11 +2544,16 @@
             <w:tcW w:type="dxa" w:w="2880"/>
           </w:tcPr>
           <w:p>
+            <w:pPr>
+              <w:jc w:val="left"/>
+            </w:pPr>
+            <w:r/>
             <w:r>
               <w:rPr>
+                <w:b w:val="0"/>
                 <w:sz w:val="18"/>
               </w:rPr>
-              <w:t>方向性の同定原理</w:t>
+              <w:t>**方向性の同定原理**</w:t>
             </w:r>
           </w:p>
         </w:tc>
@@ -1935,8 +2562,13 @@
             <w:tcW w:type="dxa" w:w="2880"/>
           </w:tcPr>
           <w:p>
+            <w:pPr>
+              <w:jc w:val="left"/>
+            </w:pPr>
+            <w:r/>
             <w:r>
               <w:rPr>
+                <w:b w:val="0"/>
                 <w:sz w:val="18"/>
               </w:rPr>
               <w:t>非ガウス性（LiNGAM）、時間的先行（Granger）</w:t>
@@ -1948,8 +2580,13 @@
             <w:tcW w:type="dxa" w:w="2880"/>
           </w:tcPr>
           <w:p>
+            <w:pPr>
+              <w:jc w:val="left"/>
+            </w:pPr>
+            <w:r/>
             <w:r>
               <w:rPr>
+                <w:b w:val="0"/>
                 <w:sz w:val="18"/>
               </w:rPr>
               <w:t>ユーティリティの非対称性（「何が何に役立つか」）</w:t>
@@ -1963,11 +2600,16 @@
             <w:tcW w:type="dxa" w:w="2880"/>
           </w:tcPr>
           <w:p>
+            <w:pPr>
+              <w:jc w:val="left"/>
+            </w:pPr>
+            <w:r/>
             <w:r>
               <w:rPr>
+                <w:b w:val="0"/>
                 <w:sz w:val="18"/>
               </w:rPr>
-              <w:t>フィードバック</w:t>
+              <w:t>**フィードバック**</w:t>
             </w:r>
           </w:p>
         </w:tc>
@@ -1976,8 +2618,13 @@
             <w:tcW w:type="dxa" w:w="2880"/>
           </w:tcPr>
           <w:p>
+            <w:pPr>
+              <w:jc w:val="left"/>
+            </w:pPr>
+            <w:r/>
             <w:r>
               <w:rPr>
+                <w:b w:val="0"/>
                 <w:sz w:val="18"/>
               </w:rPr>
               <w:t>DAG仮定で排除</w:t>
@@ -1989,8 +2636,13 @@
             <w:tcW w:type="dxa" w:w="2880"/>
           </w:tcPr>
           <w:p>
+            <w:pPr>
+              <w:jc w:val="left"/>
+            </w:pPr>
+            <w:r/>
             <w:r>
               <w:rPr>
+                <w:b w:val="0"/>
                 <w:sz w:val="18"/>
               </w:rPr>
               <w:t>Hodge分解で定量化</w:t>
@@ -2004,11 +2656,16 @@
             <w:tcW w:type="dxa" w:w="2880"/>
           </w:tcPr>
           <w:p>
+            <w:pPr>
+              <w:jc w:val="left"/>
+            </w:pPr>
+            <w:r/>
             <w:r>
               <w:rPr>
+                <w:b w:val="0"/>
                 <w:sz w:val="18"/>
               </w:rPr>
-              <w:t>Hill基準の得意領域</w:t>
+              <w:t>**Hill基準の得意領域**</w:t>
             </w:r>
           </w:p>
         </w:tc>
@@ -2017,8 +2674,13 @@
             <w:tcW w:type="dxa" w:w="2880"/>
           </w:tcPr>
           <w:p>
+            <w:pPr>
+              <w:jc w:val="left"/>
+            </w:pPr>
+            <w:r/>
             <w:r>
               <w:rPr>
+                <w:b w:val="0"/>
                 <w:sz w:val="18"/>
               </w:rPr>
               <w:t>H1, H3, H4, H8</w:t>
@@ -2030,8 +2692,13 @@
             <w:tcW w:type="dxa" w:w="2880"/>
           </w:tcPr>
           <w:p>
+            <w:pPr>
+              <w:jc w:val="left"/>
+            </w:pPr>
+            <w:r/>
             <w:r>
               <w:rPr>
+                <w:b w:val="0"/>
                 <w:sz w:val="18"/>
               </w:rPr>
               <w:t>H6, H7, H9</w:t>
@@ -2045,11 +2712,16 @@
             <w:tcW w:type="dxa" w:w="2880"/>
           </w:tcPr>
           <w:p>
+            <w:pPr>
+              <w:jc w:val="left"/>
+            </w:pPr>
+            <w:r/>
             <w:r>
               <w:rPr>
+                <w:b w:val="0"/>
                 <w:sz w:val="18"/>
               </w:rPr>
-              <w:t>因果の梯子</w:t>
+              <w:t>**因果の梯子**</w:t>
             </w:r>
           </w:p>
         </w:tc>
@@ -2058,8 +2730,13 @@
             <w:tcW w:type="dxa" w:w="2880"/>
           </w:tcPr>
           <w:p>
+            <w:pPr>
+              <w:jc w:val="left"/>
+            </w:pPr>
+            <w:r/>
             <w:r>
               <w:rPr>
+                <w:b w:val="0"/>
                 <w:sz w:val="18"/>
               </w:rPr>
               <w:t>Level 2-3（介入・反事実）</w:t>
@@ -2071,8 +2748,13 @@
             <w:tcW w:type="dxa" w:w="2880"/>
           </w:tcPr>
           <w:p>
+            <w:pPr>
+              <w:jc w:val="left"/>
+            </w:pPr>
+            <w:r/>
             <w:r>
               <w:rPr>
+                <w:b w:val="0"/>
                 <w:sz w:val="18"/>
               </w:rPr>
               <w:t>Level 1.5（情報的因果）</w:t>
@@ -2086,11 +2768,16 @@
             <w:tcW w:type="dxa" w:w="2880"/>
           </w:tcPr>
           <w:p>
+            <w:pPr>
+              <w:jc w:val="left"/>
+            </w:pPr>
+            <w:r/>
             <w:r>
               <w:rPr>
+                <w:b w:val="0"/>
                 <w:sz w:val="18"/>
               </w:rPr>
-              <w:t>最適な使い方</w:t>
+              <w:t>**最適な使い方**</w:t>
             </w:r>
           </w:p>
         </w:tc>
@@ -2099,8 +2786,13 @@
             <w:tcW w:type="dxa" w:w="2880"/>
           </w:tcPr>
           <w:p>
+            <w:pPr>
+              <w:jc w:val="left"/>
+            </w:pPr>
+            <w:r/>
             <w:r>
               <w:rPr>
+                <w:b w:val="0"/>
                 <w:sz w:val="18"/>
               </w:rPr>
               <w:t>介入の効果を推定したいとき</w:t>
@@ -2112,8 +2804,13 @@
             <w:tcW w:type="dxa" w:w="2880"/>
           </w:tcPr>
           <w:p>
+            <w:pPr>
+              <w:jc w:val="left"/>
+            </w:pPr>
+            <w:r/>
             <w:r>
               <w:rPr>
+                <w:b w:val="0"/>
                 <w:sz w:val="18"/>
               </w:rPr>
               <w:t>病態のメカニズムを理解したいとき</w:t>
@@ -2125,7 +2822,7 @@
     <w:p/>
     <w:p>
       <w:pPr>
-        <w:pStyle w:val="Heading3"/>
+        <w:pStyle w:val="Heading2"/>
       </w:pPr>
       <w:r>
         <w:t>一言で言うと</w:t>
@@ -2135,12 +2832,14 @@
       <w:pPr>
         <w:ind w:left="850"/>
       </w:pPr>
+      <w:r/>
       <w:r>
         <w:rPr>
-          <w:i/>
+          <w:b/>
         </w:rPr>
         <w:t>スペクトル因果性は、「データから因果を見つける」のではなく、「知識とデータを融合して因果を理解する」手法です。</w:t>
       </w:r>
+      <w:r/>
     </w:p>
     <w:p>
       <w:r>
@@ -2148,13 +2847,8 @@
       </w:r>
     </w:p>
     <w:p>
-      <w:r>
-        <w:t>---</w:t>
-      </w:r>
-    </w:p>
-    <w:p>
       <w:pPr>
-        <w:pStyle w:val="Heading2"/>
+        <w:pStyle w:val="Heading1"/>
       </w:pPr>
       <w:r>
         <w:t>10. 用語集</w:t>
@@ -2164,6 +2858,7 @@
       <w:tblPr>
         <w:tblStyle w:val="TableGrid"/>
         <w:tblW w:type="auto" w:w="0"/>
+        <w:jc w:val="center"/>
         <w:tblLook w:firstColumn="1" w:firstRow="1" w:lastColumn="0" w:lastRow="0" w:noHBand="0" w:noVBand="1" w:val="04A0"/>
       </w:tblPr>
       <w:tblGrid>
@@ -2176,6 +2871,10 @@
             <w:tcW w:type="dxa" w:w="4320"/>
           </w:tcPr>
           <w:p>
+            <w:pPr>
+              <w:jc w:val="left"/>
+            </w:pPr>
+            <w:r/>
             <w:r>
               <w:rPr>
                 <w:b/>
@@ -2190,6 +2889,10 @@
             <w:tcW w:type="dxa" w:w="4320"/>
           </w:tcPr>
           <w:p>
+            <w:pPr>
+              <w:jc w:val="left"/>
+            </w:pPr>
+            <w:r/>
             <w:r>
               <w:rPr>
                 <w:b/>
@@ -2206,11 +2909,16 @@
             <w:tcW w:type="dxa" w:w="4320"/>
           </w:tcPr>
           <w:p>
+            <w:pPr>
+              <w:jc w:val="left"/>
+            </w:pPr>
+            <w:r/>
             <w:r>
               <w:rPr>
+                <w:b w:val="0"/>
                 <w:sz w:val="18"/>
               </w:rPr>
-              <w:t>スペクトル分解</w:t>
+              <w:t>**スペクトル分解**</w:t>
             </w:r>
           </w:p>
         </w:tc>
@@ -2219,8 +2927,13 @@
             <w:tcW w:type="dxa" w:w="4320"/>
           </w:tcPr>
           <w:p>
+            <w:pPr>
+              <w:jc w:val="left"/>
+            </w:pPr>
+            <w:r/>
             <w:r>
               <w:rPr>
+                <w:b w:val="0"/>
                 <w:sz w:val="18"/>
               </w:rPr>
               <w:t>ネットワーク（グラフ）の行列を固有値・固有ベクトルに分解すること。音のフーリエ変換のネットワーク版</w:t>
@@ -2234,11 +2947,16 @@
             <w:tcW w:type="dxa" w:w="4320"/>
           </w:tcPr>
           <w:p>
+            <w:pPr>
+              <w:jc w:val="left"/>
+            </w:pPr>
+            <w:r/>
             <w:r>
               <w:rPr>
+                <w:b w:val="0"/>
                 <w:sz w:val="18"/>
               </w:rPr>
-              <w:t>磁気ラプラシアン</w:t>
+              <w:t>**磁気ラプラシアン**</w:t>
             </w:r>
           </w:p>
         </w:tc>
@@ -2247,8 +2965,13 @@
             <w:tcW w:type="dxa" w:w="4320"/>
           </w:tcPr>
           <w:p>
+            <w:pPr>
+              <w:jc w:val="left"/>
+            </w:pPr>
+            <w:r/>
             <w:r>
               <w:rPr>
+                <w:b w:val="0"/>
                 <w:sz w:val="18"/>
               </w:rPr>
               <w:t>エッジの方向性を複素数の位相で符号化したグラフの行列。量子力学の磁場中の電子モデルに由来</w:t>
@@ -2262,11 +2985,16 @@
             <w:tcW w:type="dxa" w:w="4320"/>
           </w:tcPr>
           <w:p>
+            <w:pPr>
+              <w:jc w:val="left"/>
+            </w:pPr>
+            <w:r/>
             <w:r>
               <w:rPr>
+                <w:b w:val="0"/>
                 <w:sz w:val="18"/>
               </w:rPr>
-              <w:t>Hodge分解</w:t>
+              <w:t>**Hodge分解**</w:t>
             </w:r>
           </w:p>
         </w:tc>
@@ -2275,8 +3003,13 @@
             <w:tcW w:type="dxa" w:w="4320"/>
           </w:tcPr>
           <w:p>
+            <w:pPr>
+              <w:jc w:val="left"/>
+            </w:pPr>
+            <w:r/>
             <w:r>
               <w:rPr>
+                <w:b w:val="0"/>
                 <w:sz w:val="18"/>
               </w:rPr>
               <w:t>ネットワーク上の「流れ」を、一方向成分（勾配）と循環成分（カール）に分離する手法</w:t>
@@ -2290,11 +3023,16 @@
             <w:tcW w:type="dxa" w:w="4320"/>
           </w:tcPr>
           <w:p>
+            <w:pPr>
+              <w:jc w:val="left"/>
+            </w:pPr>
+            <w:r/>
             <w:r>
               <w:rPr>
+                <w:b w:val="0"/>
                 <w:sz w:val="18"/>
               </w:rPr>
-              <w:t>因果ポテンシャル</w:t>
+              <w:t>**因果ポテンシャル**</w:t>
             </w:r>
           </w:p>
         </w:tc>
@@ -2303,8 +3041,13 @@
             <w:tcW w:type="dxa" w:w="4320"/>
           </w:tcPr>
           <w:p>
+            <w:pPr>
+              <w:jc w:val="left"/>
+            </w:pPr>
+            <w:r/>
             <w:r>
               <w:rPr>
+                <w:b w:val="0"/>
                 <w:sz w:val="18"/>
               </w:rPr>
               <w:t>各変数に割り当てられる「因果的な標高」。高い変数は原因側、低い変数は結果側</w:t>
@@ -2318,11 +3061,16 @@
             <w:tcW w:type="dxa" w:w="4320"/>
           </w:tcPr>
           <w:p>
+            <w:pPr>
+              <w:jc w:val="left"/>
+            </w:pPr>
+            <w:r/>
             <w:r>
               <w:rPr>
+                <w:b w:val="0"/>
                 <w:sz w:val="18"/>
               </w:rPr>
-              <w:t>ユーティリティ質問</w:t>
+              <w:t>**ユーティリティ質問**</w:t>
             </w:r>
           </w:p>
         </w:tc>
@@ -2331,8 +3079,13 @@
             <w:tcW w:type="dxa" w:w="4320"/>
           </w:tcPr>
           <w:p>
+            <w:pPr>
+              <w:jc w:val="left"/>
+            </w:pPr>
+            <w:r/>
             <w:r>
               <w:rPr>
+                <w:b w:val="0"/>
                 <w:sz w:val="18"/>
               </w:rPr>
               <w:t>「このデータがあれば、どんな臨床的問いに答えられるか？」という問い。GEM-RAGの核心概念</w:t>
@@ -2346,11 +3099,16 @@
             <w:tcW w:type="dxa" w:w="4320"/>
           </w:tcPr>
           <w:p>
+            <w:pPr>
+              <w:jc w:val="left"/>
+            </w:pPr>
+            <w:r/>
             <w:r>
               <w:rPr>
+                <w:b w:val="0"/>
                 <w:sz w:val="18"/>
               </w:rPr>
-              <w:t>Eigentheme</w:t>
+              <w:t>**Eigentheme**</w:t>
             </w:r>
           </w:p>
         </w:tc>
@@ -2359,8 +3117,13 @@
             <w:tcW w:type="dxa" w:w="4320"/>
           </w:tcPr>
           <w:p>
+            <w:pPr>
+              <w:jc w:val="left"/>
+            </w:pPr>
+            <w:r/>
             <w:r>
               <w:rPr>
+                <w:b w:val="0"/>
                 <w:sz w:val="18"/>
               </w:rPr>
               <w:t>スペクトル分解で得られる潜在的な臨床テーマ。「心血管リスク」「代謝異常」等</w:t>
@@ -2374,11 +3137,16 @@
             <w:tcW w:type="dxa" w:w="4320"/>
           </w:tcPr>
           <w:p>
+            <w:pPr>
+              <w:jc w:val="left"/>
+            </w:pPr>
+            <w:r/>
             <w:r>
               <w:rPr>
+                <w:b w:val="0"/>
                 <w:sz w:val="18"/>
               </w:rPr>
-              <w:t>SCI/SCD</w:t>
+              <w:t>**SCI/SCD**</w:t>
             </w:r>
           </w:p>
         </w:tc>
@@ -2387,8 +3155,13 @@
             <w:tcW w:type="dxa" w:w="4320"/>
           </w:tcPr>
           <w:p>
+            <w:pPr>
+              <w:jc w:val="left"/>
+            </w:pPr>
+            <w:r/>
             <w:r>
               <w:rPr>
+                <w:b w:val="0"/>
                 <w:sz w:val="18"/>
               </w:rPr>
               <w:t>Spectral Causal Intensity（因果強度）/ Direction（因果方向）。磁気ラプラシアンから計算</w:t>
@@ -2402,11 +3175,16 @@
             <w:tcW w:type="dxa" w:w="4320"/>
           </w:tcPr>
           <w:p>
+            <w:pPr>
+              <w:jc w:val="left"/>
+            </w:pPr>
+            <w:r/>
             <w:r>
               <w:rPr>
+                <w:b w:val="0"/>
                 <w:sz w:val="18"/>
               </w:rPr>
-              <w:t>ECD</w:t>
+              <w:t>**ECD**</w:t>
             </w:r>
           </w:p>
         </w:tc>
@@ -2415,8 +3193,13 @@
             <w:tcW w:type="dxa" w:w="4320"/>
           </w:tcPr>
           <w:p>
+            <w:pPr>
+              <w:jc w:val="left"/>
+            </w:pPr>
+            <w:r/>
             <w:r>
               <w:rPr>
+                <w:b w:val="0"/>
                 <w:sz w:val="18"/>
               </w:rPr>
               <w:t>Ensemble Causal Direction。複数の因果推定手法の結果を統合した因果方向</w:t>
@@ -2430,11 +3213,16 @@
             <w:tcW w:type="dxa" w:w="4320"/>
           </w:tcPr>
           <w:p>
+            <w:pPr>
+              <w:jc w:val="left"/>
+            </w:pPr>
+            <w:r/>
             <w:r>
               <w:rPr>
+                <w:b w:val="0"/>
                 <w:sz w:val="18"/>
               </w:rPr>
-              <w:t>LiNGAM</w:t>
+              <w:t>**LiNGAM**</w:t>
             </w:r>
           </w:p>
         </w:tc>
@@ -2443,8 +3231,13 @@
             <w:tcW w:type="dxa" w:w="4320"/>
           </w:tcPr>
           <w:p>
+            <w:pPr>
+              <w:jc w:val="left"/>
+            </w:pPr>
+            <w:r/>
             <w:r>
               <w:rPr>
+                <w:b w:val="0"/>
                 <w:sz w:val="18"/>
               </w:rPr>
               <w:t>Linear Non-Gaussian Acyclic Model。データの非ガウス性を利用して因果方向を推定する手法</w:t>
@@ -2458,11 +3251,16 @@
             <w:tcW w:type="dxa" w:w="4320"/>
           </w:tcPr>
           <w:p>
+            <w:pPr>
+              <w:jc w:val="left"/>
+            </w:pPr>
+            <w:r/>
             <w:r>
               <w:rPr>
+                <w:b w:val="0"/>
                 <w:sz w:val="18"/>
               </w:rPr>
-              <w:t>DAG</w:t>
+              <w:t>**DAG**</w:t>
             </w:r>
           </w:p>
         </w:tc>
@@ -2471,8 +3269,13 @@
             <w:tcW w:type="dxa" w:w="4320"/>
           </w:tcPr>
           <w:p>
+            <w:pPr>
+              <w:jc w:val="left"/>
+            </w:pPr>
+            <w:r/>
             <w:r>
               <w:rPr>
+                <w:b w:val="0"/>
                 <w:sz w:val="18"/>
               </w:rPr>
               <w:t>Directed Acyclic Graph（有向非循環グラフ）。フィードバックのない因果構造</w:t>
@@ -2486,11 +3289,16 @@
             <w:tcW w:type="dxa" w:w="4320"/>
           </w:tcPr>
           <w:p>
+            <w:pPr>
+              <w:jc w:val="left"/>
+            </w:pPr>
+            <w:r/>
             <w:r>
               <w:rPr>
+                <w:b w:val="0"/>
                 <w:sz w:val="18"/>
               </w:rPr>
-              <w:t>Hill の9基準</w:t>
+              <w:t>**Hill の9基準**</w:t>
             </w:r>
           </w:p>
         </w:tc>
@@ -2499,8 +3307,13 @@
             <w:tcW w:type="dxa" w:w="4320"/>
           </w:tcPr>
           <w:p>
+            <w:pPr>
+              <w:jc w:val="left"/>
+            </w:pPr>
+            <w:r/>
             <w:r>
               <w:rPr>
+                <w:b w:val="0"/>
                 <w:sz w:val="18"/>
               </w:rPr>
               <w:t>1965年にBradford Hillが提唱した、関連が因果であるかを判断するための9つの観点</w:t>
@@ -2511,13 +3324,8 @@
     </w:tbl>
     <w:p/>
     <w:p>
-      <w:r>
-        <w:t>---</w:t>
-      </w:r>
-    </w:p>
-    <w:p>
       <w:pPr>
-        <w:pStyle w:val="Heading2"/>
+        <w:pStyle w:val="Heading1"/>
       </w:pPr>
       <w:r>
         <w:t>付録: 解析の再現方法</w:t>
@@ -2525,7 +3333,17 @@
     </w:p>
     <w:p>
       <w:r>
-        <w:t>本稿の全解析は `demo_spectral_causality.py` で再現可能です。</w:t>
+        <w:t xml:space="preserve">本稿の全解析は </w:t>
+      </w:r>
+      <w:r>
+        <w:rPr>
+          <w:rFonts w:ascii="Courier New" w:hAnsi="Courier New"/>
+          <w:sz w:val="18"/>
+        </w:rPr>
+        <w:t>demo_spectral_causality.py</w:t>
+      </w:r>
+      <w:r>
+        <w:t xml:space="preserve"> で再現可能です。</w:t>
       </w:r>
     </w:p>
     <w:p>
@@ -2564,13 +3382,8 @@
       </w:r>
     </w:p>
     <w:p>
-      <w:r>
-        <w:t>---</w:t>
-      </w:r>
-    </w:p>
-    <w:p>
       <w:pPr>
-        <w:pStyle w:val="Heading2"/>
+        <w:pStyle w:val="Heading1"/>
       </w:pPr>
       <w:r>
         <w:t>参考文献</w:t>
@@ -2581,7 +3394,16 @@
         <w:pStyle w:val="ListNumber"/>
       </w:pPr>
       <w:r>
-        <w:t>Pearl, J. (2009). *Causality: Models, Reasoning, and Inference* (2nd ed.). Cambridge University Press.</w:t>
+        <w:t xml:space="preserve">Pearl, J. (2009). </w:t>
+      </w:r>
+      <w:r>
+        <w:rPr>
+          <w:i/>
+        </w:rPr>
+        <w:t>Causality: Models, Reasoning, and Inference</w:t>
+      </w:r>
+      <w:r>
+        <w:t xml:space="preserve"> (2nd ed.). Cambridge University Press.</w:t>
       </w:r>
     </w:p>
     <w:p>
@@ -2589,7 +3411,16 @@
         <w:pStyle w:val="ListNumber"/>
       </w:pPr>
       <w:r>
-        <w:t>Hill, A.B. (1965). "The Environment and Disease: Association or Causation?" *Proceedings of the Royal Society of Medicine*, 58, 295-300.</w:t>
+        <w:t xml:space="preserve">Hill, A.B. (1965). "The Environment and Disease: Association or Causation?" </w:t>
+      </w:r>
+      <w:r>
+        <w:rPr>
+          <w:i/>
+        </w:rPr>
+        <w:t>Proceedings of the Royal Society of Medicine</w:t>
+      </w:r>
+      <w:r>
+        <w:t>, 58, 295-300.</w:t>
       </w:r>
     </w:p>
     <w:p>
@@ -2597,7 +3428,16 @@
         <w:pStyle w:val="ListNumber"/>
       </w:pPr>
       <w:r>
-        <w:t>Shimizu, S. et al. (2006). "A Linear Non-Gaussian Acyclic Model for Causal Discovery." *JMLR*, 7, 2003-2030.</w:t>
+        <w:t xml:space="preserve">Shimizu, S. et al. (2006). "A Linear Non-Gaussian Acyclic Model for Causal Discovery." </w:t>
+      </w:r>
+      <w:r>
+        <w:rPr>
+          <w:i/>
+        </w:rPr>
+        <w:t>JMLR</w:t>
+      </w:r>
+      <w:r>
+        <w:t>, 7, 2003-2030.</w:t>
       </w:r>
     </w:p>
     <w:p>
@@ -2605,7 +3445,16 @@
         <w:pStyle w:val="ListNumber"/>
       </w:pPr>
       <w:r>
-        <w:t>Seifert, B., Wendler, C. &amp; Püschel, M. (2023). "Causal Fourier Analysis on Directed Acyclic Graphs and Posets." *IEEE Trans. Signal Processing*.</w:t>
+        <w:t xml:space="preserve">Seifert, B., Wendler, C. &amp; Püschel, M. (2023). "Causal Fourier Analysis on Directed Acyclic Graphs and Posets." </w:t>
+      </w:r>
+      <w:r>
+        <w:rPr>
+          <w:i/>
+        </w:rPr>
+        <w:t>IEEE Trans. Signal Processing</w:t>
+      </w:r>
+      <w:r>
+        <w:t>.</w:t>
       </w:r>
     </w:p>
     <w:p>
@@ -2613,7 +3462,16 @@
         <w:pStyle w:val="ListNumber"/>
       </w:pPr>
       <w:r>
-        <w:t>Zhang, X. et al. (2022). "MGC: A Complex-Valued Graph Convolutional Network for Directed Graphs." *arXiv:2110.07570*.</w:t>
+        <w:t xml:space="preserve">Zhang, X. et al. (2022). "MGC: A Complex-Valued Graph Convolutional Network for Directed Graphs." </w:t>
+      </w:r>
+      <w:r>
+        <w:rPr>
+          <w:i/>
+        </w:rPr>
+        <w:t>arXiv:2110.07570</w:t>
+      </w:r>
+      <w:r>
+        <w:t>.</w:t>
       </w:r>
     </w:p>
     <w:p>
@@ -2621,7 +3479,16 @@
         <w:pStyle w:val="ListNumber"/>
       </w:pPr>
       <w:r>
-        <w:t>Jiang, X. et al. (2011). "Statistical ranking and combinatorial Hodge theory." *Mathematical Programming*, 127, 203-244.</w:t>
+        <w:t xml:space="preserve">Jiang, X. et al. (2011). "Statistical ranking and combinatorial Hodge theory." </w:t>
+      </w:r>
+      <w:r>
+        <w:rPr>
+          <w:i/>
+        </w:rPr>
+        <w:t>Mathematical Programming</w:t>
+      </w:r>
+      <w:r>
+        <w:t>, 127, 203-244.</w:t>
       </w:r>
     </w:p>
     <w:p>
@@ -2629,7 +3496,16 @@
         <w:pStyle w:val="ListNumber"/>
       </w:pPr>
       <w:r>
-        <w:t>Maehara, K. &amp; Ohkawa, Y. (2019). "Modeling latent flows on single-cell data using the Hodge decomposition." *bioRxiv*.</w:t>
+        <w:t xml:space="preserve">Maehara, K. &amp; Ohkawa, Y. (2019). "Modeling latent flows on single-cell data using the Hodge decomposition." </w:t>
+      </w:r>
+      <w:r>
+        <w:rPr>
+          <w:i/>
+        </w:rPr>
+        <w:t>bioRxiv</w:t>
+      </w:r>
+      <w:r>
+        <w:t>.</w:t>
       </w:r>
     </w:p>
     <w:p>
@@ -2637,7 +3513,16 @@
         <w:pStyle w:val="ListNumber"/>
       </w:pPr>
       <w:r>
-        <w:t>Kotoku, J. et al. (2020). "Causal relations of health indices inferred statistically using the DirectLiNGAM algorithm." *PLOS ONE*.</w:t>
+        <w:t xml:space="preserve">Kotoku, J. et al. (2020). "Causal relations of health indices inferred statistically using the DirectLiNGAM algorithm." </w:t>
+      </w:r>
+      <w:r>
+        <w:rPr>
+          <w:i/>
+        </w:rPr>
+        <w:t>PLOS ONE</w:t>
+      </w:r>
+      <w:r>
+        <w:t>.</w:t>
       </w:r>
     </w:p>
     <w:p>
@@ -2645,7 +3530,16 @@
         <w:pStyle w:val="ListNumber"/>
       </w:pPr>
       <w:r>
-        <w:t>Okuda, S. et al. (2025). "Operationalizing Longitudinal Causal Discovery Under Real-World Workflow Constraints." *arXiv:2602.23800*.</w:t>
+        <w:t xml:space="preserve">Okuda, S. et al. (2025). "Operationalizing Longitudinal Causal Discovery Under Real-World Workflow Constraints." </w:t>
+      </w:r>
+      <w:r>
+        <w:rPr>
+          <w:i/>
+        </w:rPr>
+        <w:t>arXiv:2602.23800</w:t>
+      </w:r>
+      <w:r>
+        <w:t>.</w:t>
       </w:r>
     </w:p>
     <w:p>
@@ -2653,7 +3547,16 @@
         <w:pStyle w:val="ListNumber"/>
       </w:pPr>
       <w:r>
-        <w:t>Detrano, R. et al. (1989). "International application of a new probability algorithm for the diagnosis of coronary artery disease." *American Journal of Cardiology*, 64, 304-310.</w:t>
+        <w:t xml:space="preserve">Detrano, R. et al. (1989). "International application of a new probability algorithm for the diagnosis of coronary artery disease." </w:t>
+      </w:r>
+      <w:r>
+        <w:rPr>
+          <w:i/>
+        </w:rPr>
+        <w:t>American Journal of Cardiology</w:t>
+      </w:r>
+      <w:r>
+        <w:t>, 64, 304-310.</w:t>
       </w:r>
     </w:p>
     <w:sectPr>
@@ -3029,9 +3932,6 @@
     <w:name w:val="Normal"/>
     <w:qFormat/>
     <w:rsid w:val="00FC693F"/>
-    <w:pPr>
-      <w:spacing w:after="120"/>
-    </w:pPr>
     <w:rPr>
       <w:rFonts w:ascii="Times New Roman" w:hAnsi="Times New Roman"/>
       <w:sz w:val="22"/>

</xml_diff>

<commit_message>
Integrate 07 comparison content into 05/06, regenerate docx/pptx
06_academic.md: Add §8 (3-condition comparison + fig7), §9 (ECD + fig9),
  §10 (DAG transition: alpha sweep, p_flip, LOEO, random knowledge,
  phase transition analogy + fig8), §11 (cyclic pruning, practical
  workflow, bootstrap pruning code, knowledge decision table).
  Old §8 renumbered to §12. Symbols table updated.

05_explainer.md: Add §8.5-8.8 (plain-language versions of comparison,
  DAG transition, causal upstream, feedback pruning + fig6-8).
  Glossary extended with DCG, alpha, p_flip, feedback rate terms.

All docx/pptx regenerated with 8 figures (05/06) and 3 figures (07).

Co-Authored-By: Tatsuki Onishi <bougtoir@gmail.com>
</commit_message>
<xml_diff>
--- a/spectral-causality-brainstorm/05_spectral_causality_explainer.docx
+++ b/spectral-causality-brainstorm/05_spectral_causality_explainer.docx
@@ -2355,6 +2355,1264 @@
         <w:pStyle w:val="Heading1"/>
       </w:pPr>
       <w:r>
+        <w:t>8.5. LiNGAM vs スペクトル因果性 — 直接比較で分かったこと</w:t>
+      </w:r>
+    </w:p>
+    <w:p>
+      <w:r>
+        <w:t>同じ心疾患データに対して、3つの条件で因果構造を推定しました（図6）：</w:t>
+      </w:r>
+    </w:p>
+    <w:tbl>
+      <w:tblPr>
+        <w:tblStyle w:val="TableGrid"/>
+        <w:tblW w:type="auto" w:w="0"/>
+        <w:jc w:val="center"/>
+        <w:tblLook w:firstColumn="1" w:firstRow="1" w:lastColumn="0" w:lastRow="0" w:noHBand="0" w:noVBand="1" w:val="04A0"/>
+      </w:tblPr>
+      <w:tblGrid>
+        <w:gridCol w:w="2880"/>
+        <w:gridCol w:w="2880"/>
+        <w:gridCol w:w="2880"/>
+      </w:tblGrid>
+      <w:tr>
+        <w:tc>
+          <w:tcPr>
+            <w:tcW w:type="dxa" w:w="2880"/>
+          </w:tcPr>
+          <w:p>
+            <w:pPr>
+              <w:jc w:val="left"/>
+            </w:pPr>
+            <w:r/>
+            <w:r>
+              <w:rPr>
+                <w:b/>
+                <w:sz w:val="18"/>
+              </w:rPr>
+              <w:t>条件</w:t>
+            </w:r>
+          </w:p>
+        </w:tc>
+        <w:tc>
+          <w:tcPr>
+            <w:tcW w:type="dxa" w:w="2880"/>
+          </w:tcPr>
+          <w:p>
+            <w:pPr>
+              <w:jc w:val="left"/>
+            </w:pPr>
+            <w:r/>
+            <w:r>
+              <w:rPr>
+                <w:b/>
+                <w:sz w:val="18"/>
+              </w:rPr>
+              <w:t>手法</w:t>
+            </w:r>
+          </w:p>
+        </w:tc>
+        <w:tc>
+          <w:tcPr>
+            <w:tcW w:type="dxa" w:w="2880"/>
+          </w:tcPr>
+          <w:p>
+            <w:pPr>
+              <w:jc w:val="left"/>
+            </w:pPr>
+            <w:r/>
+            <w:r>
+              <w:rPr>
+                <w:b/>
+                <w:sz w:val="18"/>
+              </w:rPr>
+              <w:t>結果</w:t>
+            </w:r>
+          </w:p>
+        </w:tc>
+      </w:tr>
+      <w:tr>
+        <w:tc>
+          <w:tcPr>
+            <w:tcW w:type="dxa" w:w="2880"/>
+          </w:tcPr>
+          <w:p>
+            <w:pPr>
+              <w:jc w:val="left"/>
+            </w:pPr>
+            <w:r/>
+            <w:r>
+              <w:rPr>
+                <w:b w:val="0"/>
+                <w:sz w:val="18"/>
+              </w:rPr>
+              <w:t>**(A)** LiNGAM</w:t>
+            </w:r>
+          </w:p>
+        </w:tc>
+        <w:tc>
+          <w:tcPr>
+            <w:tcW w:type="dxa" w:w="2880"/>
+          </w:tcPr>
+          <w:p>
+            <w:pPr>
+              <w:jc w:val="left"/>
+            </w:pPr>
+            <w:r/>
+            <w:r>
+              <w:rPr>
+                <w:b w:val="0"/>
+                <w:sz w:val="18"/>
+              </w:rPr>
+              <w:t>統計（非ガウス性）のみ</w:t>
+            </w:r>
+          </w:p>
+        </w:tc>
+        <w:tc>
+          <w:tcPr>
+            <w:tcW w:type="dxa" w:w="2880"/>
+          </w:tcPr>
+          <w:p>
+            <w:pPr>
+              <w:jc w:val="left"/>
+            </w:pPr>
+            <w:r/>
+            <w:r>
+              <w:rPr>
+                <w:b w:val="0"/>
+                <w:sz w:val="18"/>
+              </w:rPr>
+              <w:t>DAG（6本の一方向辺）</w:t>
+            </w:r>
+          </w:p>
+        </w:tc>
+      </w:tr>
+      <w:tr>
+        <w:tc>
+          <w:tcPr>
+            <w:tcW w:type="dxa" w:w="2880"/>
+          </w:tcPr>
+          <w:p>
+            <w:pPr>
+              <w:jc w:val="left"/>
+            </w:pPr>
+            <w:r/>
+            <w:r>
+              <w:rPr>
+                <w:b w:val="0"/>
+                <w:sz w:val="18"/>
+              </w:rPr>
+              <w:t>**(B)** スペクトル因果性（知識あり）</w:t>
+            </w:r>
+          </w:p>
+        </w:tc>
+        <w:tc>
+          <w:tcPr>
+            <w:tcW w:type="dxa" w:w="2880"/>
+          </w:tcPr>
+          <w:p>
+            <w:pPr>
+              <w:jc w:val="left"/>
+            </w:pPr>
+            <w:r/>
+            <w:r>
+              <w:rPr>
+                <w:b w:val="0"/>
+                <w:sz w:val="18"/>
+              </w:rPr>
+              <w:t>臨床知識60% + データ40%</w:t>
+            </w:r>
+          </w:p>
+        </w:tc>
+        <w:tc>
+          <w:tcPr>
+            <w:tcW w:type="dxa" w:w="2880"/>
+          </w:tcPr>
+          <w:p>
+            <w:pPr>
+              <w:jc w:val="left"/>
+            </w:pPr>
+            <w:r/>
+            <w:r>
+              <w:rPr>
+                <w:b w:val="0"/>
+                <w:sz w:val="18"/>
+              </w:rPr>
+              <w:t>DCG（9本の辺、循環あり）</w:t>
+            </w:r>
+          </w:p>
+        </w:tc>
+      </w:tr>
+      <w:tr>
+        <w:tc>
+          <w:tcPr>
+            <w:tcW w:type="dxa" w:w="2880"/>
+          </w:tcPr>
+          <w:p>
+            <w:pPr>
+              <w:jc w:val="left"/>
+            </w:pPr>
+            <w:r/>
+            <w:r>
+              <w:rPr>
+                <w:b w:val="0"/>
+                <w:sz w:val="18"/>
+              </w:rPr>
+              <w:t>**(C)** スペクトル因果性（知識なし）</w:t>
+            </w:r>
+          </w:p>
+        </w:tc>
+        <w:tc>
+          <w:tcPr>
+            <w:tcW w:type="dxa" w:w="2880"/>
+          </w:tcPr>
+          <w:p>
+            <w:pPr>
+              <w:jc w:val="left"/>
+            </w:pPr>
+            <w:r/>
+            <w:r>
+              <w:rPr>
+                <w:b w:val="0"/>
+                <w:sz w:val="18"/>
+              </w:rPr>
+              <w:t>データの相関のみ</w:t>
+            </w:r>
+          </w:p>
+        </w:tc>
+        <w:tc>
+          <w:tcPr>
+            <w:tcW w:type="dxa" w:w="2880"/>
+          </w:tcPr>
+          <w:p>
+            <w:pPr>
+              <w:jc w:val="left"/>
+            </w:pPr>
+            <w:r/>
+            <w:r>
+              <w:rPr>
+                <w:b w:val="0"/>
+                <w:sz w:val="18"/>
+              </w:rPr>
+              <w:t>**辺なし（推定不能）**</w:t>
+            </w:r>
+          </w:p>
+        </w:tc>
+      </w:tr>
+    </w:tbl>
+    <w:p/>
+    <w:p>
+      <w:pPr>
+        <w:pStyle w:val="Heading2"/>
+      </w:pPr>
+      <w:r>
+        <w:t>最大の発見：「情報の方向」と「介入の方向」は逆だった</w:t>
+      </w:r>
+    </w:p>
+    <w:p>
+      <w:r>
+        <w:t>スペクトル因果性（B）はLiNGAMとほぼ</w:t>
+      </w:r>
+      <w:r>
+        <w:rPr>
+          <w:b/>
+        </w:rPr>
+        <w:t>逆方向</w:t>
+      </w:r>
+      <w:r>
+        <w:t>を示しました。これはバグではなく、捉えている「因果」が違うのです：</w:t>
+      </w:r>
+    </w:p>
+    <w:p>
+      <w:pPr>
+        <w:pStyle w:val="ListBullet"/>
+      </w:pPr>
+      <w:r>
+        <w:rPr>
+          <w:b/>
+        </w:rPr>
+        <w:t>LiNGAM</w:t>
+      </w:r>
+      <w:r>
+        <w:t>: 「年齢が上がると心拍数が下がる」（</w:t>
+      </w:r>
+      <w:r>
+        <w:rPr>
+          <w:b/>
+        </w:rPr>
+        <w:t>原因→結果</w:t>
+      </w:r>
+      <w:r>
+        <w:t xml:space="preserve"> の方向）</w:t>
+      </w:r>
+    </w:p>
+    <w:p>
+      <w:pPr>
+        <w:pStyle w:val="ListBullet"/>
+      </w:pPr>
+      <w:r>
+        <w:rPr>
+          <w:b/>
+        </w:rPr>
+        <w:t>スペクトル因果性</w:t>
+      </w:r>
+      <w:r>
+        <w:t>: 「心拍数を見れば年齢が推測できる」（</w:t>
+      </w:r>
+      <w:r>
+        <w:rPr>
+          <w:b/>
+        </w:rPr>
+        <w:t>情報提供→情報受容</w:t>
+      </w:r>
+      <w:r>
+        <w:t xml:space="preserve"> の方向）</w:t>
+      </w:r>
+    </w:p>
+    <w:p>
+      <w:r>
+        <w:rPr>
+          <w:b/>
+        </w:rPr>
+        <w:t>臨床的な意味</w:t>
+      </w:r>
+      <w:r>
+        <w:t>: 医師は患者の最大心拍数を見て「この人は年齢の割に心機能が…」と推論します（情報フロー: 心拍数→年齢推定）。しかし生物学的には加齢が心機能を低下させます（介入因果: 年齢→心拍数）。</w:t>
+      </w:r>
+      <w:r>
+        <w:rPr>
+          <w:b/>
+        </w:rPr>
+        <w:t>この逆転は、Level 1.5（情報的因果）と Level 2（介入的因果）の違いを実データで初めて示した結果</w:t>
+      </w:r>
+      <w:r>
+        <w:t>です。</w:t>
+      </w:r>
+    </w:p>
+    <w:p>
+      <w:pPr>
+        <w:pStyle w:val="Heading2"/>
+      </w:pPr>
+      <w:r>
+        <w:t>知識なし（C）の根本的限界</w:t>
+      </w:r>
+    </w:p>
+    <w:p>
+      <w:r>
+        <w:t>相関は「$X$ と $Y$ の関連の強さ」しか教えてくれず、$X \to Y$ なのか $Y \to X$ なのかは分かりません（相関は対称なので）。これが</w:t>
+      </w:r>
+      <w:r>
+        <w:rPr>
+          <w:b/>
+        </w:rPr>
+        <w:t>α=0で辺が0本になった理由</w:t>
+      </w:r>
+      <w:r>
+        <w:t>です。LiNGAMはデータの「歪み」（非ガウス性）から方向を見つけるため、知識なしでもDAGを推定できます。</w:t>
+      </w:r>
+    </w:p>
+    <w:p>
+      <w:pPr>
+        <w:jc w:val="center"/>
+      </w:pPr>
+      <w:r>
+        <w:drawing>
+          <wp:inline xmlns:a="http://schemas.openxmlformats.org/drawingml/2006/main" xmlns:pic="http://schemas.openxmlformats.org/drawingml/2006/picture">
+            <wp:extent cx="5029200" cy="2187657"/>
+            <wp:docPr id="6" name="Picture 6"/>
+            <wp:cNvGraphicFramePr>
+              <a:graphicFrameLocks noChangeAspect="1"/>
+            </wp:cNvGraphicFramePr>
+            <a:graphic>
+              <a:graphicData uri="http://schemas.openxmlformats.org/drawingml/2006/picture">
+                <pic:pic>
+                  <pic:nvPicPr>
+                    <pic:cNvPr id="0" name="fig7_lingam_vs_spectral.png"/>
+                    <pic:cNvPicPr/>
+                  </pic:nvPicPr>
+                  <pic:blipFill>
+                    <a:blip r:embed="rId14"/>
+                    <a:stretch>
+                      <a:fillRect/>
+                    </a:stretch>
+                  </pic:blipFill>
+                  <pic:spPr>
+                    <a:xfrm>
+                      <a:off x="0" y="0"/>
+                      <a:ext cx="5029200" cy="2187657"/>
+                    </a:xfrm>
+                    <a:prstGeom prst="rect"/>
+                  </pic:spPr>
+                </pic:pic>
+              </a:graphicData>
+            </a:graphic>
+          </wp:inline>
+        </w:drawing>
+      </w:r>
+    </w:p>
+    <w:p>
+      <w:pPr>
+        <w:spacing w:before="120" w:after="240"/>
+        <w:jc w:val="center"/>
+      </w:pPr>
+      <w:r>
+        <w:rPr>
+          <w:i/>
+          <w:sz w:val="18"/>
+        </w:rPr>
+        <w:t>図6: (A) LiNGAM DAG（6本の一方向因果辺）、(B) スペクトル因果性DCG（9本、循環あり）、(C) 知識なしのスペクトル因果性（辺ゼロ）。</w:t>
+      </w:r>
+    </w:p>
+    <w:p>
+      <w:pPr>
+        <w:pStyle w:val="Heading1"/>
+      </w:pPr>
+      <w:r>
+        <w:t>8.6. ドメイン知識の「量」より「質」— DAG転移点</w:t>
+      </w:r>
+    </w:p>
+    <w:p>
+      <w:pPr>
+        <w:pStyle w:val="Heading2"/>
+      </w:pPr>
+      <w:r>
+        <w:t>知識をどれだけ混ぜるか（α）は重要ではない</w:t>
+      </w:r>
+    </w:p>
+    <w:p>
+      <w:r>
+        <w:t>α（知識の混合比率）を 0 → 1 まで変えてみた結果、驚くべきことが分かりました（図7左）：</w:t>
+      </w:r>
+    </w:p>
+    <w:p>
+      <w:pPr>
+        <w:pStyle w:val="ListBullet"/>
+      </w:pPr>
+      <w:r>
+        <w:t>α = 0 → 方向性ゼロ（推定不能）</w:t>
+      </w:r>
+    </w:p>
+    <w:p>
+      <w:pPr>
+        <w:pStyle w:val="ListBullet"/>
+      </w:pPr>
+      <w:r>
+        <w:t xml:space="preserve">α = 0.000001 → </w:t>
+      </w:r>
+      <w:r>
+        <w:rPr>
+          <w:b/>
+        </w:rPr>
+        <w:t>即座に85.9%がDAG的構造に</w:t>
+      </w:r>
+    </w:p>
+    <w:p>
+      <w:pPr>
+        <w:pStyle w:val="ListBullet"/>
+      </w:pPr>
+      <w:r>
+        <w:t>α = 0.5 → 85.9%（変わらない）</w:t>
+      </w:r>
+    </w:p>
+    <w:p>
+      <w:pPr>
+        <w:pStyle w:val="ListBullet"/>
+      </w:pPr>
+      <w:r>
+        <w:t>α = 1.0 → 85.9%（変わらない）</w:t>
+      </w:r>
+    </w:p>
+    <w:p>
+      <w:r>
+        <w:rPr>
+          <w:b/>
+        </w:rPr>
+        <w:t>知識を入れるかゼロかの違いが全て</w:t>
+      </w:r>
+      <w:r>
+        <w:t>。入れる量は問題ではありません。</w:t>
+      </w:r>
+    </w:p>
+    <w:p>
+      <w:pPr>
+        <w:pStyle w:val="Heading2"/>
+      </w:pPr>
+      <w:r>
+        <w:t>知識の「正しさ」こそが命</w:t>
+      </w:r>
+    </w:p>
+    <w:p>
+      <w:r>
+        <w:t>知識の方向を一定の割合でデタラメに反転させた実験（図7D）：</w:t>
+      </w:r>
+    </w:p>
+    <w:p>
+      <w:pPr>
+        <w:pStyle w:val="ListBullet"/>
+      </w:pPr>
+      <w:r>
+        <w:rPr>
+          <w:b/>
+        </w:rPr>
+        <w:t>0%反転（全部正しい）</w:t>
+      </w:r>
+      <w:r>
+        <w:t>: DAG度 86% → 高い</w:t>
+      </w:r>
+    </w:p>
+    <w:p>
+      <w:pPr>
+        <w:pStyle w:val="ListBullet"/>
+      </w:pPr>
+      <w:r>
+        <w:rPr>
+          <w:b/>
+        </w:rPr>
+        <w:t>10%反転</w:t>
+      </w:r>
+      <w:r>
+        <w:t xml:space="preserve">: DAG度 58% → </w:t>
+      </w:r>
+      <w:r>
+        <w:rPr>
+          <w:b/>
+        </w:rPr>
+        <w:t>急落</w:t>
+      </w:r>
+    </w:p>
+    <w:p>
+      <w:pPr>
+        <w:pStyle w:val="ListBullet"/>
+      </w:pPr>
+      <w:r>
+        <w:rPr>
+          <w:b/>
+        </w:rPr>
+        <w:t>30%反転</w:t>
+      </w:r>
+      <w:r>
+        <w:t xml:space="preserve">: DAG度 37% → </w:t>
+      </w:r>
+      <w:r>
+        <w:rPr>
+          <w:b/>
+        </w:rPr>
+        <w:t>最低点</w:t>
+      </w:r>
+    </w:p>
+    <w:p>
+      <w:pPr>
+        <w:pStyle w:val="ListBullet"/>
+      </w:pPr>
+      <w:r>
+        <w:rPr>
+          <w:b/>
+        </w:rPr>
+        <w:t>100%反転（全部逆）</w:t>
+      </w:r>
+      <w:r>
+        <w:t xml:space="preserve">: DAG度 86% → </w:t>
+      </w:r>
+      <w:r>
+        <w:rPr>
+          <w:b/>
+        </w:rPr>
+        <w:t>回復！</w:t>
+      </w:r>
+    </w:p>
+    <w:p>
+      <w:pPr>
+        <w:ind w:left="850"/>
+      </w:pPr>
+      <w:r/>
+      <w:r>
+        <w:rPr>
+          <w:b/>
+        </w:rPr>
+        <w:t>「中途半端な誤りが最も有害」</w:t>
+      </w:r>
+      <w:r>
+        <w:t xml:space="preserve"> — 知識の85%以上が正しければDAGは維持される（$p_{\text{flip}}^* \approx 0.15$）</w:t>
+      </w:r>
+    </w:p>
+    <w:p>
+      <w:r>
+        <w:t>100%反転で回復するのは直感に反しますが、全部逆なら「逆向きに整合的」なDAGになるだけ。本当に有害なのは</w:t>
+      </w:r>
+      <w:r>
+        <w:rPr>
+          <w:b/>
+        </w:rPr>
+        <w:t>一部だけ矛盾</w:t>
+      </w:r>
+      <w:r>
+        <w:t>する情報です。</w:t>
+      </w:r>
+    </w:p>
+    <w:p>
+      <w:pPr>
+        <w:jc w:val="center"/>
+      </w:pPr>
+      <w:r>
+        <w:drawing>
+          <wp:inline xmlns:a="http://schemas.openxmlformats.org/drawingml/2006/main" xmlns:pic="http://schemas.openxmlformats.org/drawingml/2006/picture">
+            <wp:extent cx="5029200" cy="3715183"/>
+            <wp:docPr id="7" name="Picture 7"/>
+            <wp:cNvGraphicFramePr>
+              <a:graphicFrameLocks noChangeAspect="1"/>
+            </wp:cNvGraphicFramePr>
+            <a:graphic>
+              <a:graphicData uri="http://schemas.openxmlformats.org/drawingml/2006/picture">
+                <pic:pic>
+                  <pic:nvPicPr>
+                    <pic:cNvPr id="0" name="fig8_alpha_sweep.png"/>
+                    <pic:cNvPicPr/>
+                  </pic:nvPicPr>
+                  <pic:blipFill>
+                    <a:blip r:embed="rId15"/>
+                    <a:stretch>
+                      <a:fillRect/>
+                    </a:stretch>
+                  </pic:blipFill>
+                  <pic:spPr>
+                    <a:xfrm>
+                      <a:off x="0" y="0"/>
+                      <a:ext cx="5029200" cy="3715183"/>
+                    </a:xfrm>
+                    <a:prstGeom prst="rect"/>
+                  </pic:spPr>
+                </pic:pic>
+              </a:graphicData>
+            </a:graphic>
+          </wp:inline>
+        </w:drawing>
+      </w:r>
+    </w:p>
+    <w:p>
+      <w:pPr>
+        <w:spacing w:before="120" w:after="240"/>
+        <w:jc w:val="center"/>
+      </w:pPr>
+      <w:r>
+        <w:rPr>
+          <w:i/>
+          <w:sz w:val="18"/>
+        </w:rPr>
+        <w:t>図7: (A) α掃引：α=0で不連続にDAG構造が出現。(B) 辺数。(C) 非対称ノルム。(D) 知識品質のU字型カーブ — 部分的誤りが最も有害。</w:t>
+      </w:r>
+    </w:p>
+    <w:p>
+      <w:pPr>
+        <w:pStyle w:val="Heading1"/>
+      </w:pPr>
+      <w:r>
+        <w:t>8.7. 因果上流 ≈ 治療の難しさ</w:t>
+      </w:r>
+    </w:p>
+    <w:p>
+      <w:r>
+        <w:t>LiNGAMで推定された因果順序を「治療しやすさ」と並べると、興味深い対応が見られます：</w:t>
+      </w:r>
+    </w:p>
+    <w:p>
+      <w:pPr>
+        <w:ind w:left="567"/>
+      </w:pPr>
+      <w:r>
+        <w:rPr>
+          <w:rFonts w:ascii="Courier New" w:hAnsi="Courier New"/>
+          <w:sz w:val="18"/>
+        </w:rPr>
+        <w:t>因果的上流 ←─────────────────────────→ 因果的下流</w:t>
+        <w:br/>
+        <w:t>年齢        最大心拍数  ST低下    血圧     コレステロール</w:t>
+        <w:br/>
+        <w:t>（変えられない）                          （薬で変えやすい）</w:t>
+      </w:r>
+    </w:p>
+    <w:tbl>
+      <w:tblPr>
+        <w:tblStyle w:val="TableGrid"/>
+        <w:tblW w:type="auto" w:w="0"/>
+        <w:jc w:val="center"/>
+        <w:tblLook w:firstColumn="1" w:firstRow="1" w:lastColumn="0" w:lastRow="0" w:noHBand="0" w:noVBand="1" w:val="04A0"/>
+      </w:tblPr>
+      <w:tblGrid>
+        <w:gridCol w:w="2880"/>
+        <w:gridCol w:w="2880"/>
+        <w:gridCol w:w="2880"/>
+      </w:tblGrid>
+      <w:tr>
+        <w:tc>
+          <w:tcPr>
+            <w:tcW w:type="dxa" w:w="2880"/>
+          </w:tcPr>
+          <w:p>
+            <w:pPr>
+              <w:jc w:val="left"/>
+            </w:pPr>
+            <w:r/>
+            <w:r>
+              <w:rPr>
+                <w:b/>
+                <w:sz w:val="18"/>
+              </w:rPr>
+              <w:t>変数</w:t>
+            </w:r>
+          </w:p>
+        </w:tc>
+        <w:tc>
+          <w:tcPr>
+            <w:tcW w:type="dxa" w:w="2880"/>
+          </w:tcPr>
+          <w:p>
+            <w:pPr>
+              <w:jc w:val="left"/>
+            </w:pPr>
+            <w:r/>
+            <w:r>
+              <w:rPr>
+                <w:b/>
+                <w:sz w:val="18"/>
+              </w:rPr>
+              <w:t>因果順位</w:t>
+            </w:r>
+          </w:p>
+        </w:tc>
+        <w:tc>
+          <w:tcPr>
+            <w:tcW w:type="dxa" w:w="2880"/>
+          </w:tcPr>
+          <w:p>
+            <w:pPr>
+              <w:jc w:val="left"/>
+            </w:pPr>
+            <w:r/>
+            <w:r>
+              <w:rPr>
+                <w:b/>
+                <w:sz w:val="18"/>
+              </w:rPr>
+              <w:t>治療の容易さ</w:t>
+            </w:r>
+          </w:p>
+        </w:tc>
+      </w:tr>
+      <w:tr>
+        <w:tc>
+          <w:tcPr>
+            <w:tcW w:type="dxa" w:w="2880"/>
+          </w:tcPr>
+          <w:p>
+            <w:pPr>
+              <w:jc w:val="left"/>
+            </w:pPr>
+            <w:r/>
+            <w:r>
+              <w:rPr>
+                <w:b w:val="0"/>
+                <w:sz w:val="18"/>
+              </w:rPr>
+              <w:t>年齢</w:t>
+            </w:r>
+          </w:p>
+        </w:tc>
+        <w:tc>
+          <w:tcPr>
+            <w:tcW w:type="dxa" w:w="2880"/>
+          </w:tcPr>
+          <w:p>
+            <w:pPr>
+              <w:jc w:val="left"/>
+            </w:pPr>
+            <w:r/>
+            <w:r>
+              <w:rPr>
+                <w:b w:val="0"/>
+                <w:sz w:val="18"/>
+              </w:rPr>
+              <w:t>#1（最上流）</w:t>
+            </w:r>
+          </w:p>
+        </w:tc>
+        <w:tc>
+          <w:tcPr>
+            <w:tcW w:type="dxa" w:w="2880"/>
+          </w:tcPr>
+          <w:p>
+            <w:pPr>
+              <w:jc w:val="left"/>
+            </w:pPr>
+            <w:r/>
+            <w:r>
+              <w:rPr>
+                <w:b w:val="0"/>
+                <w:sz w:val="18"/>
+              </w:rPr>
+              <w:t>不可能</w:t>
+            </w:r>
+          </w:p>
+        </w:tc>
+      </w:tr>
+      <w:tr>
+        <w:tc>
+          <w:tcPr>
+            <w:tcW w:type="dxa" w:w="2880"/>
+          </w:tcPr>
+          <w:p>
+            <w:pPr>
+              <w:jc w:val="left"/>
+            </w:pPr>
+            <w:r/>
+            <w:r>
+              <w:rPr>
+                <w:b w:val="0"/>
+                <w:sz w:val="18"/>
+              </w:rPr>
+              <w:t>最大心拍数</w:t>
+            </w:r>
+          </w:p>
+        </w:tc>
+        <w:tc>
+          <w:tcPr>
+            <w:tcW w:type="dxa" w:w="2880"/>
+          </w:tcPr>
+          <w:p>
+            <w:pPr>
+              <w:jc w:val="left"/>
+            </w:pPr>
+            <w:r/>
+            <w:r>
+              <w:rPr>
+                <w:b w:val="0"/>
+                <w:sz w:val="18"/>
+              </w:rPr>
+              <w:t>#2</w:t>
+            </w:r>
+          </w:p>
+        </w:tc>
+        <w:tc>
+          <w:tcPr>
+            <w:tcW w:type="dxa" w:w="2880"/>
+          </w:tcPr>
+          <w:p>
+            <w:pPr>
+              <w:jc w:val="left"/>
+            </w:pPr>
+            <w:r/>
+            <w:r>
+              <w:rPr>
+                <w:b w:val="0"/>
+                <w:sz w:val="18"/>
+              </w:rPr>
+              <w:t>困難（運動療法で部分的に）</w:t>
+            </w:r>
+          </w:p>
+        </w:tc>
+      </w:tr>
+      <w:tr>
+        <w:tc>
+          <w:tcPr>
+            <w:tcW w:type="dxa" w:w="2880"/>
+          </w:tcPr>
+          <w:p>
+            <w:pPr>
+              <w:jc w:val="left"/>
+            </w:pPr>
+            <w:r/>
+            <w:r>
+              <w:rPr>
+                <w:b w:val="0"/>
+                <w:sz w:val="18"/>
+              </w:rPr>
+              <w:t>ST低下</w:t>
+            </w:r>
+          </w:p>
+        </w:tc>
+        <w:tc>
+          <w:tcPr>
+            <w:tcW w:type="dxa" w:w="2880"/>
+          </w:tcPr>
+          <w:p>
+            <w:pPr>
+              <w:jc w:val="left"/>
+            </w:pPr>
+            <w:r/>
+            <w:r>
+              <w:rPr>
+                <w:b w:val="0"/>
+                <w:sz w:val="18"/>
+              </w:rPr>
+              <w:t>#3</w:t>
+            </w:r>
+          </w:p>
+        </w:tc>
+        <w:tc>
+          <w:tcPr>
+            <w:tcW w:type="dxa" w:w="2880"/>
+          </w:tcPr>
+          <w:p>
+            <w:pPr>
+              <w:jc w:val="left"/>
+            </w:pPr>
+            <w:r/>
+            <w:r>
+              <w:rPr>
+                <w:b w:val="0"/>
+                <w:sz w:val="18"/>
+              </w:rPr>
+              <w:t>間接的に可能（心臓手術、薬）</w:t>
+            </w:r>
+          </w:p>
+        </w:tc>
+      </w:tr>
+      <w:tr>
+        <w:tc>
+          <w:tcPr>
+            <w:tcW w:type="dxa" w:w="2880"/>
+          </w:tcPr>
+          <w:p>
+            <w:pPr>
+              <w:jc w:val="left"/>
+            </w:pPr>
+            <w:r/>
+            <w:r>
+              <w:rPr>
+                <w:b w:val="0"/>
+                <w:sz w:val="18"/>
+              </w:rPr>
+              <w:t>安静時血圧</w:t>
+            </w:r>
+          </w:p>
+        </w:tc>
+        <w:tc>
+          <w:tcPr>
+            <w:tcW w:type="dxa" w:w="2880"/>
+          </w:tcPr>
+          <w:p>
+            <w:pPr>
+              <w:jc w:val="left"/>
+            </w:pPr>
+            <w:r/>
+            <w:r>
+              <w:rPr>
+                <w:b w:val="0"/>
+                <w:sz w:val="18"/>
+              </w:rPr>
+              <w:t>#4</w:t>
+            </w:r>
+          </w:p>
+        </w:tc>
+        <w:tc>
+          <w:tcPr>
+            <w:tcW w:type="dxa" w:w="2880"/>
+          </w:tcPr>
+          <w:p>
+            <w:pPr>
+              <w:jc w:val="left"/>
+            </w:pPr>
+            <w:r/>
+            <w:r>
+              <w:rPr>
+                <w:b w:val="0"/>
+                <w:sz w:val="18"/>
+              </w:rPr>
+              <w:t>容易（降圧薬）</w:t>
+            </w:r>
+          </w:p>
+        </w:tc>
+      </w:tr>
+      <w:tr>
+        <w:tc>
+          <w:tcPr>
+            <w:tcW w:type="dxa" w:w="2880"/>
+          </w:tcPr>
+          <w:p>
+            <w:pPr>
+              <w:jc w:val="left"/>
+            </w:pPr>
+            <w:r/>
+            <w:r>
+              <w:rPr>
+                <w:b w:val="0"/>
+                <w:sz w:val="18"/>
+              </w:rPr>
+              <w:t>コレステロール</w:t>
+            </w:r>
+          </w:p>
+        </w:tc>
+        <w:tc>
+          <w:tcPr>
+            <w:tcW w:type="dxa" w:w="2880"/>
+          </w:tcPr>
+          <w:p>
+            <w:pPr>
+              <w:jc w:val="left"/>
+            </w:pPr>
+            <w:r/>
+            <w:r>
+              <w:rPr>
+                <w:b w:val="0"/>
+                <w:sz w:val="18"/>
+              </w:rPr>
+              <w:t>#5（最下流）</w:t>
+            </w:r>
+          </w:p>
+        </w:tc>
+        <w:tc>
+          <w:tcPr>
+            <w:tcW w:type="dxa" w:w="2880"/>
+          </w:tcPr>
+          <w:p>
+            <w:pPr>
+              <w:jc w:val="left"/>
+            </w:pPr>
+            <w:r/>
+            <w:r>
+              <w:rPr>
+                <w:b w:val="0"/>
+                <w:sz w:val="18"/>
+              </w:rPr>
+              <w:t>容易（スタチン）</w:t>
+            </w:r>
+          </w:p>
+        </w:tc>
+      </w:tr>
+    </w:tbl>
+    <w:p/>
+    <w:p>
+      <w:r>
+        <w:rPr>
+          <w:b/>
+        </w:rPr>
+        <w:t>なぜこうなるか？</w:t>
+      </w:r>
+      <w:r>
+        <w:t>: 「治療できない変数」は他の変数に一方的に影響を与えるため、自然と因果の上流（根っこ）に来ます。逆に「薬で変えやすい変数」は多くの経路から影響を受ける下流に位置します。</w:t>
+      </w:r>
+    </w:p>
+    <w:p>
+      <w:r>
+        <w:rPr>
+          <w:b/>
+        </w:rPr>
+        <w:t>実用的な含意</w:t>
+      </w:r>
+      <w:r>
+        <w:t>: Hodge分解の因果ポテンシャルφが低い（下流の）変数は、</w:t>
+      </w:r>
+      <w:r>
+        <w:rPr>
+          <w:b/>
+        </w:rPr>
+        <w:t>治療ターゲットの候補</w:t>
+      </w:r>
+      <w:r>
+        <w:t>として自動抽出できる可能性があります。</w:t>
+      </w:r>
+    </w:p>
+    <w:p>
+      <w:pPr>
+        <w:pStyle w:val="Heading1"/>
+      </w:pPr>
+      <w:r>
+        <w:t>8.8. フィードバック（循環）をどう扱うか — 実運用への道筋</w:t>
+      </w:r>
+    </w:p>
+    <w:p>
+      <w:pPr>
+        <w:pStyle w:val="Heading2"/>
+      </w:pPr>
+      <w:r>
+        <w:t>臨床的にはフィードバックが正しい</w:t>
+      </w:r>
+    </w:p>
+    <w:p>
+      <w:r>
+        <w:t>DAG（一方向因果）は数学的に便利ですが、臨床的には循環が当たり前です：</w:t>
+      </w:r>
+    </w:p>
+    <w:p>
+      <w:pPr>
+        <w:pStyle w:val="ListBullet"/>
+      </w:pPr>
+      <w:r>
+        <w:t>運動耐容能低下 → 虚血悪化 → さらに運動能力低下 → …（フィードバックループ）</w:t>
+      </w:r>
+    </w:p>
+    <w:p>
+      <w:pPr>
+        <w:pStyle w:val="ListBullet"/>
+      </w:pPr>
+      <w:r>
+        <w:t>高血圧 → 心筋肥大 → 虚血 → 交感神経活性化 → さらに高血圧 → …</w:t>
+      </w:r>
+    </w:p>
+    <w:p>
+      <w:pPr>
+        <w:pStyle w:val="Heading2"/>
+      </w:pPr>
+      <w:r>
+        <w:t>辺ごとの「フィードバック率」で分類（図8C）</w:t>
+      </w:r>
+    </w:p>
+    <w:p>
+      <w:r>
+        <w:t>ECDアンサンブル（LiNGAMの結果をスペクトル因果性に注入）では、辺ごとに「一方向因果」か「フィードバック」かを数値化できます：</w:t>
+      </w:r>
+    </w:p>
+    <w:p>
+      <w:pPr>
+        <w:pStyle w:val="ListBullet"/>
+      </w:pPr>
+      <w:r>
+        <w:rPr>
+          <w:b/>
+        </w:rPr>
+        <w:t>Age → RestBP</w:t>
+      </w:r>
+      <w:r>
+        <w:t>: フィードバック率 0% → 純粋な一方向因果</w:t>
+      </w:r>
+    </w:p>
+    <w:p>
+      <w:pPr>
+        <w:pStyle w:val="ListBullet"/>
+      </w:pPr>
+      <w:r>
+        <w:rPr>
+          <w:b/>
+        </w:rPr>
+        <w:t>RestBP ↔ STDep</w:t>
+      </w:r>
+      <w:r>
+        <w:t>: フィードバック率 24% → 弱い循環</w:t>
+      </w:r>
+    </w:p>
+    <w:p>
+      <w:pPr>
+        <w:pStyle w:val="ListBullet"/>
+      </w:pPr>
+      <w:r>
+        <w:rPr>
+          <w:b/>
+        </w:rPr>
+        <w:t>MaxHR ↔ STDep</w:t>
+      </w:r>
+      <w:r>
+        <w:t xml:space="preserve">: フィードバック率 </w:t>
+      </w:r>
+      <w:r>
+        <w:rPr>
+          <w:b/>
+        </w:rPr>
+        <w:t>73%</w:t>
+      </w:r>
+      <w:r>
+        <w:t xml:space="preserve"> → </w:t>
+      </w:r>
+      <w:r>
+        <w:rPr>
+          <w:b/>
+        </w:rPr>
+        <w:t>強いフィードバックループ</w:t>
+      </w:r>
+    </w:p>
+    <w:p>
+      <w:pPr>
+        <w:pStyle w:val="Heading2"/>
+      </w:pPr>
+      <w:r>
+        <w:t>実運用の推奨フロー</w:t>
+      </w:r>
+    </w:p>
+    <w:p>
+      <w:pPr>
+        <w:ind w:left="567"/>
+      </w:pPr>
+      <w:r>
+        <w:rPr>
+          <w:rFonts w:ascii="Courier New" w:hAnsi="Courier New"/>
+          <w:sz w:val="18"/>
+        </w:rPr>
+        <w:t>Step 1: LiNGAMでまず因果DAGを推定（知識不要）</w:t>
+        <w:br/>
+        <w:t xml:space="preserve">         ↓</w:t>
+        <w:br/>
+        <w:t>Step 2: 確信度の高い辺だけ残す（ブートストラップで安定性チェック）</w:t>
+        <w:br/>
+        <w:t xml:space="preserve">         ↓</w:t>
+        <w:br/>
+        <w:t>Step 3: 残った辺を「知識」としてスペクトル因果性に投入（α=0.01で十分）</w:t>
+        <w:br/>
+        <w:t xml:space="preserve">         ↓</w:t>
+        <w:br/>
+        <w:t>Step 4: Hodge分解で：</w:t>
+        <w:br/>
+        <w:t xml:space="preserve">        ├── 一方向因果（勾配成分）を確認</w:t>
+        <w:br/>
+        <w:t xml:space="preserve">        ├── フィードバック（カール成分）を定量化</w:t>
+        <w:br/>
+        <w:t xml:space="preserve">        └── 辺ごとの循環度で DAG/DCG を使い分け</w:t>
+      </w:r>
+    </w:p>
+    <w:p>
+      <w:pPr>
+        <w:jc w:val="center"/>
+      </w:pPr>
+      <w:r>
+        <w:drawing>
+          <wp:inline xmlns:a="http://schemas.openxmlformats.org/drawingml/2006/main" xmlns:pic="http://schemas.openxmlformats.org/drawingml/2006/picture">
+            <wp:extent cx="5029200" cy="4481653"/>
+            <wp:docPr id="8" name="Picture 8"/>
+            <wp:cNvGraphicFramePr>
+              <a:graphicFrameLocks noChangeAspect="1"/>
+            </wp:cNvGraphicFramePr>
+            <a:graphic>
+              <a:graphicData uri="http://schemas.openxmlformats.org/drawingml/2006/picture">
+                <pic:pic>
+                  <pic:nvPicPr>
+                    <pic:cNvPr id="0" name="fig9_ecd_pruning_analysis.png"/>
+                    <pic:cNvPicPr/>
+                  </pic:nvPicPr>
+                  <pic:blipFill>
+                    <a:blip r:embed="rId16"/>
+                    <a:stretch>
+                      <a:fillRect/>
+                    </a:stretch>
+                  </pic:blipFill>
+                  <pic:spPr>
+                    <a:xfrm>
+                      <a:off x="0" y="0"/>
+                      <a:ext cx="5029200" cy="4481653"/>
+                    </a:xfrm>
+                    <a:prstGeom prst="rect"/>
+                  </pic:spPr>
+                </pic:pic>
+              </a:graphicData>
+            </a:graphic>
+          </wp:inline>
+        </w:drawing>
+      </w:r>
+    </w:p>
+    <w:p>
+      <w:pPr>
+        <w:spacing w:before="120" w:after="240"/>
+        <w:jc w:val="center"/>
+      </w:pPr>
+      <w:r>
+        <w:rPr>
+          <w:i/>
+          <w:sz w:val="18"/>
+        </w:rPr>
+        <w:t>図8: (A) Hodge分解（勾配 vs カール）。(B) 因果ポテンシャルφ と治療のしやすさの対応。(C) 辺ごとのフィードバック率。(D) 知識品質のU字型カーブ。</w:t>
+      </w:r>
+    </w:p>
+    <w:p>
+      <w:pPr>
+        <w:pStyle w:val="Heading1"/>
+      </w:pPr>
+      <w:r>
         <w:t>9. まとめ: スペクトル因果性は何が新しいか</w:t>
       </w:r>
     </w:p>
@@ -3298,6 +4556,44 @@
                 <w:b w:val="0"/>
                 <w:sz w:val="18"/>
               </w:rPr>
+              <w:t>**DCG**</w:t>
+            </w:r>
+          </w:p>
+        </w:tc>
+        <w:tc>
+          <w:tcPr>
+            <w:tcW w:type="dxa" w:w="4320"/>
+          </w:tcPr>
+          <w:p>
+            <w:pPr>
+              <w:jc w:val="left"/>
+            </w:pPr>
+            <w:r/>
+            <w:r>
+              <w:rPr>
+                <w:b w:val="0"/>
+                <w:sz w:val="18"/>
+              </w:rPr>
+              <w:t>Directed Cyclic Graph（有向循環グラフ）。フィードバックループを含む因果構造</w:t>
+            </w:r>
+          </w:p>
+        </w:tc>
+      </w:tr>
+      <w:tr>
+        <w:tc>
+          <w:tcPr>
+            <w:tcW w:type="dxa" w:w="4320"/>
+          </w:tcPr>
+          <w:p>
+            <w:pPr>
+              <w:jc w:val="left"/>
+            </w:pPr>
+            <w:r/>
+            <w:r>
+              <w:rPr>
+                <w:b w:val="0"/>
+                <w:sz w:val="18"/>
+              </w:rPr>
               <w:t>**Hill の9基準**</w:t>
             </w:r>
           </w:p>
@@ -3317,6 +4613,158 @@
                 <w:sz w:val="18"/>
               </w:rPr>
               <w:t>1965年にBradford Hillが提唱した、関連が因果であるかを判断するための9つの観点</w:t>
+            </w:r>
+          </w:p>
+        </w:tc>
+      </w:tr>
+      <w:tr>
+        <w:tc>
+          <w:tcPr>
+            <w:tcW w:type="dxa" w:w="4320"/>
+          </w:tcPr>
+          <w:p>
+            <w:pPr>
+              <w:jc w:val="left"/>
+            </w:pPr>
+            <w:r/>
+            <w:r>
+              <w:rPr>
+                <w:b w:val="0"/>
+                <w:sz w:val="18"/>
+              </w:rPr>
+              <w:t>**α（アルファ）**</w:t>
+            </w:r>
+          </w:p>
+        </w:tc>
+        <w:tc>
+          <w:tcPr>
+            <w:tcW w:type="dxa" w:w="4320"/>
+          </w:tcPr>
+          <w:p>
+            <w:pPr>
+              <w:jc w:val="left"/>
+            </w:pPr>
+            <w:r/>
+            <w:r>
+              <w:rPr>
+                <w:b w:val="0"/>
+                <w:sz w:val="18"/>
+              </w:rPr>
+              <w:t>ドメイン知識とデータ駆動の混合比率。0=データのみ、1=知識のみ</w:t>
+            </w:r>
+          </w:p>
+        </w:tc>
+      </w:tr>
+      <w:tr>
+        <w:tc>
+          <w:tcPr>
+            <w:tcW w:type="dxa" w:w="4320"/>
+          </w:tcPr>
+          <w:p>
+            <w:pPr>
+              <w:jc w:val="left"/>
+            </w:pPr>
+            <w:r/>
+            <w:r>
+              <w:rPr>
+                <w:b w:val="0"/>
+                <w:sz w:val="18"/>
+              </w:rPr>
+              <w:t>**$p_{\text{flip}}$**</w:t>
+            </w:r>
+          </w:p>
+        </w:tc>
+        <w:tc>
+          <w:tcPr>
+            <w:tcW w:type="dxa" w:w="4320"/>
+          </w:tcPr>
+          <w:p>
+            <w:pPr>
+              <w:jc w:val="left"/>
+            </w:pPr>
+            <w:r/>
+            <w:r>
+              <w:rPr>
+                <w:b w:val="0"/>
+                <w:sz w:val="18"/>
+              </w:rPr>
+              <w:t>ドメイン知識の辺方向の誤り率。0.15以下（85%以上正しい）でDAG構造が維持される</w:t>
+            </w:r>
+          </w:p>
+        </w:tc>
+      </w:tr>
+      <w:tr>
+        <w:tc>
+          <w:tcPr>
+            <w:tcW w:type="dxa" w:w="4320"/>
+          </w:tcPr>
+          <w:p>
+            <w:pPr>
+              <w:jc w:val="left"/>
+            </w:pPr>
+            <w:r/>
+            <w:r>
+              <w:rPr>
+                <w:b w:val="0"/>
+                <w:sz w:val="18"/>
+              </w:rPr>
+              <w:t>**フィードバック率**</w:t>
+            </w:r>
+          </w:p>
+        </w:tc>
+        <w:tc>
+          <w:tcPr>
+            <w:tcW w:type="dxa" w:w="4320"/>
+          </w:tcPr>
+          <w:p>
+            <w:pPr>
+              <w:jc w:val="left"/>
+            </w:pPr>
+            <w:r/>
+            <w:r>
+              <w:rPr>
+                <w:b w:val="0"/>
+                <w:sz w:val="18"/>
+              </w:rPr>
+              <w:t>各辺の循環成分の割合。高いほどフィードバックループの存在を示唆</w:t>
+            </w:r>
+          </w:p>
+        </w:tc>
+      </w:tr>
+      <w:tr>
+        <w:tc>
+          <w:tcPr>
+            <w:tcW w:type="dxa" w:w="4320"/>
+          </w:tcPr>
+          <w:p>
+            <w:pPr>
+              <w:jc w:val="left"/>
+            </w:pPr>
+            <w:r/>
+            <w:r>
+              <w:rPr>
+                <w:b w:val="0"/>
+                <w:sz w:val="18"/>
+              </w:rPr>
+              <w:t>**因果上流性**</w:t>
+            </w:r>
+          </w:p>
+        </w:tc>
+        <w:tc>
+          <w:tcPr>
+            <w:tcW w:type="dxa" w:w="4320"/>
+          </w:tcPr>
+          <w:p>
+            <w:pPr>
+              <w:jc w:val="left"/>
+            </w:pPr>
+            <w:r/>
+            <w:r>
+              <w:rPr>
+                <w:b w:val="0"/>
+                <w:sz w:val="18"/>
+              </w:rPr>
+              <w:t>因果ポテンシャルφが高い変数の性質。介入不可能性と対応する傾向がある</w:t>
             </w:r>
           </w:p>
         </w:tc>

</xml_diff>

<commit_message>
Add LaTeX math rendering to docx generation
Convert $...$ and $$...$$ LaTeX notation to human-readable format:
- Greek letters → Unicode (α, β, φ, ψ, ω, etc.)
- Subscripts/superscripts → Word-native formatting
- Operators → Unicode symbols (≈, →, ∇, ∈, etc.)
- \mathcal, \mathbb → calligraphic/blackboard Unicode
- \frac{a}{b} → a/b, \sqrt{x} → √(x)
- Three-level parser handles nested **$math$** correctly
- Cambria Math font for all math runs
- All three docx files regenerated with 0 remaining $ signs

Co-Authored-By: Tatsuki Onishi <bougtoir@gmail.com>
</commit_message>
<xml_diff>
--- a/spectral-causality-brainstorm/05_spectral_causality_explainer.docx
+++ b/spectral-causality-brainstorm/05_spectral_causality_explainer.docx
@@ -16,11 +16,17 @@
         <w:pStyle w:val="Heading1"/>
       </w:pPr>
       <w:r>
+        <w:rPr>
+          <w:b w:val="0"/>
+        </w:rPr>
         <w:t>この文書の目的</w:t>
       </w:r>
     </w:p>
     <w:p>
       <w:r>
+        <w:rPr>
+          <w:b w:val="0"/>
+        </w:rPr>
         <w:t>「因果推論」と聞くと、統計学や疫学の専門用語が飛び交い、敷居が高く感じるかもしれません。本稿では、</w:t>
       </w:r>
       <w:r>
@@ -30,11 +36,17 @@
         <w:t>音楽のたとえ</w:t>
       </w:r>
       <w:r>
+        <w:rPr>
+          <w:b w:val="0"/>
+        </w:rPr>
         <w:t>を使いながら、「スペクトル因果性」という新しいアプローチを、専門外の方にも伝わるように解説します。</w:t>
       </w:r>
     </w:p>
     <w:p>
       <w:r>
+        <w:rPr>
+          <w:b w:val="0"/>
+        </w:rPr>
         <w:t>さらに、</w:t>
       </w:r>
       <w:r>
@@ -44,6 +56,9 @@
         <w:t>実際の心疾患データ（UCI Heart Disease Dataset, 297名）</w:t>
       </w:r>
       <w:r>
+        <w:rPr>
+          <w:b w:val="0"/>
+        </w:rPr>
         <w:t xml:space="preserve"> を用いた解析結果を示し、既存手法（LiNGAM）との比較も行います。</w:t>
       </w:r>
     </w:p>
@@ -52,11 +67,17 @@
         <w:pStyle w:val="Heading1"/>
       </w:pPr>
       <w:r>
+        <w:rPr>
+          <w:b w:val="0"/>
+        </w:rPr>
         <w:t>1. そもそも「因果関係」とは何か？ — 3つのレベル</w:t>
       </w:r>
     </w:p>
     <w:p>
       <w:r>
+        <w:rPr>
+          <w:b w:val="0"/>
+        </w:rPr>
         <w:t>まず、「因果関係」には</w:t>
       </w:r>
       <w:r>
@@ -66,6 +87,9 @@
         <w:t>深さのレベル</w:t>
       </w:r>
       <w:r>
+        <w:rPr>
+          <w:b w:val="0"/>
+        </w:rPr>
         <w:t>があります。Judea Pearlが提唱した「因果の梯子（Ladder of Causation）」で整理すると（図6参照）:</w:t>
       </w:r>
     </w:p>
@@ -114,16 +138,25 @@
         <w:pStyle w:val="Heading2"/>
       </w:pPr>
       <w:r>
+        <w:rPr>
+          <w:b w:val="0"/>
+        </w:rPr>
         <w:t>「情報的因果」とは？</w:t>
       </w:r>
     </w:p>
     <w:p>
       <w:r>
+        <w:rPr>
+          <w:b w:val="0"/>
+        </w:rPr>
         <w:t>臨床医が日常的に行っている推論に最も近い概念です。</w:t>
       </w:r>
     </w:p>
     <w:p>
       <w:r>
+        <w:rPr>
+          <w:b w:val="0"/>
+        </w:rPr>
         <w:t>例えば、医師が「HbA1c が高い患者は、腎機能の低下（eGFR低下）に注意すべき」と考えるとき、これは：</w:t>
       </w:r>
     </w:p>
@@ -132,6 +165,9 @@
         <w:pStyle w:val="ListBullet"/>
       </w:pPr>
       <w:r>
+        <w:rPr>
+          <w:b w:val="0"/>
+        </w:rPr>
         <w:t>Level 2（介入）ではない — HbA1c を下げれば腎機能が良くなるとは限らない（交絡があるかもしれない）</w:t>
       </w:r>
     </w:p>
@@ -140,6 +176,9 @@
         <w:pStyle w:val="ListBullet"/>
       </w:pPr>
       <w:r>
+        <w:rPr>
+          <w:b w:val="0"/>
+        </w:rPr>
         <w:t>Level 1（関連）よりは深い — 単に相関があるだけでなく、</w:t>
       </w:r>
       <w:r>
@@ -149,11 +188,17 @@
         <w:t>病態生理学的な理由</w:t>
       </w:r>
       <w:r>
+        <w:rPr>
+          <w:b w:val="0"/>
+        </w:rPr>
         <w:t>がある</w:t>
       </w:r>
     </w:p>
     <w:p>
       <w:r>
+        <w:rPr>
+          <w:b w:val="0"/>
+        </w:rPr>
         <w:t xml:space="preserve">この「知れば何が分かるか」という関係が </w:t>
       </w:r>
       <w:r>
@@ -163,6 +208,9 @@
         <w:t>Level 1.5: 情報的因果</w:t>
       </w:r>
       <w:r>
+        <w:rPr>
+          <w:b w:val="0"/>
+        </w:rPr>
         <w:t xml:space="preserve"> です。</w:t>
       </w:r>
     </w:p>
@@ -171,6 +219,9 @@
         <w:pStyle w:val="Heading1"/>
       </w:pPr>
       <w:r>
+        <w:rPr>
+          <w:b w:val="0"/>
+        </w:rPr>
         <w:t>2. 「音」のたとえ — なぜ「スペクトル」なのか</w:t>
       </w:r>
     </w:p>
@@ -179,11 +230,17 @@
         <w:pStyle w:val="Heading2"/>
       </w:pPr>
       <w:r>
+        <w:rPr>
+          <w:b w:val="0"/>
+        </w:rPr>
         <w:t>音の三要素とデータの三要素</w:t>
       </w:r>
     </w:p>
     <w:p>
       <w:r>
+        <w:rPr>
+          <w:b w:val="0"/>
+        </w:rPr>
         <w:t>音楽を聞くとき、私たちは</w:t>
       </w:r>
       <w:r>
@@ -193,6 +250,9 @@
         <w:t>個々の音波</w:t>
       </w:r>
       <w:r>
+        <w:rPr>
+          <w:b w:val="0"/>
+        </w:rPr>
         <w:t>を聞いているのではなく、</w:t>
       </w:r>
       <w:r>
@@ -202,6 +262,9 @@
         <w:t>和音（コード）やメロディ</w:t>
       </w:r>
       <w:r>
+        <w:rPr>
+          <w:b w:val="0"/>
+        </w:rPr>
         <w:t>を聞いています。</w:t>
       </w:r>
     </w:p>
@@ -416,6 +479,9 @@
         <w:t>スペクトル分解</w:t>
       </w:r>
       <w:r>
+        <w:rPr>
+          <w:b w:val="0"/>
+        </w:rPr>
         <w:t xml:space="preserve"> = 複雑な波形を基本周波数に分解すること。音の世界のフーリエ変換を、</w:t>
       </w:r>
       <w:r>
@@ -425,6 +491,9 @@
         <w:t>データのネットワーク</w:t>
       </w:r>
       <w:r>
+        <w:rPr>
+          <w:b w:val="0"/>
+        </w:rPr>
         <w:t>に適用するのが「スペクトル因果性」の核心です。</w:t>
       </w:r>
     </w:p>
@@ -433,11 +502,17 @@
         <w:pStyle w:val="Heading2"/>
       </w:pPr>
       <w:r>
+        <w:rPr>
+          <w:b w:val="0"/>
+        </w:rPr>
         <w:t>なぜこれが因果関係と関係するのか？</w:t>
       </w:r>
     </w:p>
     <w:p>
       <w:r>
+        <w:rPr>
+          <w:b w:val="0"/>
+        </w:rPr>
         <w:t>ギターの弦を弾くと、振動は</w:t>
       </w:r>
       <w:r>
@@ -447,11 +522,17 @@
         <w:t>一方向に</w:t>
       </w:r>
       <w:r>
+        <w:rPr>
+          <w:b w:val="0"/>
+        </w:rPr>
         <w:t>伝わります。低い弦（太い弦）から高い弦に振動が伝わることはあっても、逆は起きにくい。</w:t>
       </w:r>
     </w:p>
     <w:p>
       <w:r>
+        <w:rPr>
+          <w:b w:val="0"/>
+        </w:rPr>
         <w:t>同じように、医療データの検査値の間にも「影響の流れ」があります：</w:t>
       </w:r>
     </w:p>
@@ -466,6 +547,9 @@
         <w:t>年齢</w:t>
       </w:r>
       <w:r>
+        <w:rPr>
+          <w:b w:val="0"/>
+        </w:rPr>
         <w:t xml:space="preserve"> → 血圧（年齢が上がると血圧も上がる傾向）</w:t>
       </w:r>
     </w:p>
@@ -480,11 +564,17 @@
         <w:t>血圧</w:t>
       </w:r>
       <w:r>
+        <w:rPr>
+          <w:b w:val="0"/>
+        </w:rPr>
         <w:t xml:space="preserve"> → ST低下（血圧が心臓に負荷をかけ、心電図変化を引き起こす）</w:t>
       </w:r>
     </w:p>
     <w:p>
       <w:r>
+        <w:rPr>
+          <w:b w:val="0"/>
+        </w:rPr>
         <w:t>この「流れの方向」を、ネットワークのスペクトル（固有値・固有ベクトル）から読み取ろうというのが</w:t>
       </w:r>
       <w:r>
@@ -494,6 +584,9 @@
         <w:t>スペクトル因果性</w:t>
       </w:r>
       <w:r>
+        <w:rPr>
+          <w:b w:val="0"/>
+        </w:rPr>
         <w:t>です。</w:t>
       </w:r>
     </w:p>
@@ -502,11 +595,17 @@
         <w:pStyle w:val="Heading1"/>
       </w:pPr>
       <w:r>
+        <w:rPr>
+          <w:b w:val="0"/>
+        </w:rPr>
         <w:t>3. 3つのアプローチ — 実データで比較</w:t>
       </w:r>
     </w:p>
     <w:p>
       <w:r>
+        <w:rPr>
+          <w:b w:val="0"/>
+        </w:rPr>
         <w:t>UCI Heart Disease Dataset（クリーブランド心疾患データ、297名）の5つの臨床変数を使って、3つのアプローチを比較しました。</w:t>
       </w:r>
     </w:p>
@@ -518,6 +617,9 @@
         <w:t>使用した変数</w:t>
       </w:r>
       <w:r>
+        <w:rPr>
+          <w:b w:val="0"/>
+        </w:rPr>
         <w:t>:</w:t>
       </w:r>
     </w:p>
@@ -526,6 +628,9 @@
         <w:pStyle w:val="ListBullet"/>
       </w:pPr>
       <w:r>
+        <w:rPr>
+          <w:b w:val="0"/>
+        </w:rPr>
         <w:t>年齢（Age）</w:t>
       </w:r>
     </w:p>
@@ -534,6 +639,9 @@
         <w:pStyle w:val="ListBullet"/>
       </w:pPr>
       <w:r>
+        <w:rPr>
+          <w:b w:val="0"/>
+        </w:rPr>
         <w:t>安静時血圧（Resting BP）</w:t>
       </w:r>
     </w:p>
@@ -542,6 +650,9 @@
         <w:pStyle w:val="ListBullet"/>
       </w:pPr>
       <w:r>
+        <w:rPr>
+          <w:b w:val="0"/>
+        </w:rPr>
         <w:t>コレステロール（Cholesterol）</w:t>
       </w:r>
     </w:p>
@@ -550,6 +661,9 @@
         <w:pStyle w:val="ListBullet"/>
       </w:pPr>
       <w:r>
+        <w:rPr>
+          <w:b w:val="0"/>
+        </w:rPr>
         <w:t>最大心拍数（Max Heart Rate）</w:t>
       </w:r>
     </w:p>
@@ -558,6 +672,9 @@
         <w:pStyle w:val="ListBullet"/>
       </w:pPr>
       <w:r>
+        <w:rPr>
+          <w:b w:val="0"/>
+        </w:rPr>
         <w:t>ST低下（ST Depression）— 心電図で心筋虚血を示す指標</w:t>
       </w:r>
     </w:p>
@@ -566,11 +683,17 @@
         <w:pStyle w:val="Heading2"/>
       </w:pPr>
       <w:r>
+        <w:rPr>
+          <w:b w:val="0"/>
+        </w:rPr>
         <w:t>(A) 従来のアプローチ: バラバラの変数</w:t>
       </w:r>
     </w:p>
     <w:p>
       <w:r>
+        <w:rPr>
+          <w:b w:val="0"/>
+        </w:rPr>
         <w:t>変数を個々に見るだけでは、変数間の関係は見えません。「血圧が高い人はコレステロールも高い</w:t>
       </w:r>
       <w:r>
@@ -580,6 +703,9 @@
         <w:t>傾向がある</w:t>
       </w:r>
       <w:r>
+        <w:rPr>
+          <w:b w:val="0"/>
+        </w:rPr>
         <w:t>」程度のことしか分かりません（図1A）。</w:t>
       </w:r>
     </w:p>
@@ -588,11 +714,17 @@
         <w:pStyle w:val="Heading2"/>
       </w:pPr>
       <w:r>
+        <w:rPr>
+          <w:b w:val="0"/>
+        </w:rPr>
         <w:t>(B) LiNGAM: 変数レベルの因果DAG</w:t>
       </w:r>
     </w:p>
     <w:p>
       <w:r>
+        <w:rPr>
+          <w:b w:val="0"/>
+        </w:rPr>
         <w:t>LiNGAM（Linear Non-Gaussian Acyclic Model）は、データの</w:t>
       </w:r>
       <w:r>
@@ -602,11 +734,17 @@
         <w:t>非ガウス性</w:t>
       </w:r>
       <w:r>
+        <w:rPr>
+          <w:b w:val="0"/>
+        </w:rPr>
         <w:t>（分布の歪み）を利用して因果の方向を推定します。</w:t>
       </w:r>
     </w:p>
     <w:p>
       <w:r>
+        <w:rPr>
+          <w:b w:val="0"/>
+        </w:rPr>
         <w:t>実際の解析結果:</w:t>
       </w:r>
     </w:p>
@@ -630,6 +768,9 @@
     </w:p>
     <w:p>
       <w:r>
+        <w:rPr>
+          <w:b w:val="0"/>
+        </w:rPr>
         <w:t>これは変数レベルの「XがYの原因」を明確に示します（図1B）。</w:t>
       </w:r>
       <w:r>
@@ -639,6 +780,9 @@
         <w:t>しかし</w:t>
       </w:r>
       <w:r>
+        <w:rPr>
+          <w:b w:val="0"/>
+        </w:rPr>
         <w:t>、この結果は「なぜそうなるのか」（メカニズム）については何も教えてくれません。</w:t>
       </w:r>
     </w:p>
@@ -647,11 +791,17 @@
         <w:pStyle w:val="Heading2"/>
       </w:pPr>
       <w:r>
+        <w:rPr>
+          <w:b w:val="0"/>
+        </w:rPr>
         <w:t>(C) スペクトル因果性: テーマレベルの因果フロー</w:t>
       </w:r>
     </w:p>
     <w:p>
       <w:r>
+        <w:rPr>
+          <w:b w:val="0"/>
+        </w:rPr>
         <w:t>スペクトル因果性では、まず変数を「</w:t>
       </w:r>
       <w:r>
@@ -661,11 +811,17 @@
         <w:t>臨床的に何に役立つか</w:t>
       </w:r>
       <w:r>
+        <w:rPr>
+          <w:b w:val="0"/>
+        </w:rPr>
         <w:t>」で結びつけます。</w:t>
       </w:r>
     </w:p>
     <w:p>
       <w:r>
+        <w:rPr>
+          <w:b w:val="0"/>
+        </w:rPr>
         <w:t>例えば:</w:t>
       </w:r>
     </w:p>
@@ -674,6 +830,9 @@
         <w:pStyle w:val="ListBullet"/>
       </w:pPr>
       <w:r>
+        <w:rPr>
+          <w:b w:val="0"/>
+        </w:rPr>
         <w:t xml:space="preserve">「年齢」は → 心血管リスク評価、代謝年齢推定、治療候補判定 </w:t>
       </w:r>
       <w:r>
@@ -688,6 +847,9 @@
         <w:pStyle w:val="ListBullet"/>
       </w:pPr>
       <w:r>
+        <w:rPr>
+          <w:b w:val="0"/>
+        </w:rPr>
         <w:t xml:space="preserve">「ST低下」は → 心筋虚血の検出、冠動脈疾患の重症度評価 </w:t>
       </w:r>
       <w:r>
@@ -702,6 +864,9 @@
         <w:pStyle w:val="ListBullet"/>
       </w:pPr>
       <w:r>
+        <w:rPr>
+          <w:b w:val="0"/>
+        </w:rPr>
         <w:t>両者は「</w:t>
       </w:r>
       <w:r>
@@ -711,11 +876,17 @@
         <w:t>心血管リスク評価</w:t>
       </w:r>
       <w:r>
+        <w:rPr>
+          <w:b w:val="0"/>
+        </w:rPr>
         <w:t>」という共通テーマで結びつく</w:t>
       </w:r>
     </w:p>
     <w:p>
       <w:r>
+        <w:rPr>
+          <w:b w:val="0"/>
+        </w:rPr>
         <w:t>この「何に役立つか」の関係をネットワーク化し、スペクトル分解すると、</w:t>
       </w:r>
       <w:r>
@@ -725,6 +896,9 @@
         <w:t>テーマレベルの因果フロー</w:t>
       </w:r>
       <w:r>
+        <w:rPr>
+          <w:b w:val="0"/>
+        </w:rPr>
         <w:t>が見えてきます（図1C）。</w:t>
       </w:r>
     </w:p>
@@ -774,6 +948,7 @@
       </w:pPr>
       <w:r>
         <w:rPr>
+          <w:b w:val="0"/>
           <w:i/>
           <w:sz w:val="18"/>
         </w:rPr>
@@ -785,6 +960,9 @@
         <w:pStyle w:val="Heading1"/>
       </w:pPr>
       <w:r>
+        <w:rPr>
+          <w:b w:val="0"/>
+        </w:rPr>
         <w:t>4. 磁気ラプラシアン — 方向を「位相」で表す</w:t>
       </w:r>
     </w:p>
@@ -793,11 +971,17 @@
         <w:pStyle w:val="Heading2"/>
       </w:pPr>
       <w:r>
+        <w:rPr>
+          <w:b w:val="0"/>
+        </w:rPr>
         <w:t>核心的アイデア: 磁場中の電子のたとえ</w:t>
       </w:r>
     </w:p>
     <w:p>
       <w:r>
+        <w:rPr>
+          <w:b w:val="0"/>
+        </w:rPr>
         <w:t>電子が磁場中のネットワーク上を移動するとき、経路によって</w:t>
       </w:r>
       <w:r>
@@ -807,11 +991,17 @@
         <w:t>位相</w:t>
       </w:r>
       <w:r>
+        <w:rPr>
+          <w:b w:val="0"/>
+        </w:rPr>
         <w:t>（波の「ずれ」）が変わります。右回りと左回りで位相のずれ方が異なる — これが「方向性」の情報を持ちます。</w:t>
       </w:r>
     </w:p>
     <w:p>
       <w:r>
+        <w:rPr>
+          <w:b w:val="0"/>
+        </w:rPr>
         <w:t>同じ原理を医療データに適用します:</w:t>
       </w:r>
     </w:p>
@@ -820,6 +1010,9 @@
         <w:pStyle w:val="ListNumber"/>
       </w:pPr>
       <w:r>
+        <w:rPr>
+          <w:b w:val="0"/>
+        </w:rPr>
         <w:t>変数間の「臨床的有用性」を重みとしたネットワークを作る</w:t>
       </w:r>
     </w:p>
@@ -828,6 +1021,9 @@
         <w:pStyle w:val="ListNumber"/>
       </w:pPr>
       <w:r>
+        <w:rPr>
+          <w:b w:val="0"/>
+        </w:rPr>
         <w:t>有用性の</w:t>
       </w:r>
       <w:r>
@@ -837,6 +1033,9 @@
         <w:t>非対称性</w:t>
       </w:r>
       <w:r>
+        <w:rPr>
+          <w:b w:val="0"/>
+        </w:rPr>
         <w:t>（年齢のデータは血圧の予測に役立つが、逆はあまり成り立たない）を</w:t>
       </w:r>
       <w:r>
@@ -846,6 +1045,9 @@
         <w:t>複素数の位相</w:t>
       </w:r>
       <w:r>
+        <w:rPr>
+          <w:b w:val="0"/>
+        </w:rPr>
         <w:t>として符号化</w:t>
       </w:r>
     </w:p>
@@ -854,11 +1056,17 @@
         <w:pStyle w:val="ListNumber"/>
       </w:pPr>
       <w:r>
+        <w:rPr>
+          <w:b w:val="0"/>
+        </w:rPr>
         <w:t>このネットワークの「固有モード」を分解</w:t>
       </w:r>
     </w:p>
     <w:p>
       <w:r>
+        <w:rPr>
+          <w:b w:val="0"/>
+        </w:rPr>
         <w:t xml:space="preserve">パラメータ </w:t>
       </w:r>
       <w:r>
@@ -868,6 +1076,9 @@
         <w:t>q</w:t>
       </w:r>
       <w:r>
+        <w:rPr>
+          <w:b w:val="0"/>
+        </w:rPr>
         <w:t xml:space="preserve"> が方向性の感度を制御します:</w:t>
       </w:r>
     </w:p>
@@ -882,6 +1093,9 @@
         <w:t>q = 0</w:t>
       </w:r>
       <w:r>
+        <w:rPr>
+          <w:b w:val="0"/>
+        </w:rPr>
         <w:t>: 方向性を完全無視（従来のスペクトル分解と同じ）</w:t>
       </w:r>
     </w:p>
@@ -896,6 +1110,9 @@
         <w:t>q = 0.25</w:t>
       </w:r>
       <w:r>
+        <w:rPr>
+          <w:b w:val="0"/>
+        </w:rPr>
         <w:t>: 方向性を最大限考慮</w:t>
       </w:r>
     </w:p>
@@ -945,10 +1162,27 @@
       </w:pPr>
       <w:r>
         <w:rPr>
+          <w:b w:val="0"/>
           <w:i/>
           <w:sz w:val="18"/>
         </w:rPr>
-        <w:t>図2: 磁気ラプラシアンの第2固有ベクトルを複素平面上にプロットしたもの。q=0では全ての点が実軸上に並ぶ（方向性なし）。q=0.1, 0.25と上げると、各変数が複素平面上に散らばり、**偏角（角度）の順序が因果的な流れの方向**を符号化する。</w:t>
+        <w:t>図2: 磁気ラプラシアンの第2固有ベクトルを複素平面上にプロットしたもの。q=0では全ての点が実軸上に並ぶ（方向性なし）。q=0.1, 0.25と上げると、各変数が複素平面上に散らばり、</w:t>
+      </w:r>
+      <w:r>
+        <w:rPr>
+          <w:b/>
+          <w:i/>
+          <w:sz w:val="18"/>
+        </w:rPr>
+        <w:t>偏角（角度）の順序が因果的な流れの方向</w:t>
+      </w:r>
+      <w:r>
+        <w:rPr>
+          <w:b w:val="0"/>
+          <w:i/>
+          <w:sz w:val="18"/>
+        </w:rPr>
+        <w:t>を符号化する。</w:t>
       </w:r>
     </w:p>
     <w:p>
@@ -956,11 +1190,17 @@
         <w:pStyle w:val="Heading2"/>
       </w:pPr>
       <w:r>
+        <w:rPr>
+          <w:b w:val="0"/>
+        </w:rPr>
         <w:t>何が読み取れるか</w:t>
       </w:r>
     </w:p>
     <w:p>
       <w:r>
+        <w:rPr>
+          <w:b w:val="0"/>
+        </w:rPr>
         <w:t>q = 0.25（図2右）で、各変数の位相角を見ると:</w:t>
       </w:r>
     </w:p>
@@ -975,6 +1215,9 @@
         <w:t>Resting BP</w:t>
       </w:r>
       <w:r>
+        <w:rPr>
+          <w:b w:val="0"/>
+        </w:rPr>
         <w:t xml:space="preserve"> が上方（正の虚部）</w:t>
       </w:r>
     </w:p>
@@ -989,6 +1232,9 @@
         <w:t>ST Depression</w:t>
       </w:r>
       <w:r>
+        <w:rPr>
+          <w:b w:val="0"/>
+        </w:rPr>
         <w:t xml:space="preserve">, </w:t>
       </w:r>
       <w:r>
@@ -998,11 +1244,17 @@
         <w:t>Cholesterol</w:t>
       </w:r>
       <w:r>
+        <w:rPr>
+          <w:b w:val="0"/>
+        </w:rPr>
         <w:t xml:space="preserve"> が下方（負の虚部）</w:t>
       </w:r>
     </w:p>
     <w:p>
       <w:r>
+        <w:rPr>
+          <w:b w:val="0"/>
+        </w:rPr>
         <w:t>この位相の順序が、「血圧は比較的上流（原因側）、ST低下は下流（結果側）」という因果的フローを反映しています。</w:t>
       </w:r>
     </w:p>
@@ -1011,6 +1263,9 @@
         <w:pStyle w:val="Heading1"/>
       </w:pPr>
       <w:r>
+        <w:rPr>
+          <w:b w:val="0"/>
+        </w:rPr>
         <w:t>5. Hodge分解 — 因果フローとフィードバックを分離する</w:t>
       </w:r>
     </w:p>
@@ -1019,11 +1274,17 @@
         <w:pStyle w:val="Heading2"/>
       </w:pPr>
       <w:r>
+        <w:rPr>
+          <w:b w:val="0"/>
+        </w:rPr>
         <w:t>水の流れのたとえ</w:t>
       </w:r>
     </w:p>
     <w:p>
       <w:r>
+        <w:rPr>
+          <w:b w:val="0"/>
+        </w:rPr>
         <w:t>山から海に流れる水は、基本的に</w:t>
       </w:r>
       <w:r>
@@ -1033,11 +1294,17 @@
         <w:t>一方向</w:t>
       </w:r>
       <w:r>
+        <w:rPr>
+          <w:b w:val="0"/>
+        </w:rPr>
         <w:t>（高い所から低い所へ）です。しかし、渦（うず）も存在します。</w:t>
       </w:r>
     </w:p>
     <w:p>
       <w:r>
+        <w:rPr>
+          <w:b w:val="0"/>
+        </w:rPr>
         <w:t>情報の流れも同じです:</w:t>
       </w:r>
     </w:p>
@@ -1052,6 +1319,9 @@
         <w:t>勾配フロー（gradient）</w:t>
       </w:r>
       <w:r>
+        <w:rPr>
+          <w:b w:val="0"/>
+        </w:rPr>
         <w:t xml:space="preserve"> = 「原因 → 結果」の一方向の流れ = </w:t>
       </w:r>
       <w:r>
@@ -1072,6 +1342,9 @@
         <w:t>カールフロー（curl）</w:t>
       </w:r>
       <w:r>
+        <w:rPr>
+          <w:b w:val="0"/>
+        </w:rPr>
         <w:t xml:space="preserve"> = 局所的な循環 = </w:t>
       </w:r>
       <w:r>
@@ -1083,6 +1356,9 @@
     </w:p>
     <w:p>
       <w:r>
+        <w:rPr>
+          <w:b w:val="0"/>
+        </w:rPr>
         <w:t>Hodge分解は、この2つを数学的に分離します。</w:t>
       </w:r>
     </w:p>
@@ -1091,11 +1367,17 @@
         <w:pStyle w:val="Heading2"/>
       </w:pPr>
       <w:r>
+        <w:rPr>
+          <w:b w:val="0"/>
+        </w:rPr>
         <w:t>実データの結果</w:t>
       </w:r>
     </w:p>
     <w:p>
       <w:r>
+        <w:rPr>
+          <w:b w:val="0"/>
+        </w:rPr>
         <w:t>心疾患データでHodge分解を行った結果（図3A）:</w:t>
       </w:r>
     </w:p>
@@ -1110,6 +1392,9 @@
         <w:t>85.9%</w:t>
       </w:r>
       <w:r>
+        <w:rPr>
+          <w:b w:val="0"/>
+        </w:rPr>
         <w:t xml:space="preserve"> が勾配フロー（因果的な一方向フロー）</w:t>
       </w:r>
     </w:p>
@@ -1124,11 +1409,17 @@
         <w:t>14.1%</w:t>
       </w:r>
       <w:r>
+        <w:rPr>
+          <w:b w:val="0"/>
+        </w:rPr>
         <w:t xml:space="preserve"> がカールフロー（フィードバックループ）</w:t>
       </w:r>
     </w:p>
     <w:p>
       <w:r>
+        <w:rPr>
+          <w:b w:val="0"/>
+        </w:rPr>
         <w:t>→ この心疾患データでは、変数間の情報の流れの大部分が「原因→結果」の一方向的な構造であり、DAG（有向非循環グラフ）で十分に表現できることを示唆しています。</w:t>
       </w:r>
     </w:p>
@@ -1137,11 +1428,17 @@
         <w:pStyle w:val="Heading2"/>
       </w:pPr>
       <w:r>
+        <w:rPr>
+          <w:b w:val="0"/>
+        </w:rPr>
         <w:t>因果ポテンシャル — 「標高」のようなもの</w:t>
       </w:r>
     </w:p>
     <w:p>
       <w:r>
+        <w:rPr>
+          <w:b w:val="0"/>
+        </w:rPr>
         <w:t>Hodge分解から得られる</w:t>
       </w:r>
       <w:r>
@@ -1151,6 +1448,9 @@
         <w:t>因果ポテンシャル（phi）</w:t>
       </w:r>
       <w:r>
+        <w:rPr>
+          <w:b w:val="0"/>
+        </w:rPr>
         <w:t xml:space="preserve"> は、各変数の「因果的な標高」を表します（図3B）:</w:t>
       </w:r>
     </w:p>
@@ -1165,6 +1465,9 @@
         <w:t>年齢（Age）</w:t>
       </w:r>
       <w:r>
+        <w:rPr>
+          <w:b w:val="0"/>
+        </w:rPr>
         <w:t>: 最も上流（標高が高い）— 他の全変数に影響を与える根本的な因子</w:t>
       </w:r>
     </w:p>
@@ -1179,6 +1482,9 @@
         <w:t>コレステロール</w:t>
       </w:r>
       <w:r>
+        <w:rPr>
+          <w:b w:val="0"/>
+        </w:rPr>
         <w:t>: 2番目に上流</w:t>
       </w:r>
     </w:p>
@@ -1193,6 +1499,9 @@
         <w:t>安静時血圧 / 最大心拍数</w:t>
       </w:r>
       <w:r>
+        <w:rPr>
+          <w:b w:val="0"/>
+        </w:rPr>
         <w:t>: 中流</w:t>
       </w:r>
     </w:p>
@@ -1207,11 +1516,17 @@
         <w:t>ST低下</w:t>
       </w:r>
       <w:r>
+        <w:rPr>
+          <w:b w:val="0"/>
+        </w:rPr>
         <w:t>: 最も下流（標高が低い）— 他の因子の結果として現れる</w:t>
       </w:r>
     </w:p>
     <w:p>
       <w:r>
+        <w:rPr>
+          <w:b w:val="0"/>
+        </w:rPr>
         <w:t>これは臨床的に非常に</w:t>
       </w:r>
       <w:r>
@@ -1221,6 +1536,9 @@
         <w:t>直感的</w:t>
       </w:r>
       <w:r>
+        <w:rPr>
+          <w:b w:val="0"/>
+        </w:rPr>
         <w:t>です。年齢は変えられない根本因子、ST低下は心臓への負荷の結果として現れる指標です。</w:t>
       </w:r>
     </w:p>
@@ -1270,6 +1588,7 @@
       </w:pPr>
       <w:r>
         <w:rPr>
+          <w:b w:val="0"/>
           <w:i/>
           <w:sz w:val="18"/>
         </w:rPr>
@@ -1281,11 +1600,17 @@
         <w:pStyle w:val="Heading1"/>
       </w:pPr>
       <w:r>
+        <w:rPr>
+          <w:b w:val="0"/>
+        </w:rPr>
         <w:t>6. 3手法の比較 — 一致と不一致が語ること</w:t>
       </w:r>
     </w:p>
     <w:p>
       <w:r>
+        <w:rPr>
+          <w:b w:val="0"/>
+        </w:rPr>
         <w:t>LiNGAM、スペクトル因果方向（SCD）、Hodge分解の3つで、全10ペアの因果方向を比較しました（図4）。</w:t>
       </w:r>
     </w:p>
@@ -1294,11 +1619,17 @@
         <w:pStyle w:val="Heading2"/>
       </w:pPr>
       <w:r>
+        <w:rPr>
+          <w:b w:val="0"/>
+        </w:rPr>
         <w:t>一致したペア（高信頼）</w:t>
       </w:r>
     </w:p>
     <w:p>
       <w:r>
+        <w:rPr>
+          <w:b w:val="0"/>
+        </w:rPr>
         <w:t>いくつかのペアでは、3手法すべてが同じ方向を指しました:</w:t>
       </w:r>
     </w:p>
@@ -1313,6 +1644,9 @@
         <w:t>年齢 → コレステロール</w:t>
       </w:r>
       <w:r>
+        <w:rPr>
+          <w:b w:val="0"/>
+        </w:rPr>
         <w:t>: 全手法一致。加齢によるコレステロール上昇は医学的に確立。</w:t>
       </w:r>
     </w:p>
@@ -1327,6 +1661,9 @@
         <w:t>年齢 → 安静時血圧</w:t>
       </w:r>
       <w:r>
+        <w:rPr>
+          <w:b w:val="0"/>
+        </w:rPr>
         <w:t>: 全手法一致。加齢による動脈硬化→血圧上昇。</w:t>
       </w:r>
     </w:p>
@@ -1335,11 +1672,17 @@
         <w:pStyle w:val="Heading2"/>
       </w:pPr>
       <w:r>
+        <w:rPr>
+          <w:b w:val="0"/>
+        </w:rPr>
         <w:t>不一致のペア（興味深い発見）</w:t>
       </w:r>
     </w:p>
     <w:p>
       <w:r>
+        <w:rPr>
+          <w:b w:val="0"/>
+        </w:rPr>
         <w:t>一部のペアでは方向が食い違いました:</w:t>
       </w:r>
     </w:p>
@@ -1354,6 +1697,9 @@
         <w:t>年齢 vs 最大心拍数</w:t>
       </w:r>
       <w:r>
+        <w:rPr>
+          <w:b w:val="0"/>
+        </w:rPr>
         <w:t>: LiNGAMは「年齢→最大心拍数」（加齢で心拍数↓）を検出。スペクトル手法は逆方向。これはスペクトル手法が「最大心拍数→年齢推定に役立つ」という</w:t>
       </w:r>
       <w:r>
@@ -1363,6 +1709,9 @@
         <w:t>情報的方向</w:t>
       </w:r>
       <w:r>
+        <w:rPr>
+          <w:b w:val="0"/>
+        </w:rPr>
         <w:t>を捉えている可能性。</w:t>
       </w:r>
     </w:p>
@@ -1377,6 +1726,9 @@
         <w:t>安静時血圧 vs コレステロール</w:t>
       </w:r>
       <w:r>
+        <w:rPr>
+          <w:b w:val="0"/>
+        </w:rPr>
         <w:t>: LiNGAMは「BP→Chol」を検出できないが、スペクトル手法は弱い方向性を検出。フィードバック（脂質代謝と血管機能の相互作用）の存在を示唆。</w:t>
       </w:r>
     </w:p>
@@ -1388,6 +1740,9 @@
         <w:t>核心的な洞察</w:t>
       </w:r>
       <w:r>
+        <w:rPr>
+          <w:b w:val="0"/>
+        </w:rPr>
         <w:t>: 手法間の</w:t>
       </w:r>
       <w:r>
@@ -1397,6 +1752,9 @@
         <w:t>不一致そのものが情報</w:t>
       </w:r>
       <w:r>
+        <w:rPr>
+          <w:b w:val="0"/>
+        </w:rPr>
         <w:t>です。不一致は「単純な一方向因果ではない」ことを示し、フィードバックや交絡変数の存在を示唆します。</w:t>
       </w:r>
     </w:p>
@@ -1446,6 +1804,7 @@
       </w:pPr>
       <w:r>
         <w:rPr>
+          <w:b w:val="0"/>
           <w:i/>
           <w:sz w:val="18"/>
         </w:rPr>
@@ -1457,11 +1816,17 @@
         <w:pStyle w:val="Heading1"/>
       </w:pPr>
       <w:r>
+        <w:rPr>
+          <w:b w:val="0"/>
+        </w:rPr>
         <w:t>7. Hill の9基準 — それぞれの手法は何を扱えるか</w:t>
       </w:r>
     </w:p>
     <w:p>
       <w:r>
+        <w:rPr>
+          <w:b w:val="0"/>
+        </w:rPr>
         <w:t>1965年にBradford Hillが提唱した</w:t>
       </w:r>
       <w:r>
@@ -1471,6 +1836,9 @@
         <w:t>因果判断の9基準</w:t>
       </w:r>
       <w:r>
+        <w:rPr>
+          <w:b w:val="0"/>
+        </w:rPr>
         <w:t>は、疫学における因果推論の金字塔です。しかし、既存の統計手法はこの9基準のうち一部しかカバーしていません。</w:t>
       </w:r>
     </w:p>
@@ -1479,6 +1847,9 @@
         <w:pStyle w:val="Heading2"/>
       </w:pPr>
       <w:r>
+        <w:rPr>
+          <w:b w:val="0"/>
+        </w:rPr>
         <w:t>9基準の簡単な解説</w:t>
       </w:r>
     </w:p>
@@ -1580,10 +1951,10 @@
             <w:r/>
             <w:r>
               <w:rPr>
-                <w:b w:val="0"/>
+                <w:b/>
                 <w:sz w:val="18"/>
               </w:rPr>
-              <w:t>**強さ**</w:t>
+              <w:t>強さ</w:t>
             </w:r>
           </w:p>
         </w:tc>
@@ -1636,10 +2007,10 @@
             <w:r/>
             <w:r>
               <w:rPr>
-                <w:b w:val="0"/>
+                <w:b/>
                 <w:sz w:val="18"/>
               </w:rPr>
-              <w:t>**一貫性**</w:t>
+              <w:t>一貫性</w:t>
             </w:r>
           </w:p>
         </w:tc>
@@ -1692,10 +2063,10 @@
             <w:r/>
             <w:r>
               <w:rPr>
-                <w:b w:val="0"/>
+                <w:b/>
                 <w:sz w:val="18"/>
               </w:rPr>
-              <w:t>**特異性**</w:t>
+              <w:t>特異性</w:t>
             </w:r>
           </w:p>
         </w:tc>
@@ -1748,10 +2119,10 @@
             <w:r/>
             <w:r>
               <w:rPr>
-                <w:b w:val="0"/>
+                <w:b/>
                 <w:sz w:val="18"/>
               </w:rPr>
-              <w:t>**時間性**</w:t>
+              <w:t>時間性</w:t>
             </w:r>
           </w:p>
         </w:tc>
@@ -1804,10 +2175,10 @@
             <w:r/>
             <w:r>
               <w:rPr>
-                <w:b w:val="0"/>
+                <w:b/>
                 <w:sz w:val="18"/>
               </w:rPr>
-              <w:t>**量反応**</w:t>
+              <w:t>量反応</w:t>
             </w:r>
           </w:p>
         </w:tc>
@@ -1860,10 +2231,10 @@
             <w:r/>
             <w:r>
               <w:rPr>
-                <w:b w:val="0"/>
+                <w:b/>
                 <w:sz w:val="18"/>
               </w:rPr>
-              <w:t>**妥当性**</w:t>
+              <w:t>妥当性</w:t>
             </w:r>
           </w:p>
         </w:tc>
@@ -1916,10 +2287,10 @@
             <w:r/>
             <w:r>
               <w:rPr>
-                <w:b w:val="0"/>
+                <w:b/>
                 <w:sz w:val="18"/>
               </w:rPr>
-              <w:t>**整合性**</w:t>
+              <w:t>整合性</w:t>
             </w:r>
           </w:p>
         </w:tc>
@@ -1972,10 +2343,10 @@
             <w:r/>
             <w:r>
               <w:rPr>
-                <w:b w:val="0"/>
+                <w:b/>
                 <w:sz w:val="18"/>
               </w:rPr>
-              <w:t>**実験**</w:t>
+              <w:t>実験</w:t>
             </w:r>
           </w:p>
         </w:tc>
@@ -2028,10 +2399,10 @@
             <w:r/>
             <w:r>
               <w:rPr>
-                <w:b w:val="0"/>
+                <w:b/>
                 <w:sz w:val="18"/>
               </w:rPr>
-              <w:t>**類似性**</w:t>
+              <w:t>類似性</w:t>
             </w:r>
           </w:p>
         </w:tc>
@@ -2061,11 +2432,17 @@
         <w:pStyle w:val="Heading2"/>
       </w:pPr>
       <w:r>
+        <w:rPr>
+          <w:b w:val="0"/>
+        </w:rPr>
         <w:t>既存手法の「手薄な領域」</w:t>
       </w:r>
     </w:p>
     <w:p>
       <w:r>
+        <w:rPr>
+          <w:b w:val="0"/>
+        </w:rPr>
         <w:t>図5のレーダーチャートが示す通り:</w:t>
       </w:r>
     </w:p>
@@ -2077,6 +2454,9 @@
         <w:t>DirectLiNGAM</w:t>
       </w:r>
       <w:r>
+        <w:rPr>
+          <w:b w:val="0"/>
+        </w:rPr>
         <w:t>（図5左）:</w:t>
       </w:r>
     </w:p>
@@ -2085,6 +2465,9 @@
         <w:pStyle w:val="ListBullet"/>
       </w:pPr>
       <w:r>
+        <w:rPr>
+          <w:b w:val="0"/>
+        </w:rPr>
         <w:t>H1（効果量を定量化）、H3（変数ペアの特定）に</w:t>
       </w:r>
       <w:r>
@@ -2099,6 +2482,9 @@
         <w:pStyle w:val="ListBullet"/>
       </w:pPr>
       <w:r>
+        <w:rPr>
+          <w:b w:val="0"/>
+        </w:rPr>
         <w:t>しかし H6（生物学的妥当性）、H7（整合性）、H9（類似性）は</w:t>
       </w:r>
       <w:r>
@@ -2113,6 +2499,9 @@
         <w:pStyle w:val="ListBullet"/>
       </w:pPr>
       <w:r>
+        <w:rPr>
+          <w:b w:val="0"/>
+        </w:rPr>
         <w:t>→ 「数字は出るが、なぜそうなるかは分からない」</w:t>
       </w:r>
     </w:p>
@@ -2124,6 +2513,9 @@
         <w:t>Utility Causality</w:t>
       </w:r>
       <w:r>
+        <w:rPr>
+          <w:b w:val="0"/>
+        </w:rPr>
         <w:t>（図5中）:</w:t>
       </w:r>
     </w:p>
@@ -2132,6 +2524,9 @@
         <w:pStyle w:val="ListBullet"/>
       </w:pPr>
       <w:r>
+        <w:rPr>
+          <w:b w:val="0"/>
+        </w:rPr>
         <w:t>H6（LLMが臨床知識をグラフに注入）、H7（Eigenthemeが既知の疾患概念と整合）、H9（類似パターンの体系的検出）に</w:t>
       </w:r>
       <w:r>
@@ -2146,6 +2541,9 @@
         <w:pStyle w:val="ListBullet"/>
       </w:pPr>
       <w:r>
+        <w:rPr>
+          <w:b w:val="0"/>
+        </w:rPr>
         <w:t>しかし H8（介入的証拠はない）</w:t>
       </w:r>
     </w:p>
@@ -2154,6 +2552,9 @@
         <w:pStyle w:val="ListBullet"/>
       </w:pPr>
       <w:r>
+        <w:rPr>
+          <w:b w:val="0"/>
+        </w:rPr>
         <w:t>→ 「メカニズムは分かるが、操作的因果は証明できない」</w:t>
       </w:r>
     </w:p>
@@ -2165,6 +2566,9 @@
         <w:t>アンサンブル（ECD）</w:t>
       </w:r>
       <w:r>
+        <w:rPr>
+          <w:b w:val="0"/>
+        </w:rPr>
         <w:t>（図5右）:</w:t>
       </w:r>
     </w:p>
@@ -2173,6 +2577,9 @@
         <w:pStyle w:val="ListBullet"/>
       </w:pPr>
       <w:r>
+        <w:rPr>
+          <w:b w:val="0"/>
+        </w:rPr>
         <w:t>複数手法を組み合わせることで、</w:t>
       </w:r>
       <w:r>
@@ -2187,6 +2594,9 @@
         <w:pStyle w:val="ListBullet"/>
       </w:pPr>
       <w:r>
+        <w:rPr>
+          <w:b w:val="0"/>
+        </w:rPr>
         <w:t>特に H2（手法間一致=一貫性）と H7（整合性）が自動的に評価される</w:t>
       </w:r>
     </w:p>
@@ -2236,6 +2646,7 @@
       </w:pPr>
       <w:r>
         <w:rPr>
+          <w:b w:val="0"/>
           <w:i/>
           <w:sz w:val="18"/>
         </w:rPr>
@@ -2247,6 +2658,9 @@
         <w:pStyle w:val="Heading2"/>
       </w:pPr>
       <w:r>
+        <w:rPr>
+          <w:b w:val="0"/>
+        </w:rPr>
         <w:t>核心的発見: 既存手法は半分しか使っていなかった</w:t>
       </w:r>
     </w:p>
@@ -2268,6 +2682,9 @@
     </w:p>
     <w:p>
       <w:r>
+        <w:rPr>
+          <w:b w:val="0"/>
+        </w:rPr>
         <w:t>Hillの9基準のうち、H1/H3/H4/H8は統計学者が好む「客観的」基準で、計算手法が充実しています。一方、H6/H7/H9は「知識や文脈に依存する」基準として、従来は研究者の主観に委ねられていました。</w:t>
       </w:r>
     </w:p>
@@ -2279,6 +2696,9 @@
         <w:t>スペクトル因果性/Utility Causalityの最大の貢献は、この「主観に頼っていた基準」を計算可能にすること</w:t>
       </w:r>
       <w:r>
+        <w:rPr>
+          <w:b w:val="0"/>
+        </w:rPr>
         <w:t>です。</w:t>
       </w:r>
     </w:p>
@@ -2287,6 +2707,9 @@
         <w:pStyle w:val="Heading1"/>
       </w:pPr>
       <w:r>
+        <w:rPr>
+          <w:b w:val="0"/>
+        </w:rPr>
         <w:t>8. 因果の梯子と Hill基準の統合的理解</w:t>
       </w:r>
     </w:p>
@@ -2295,6 +2718,9 @@
         <w:pStyle w:val="Heading2"/>
       </w:pPr>
       <w:r>
+        <w:rPr>
+          <w:b w:val="0"/>
+        </w:rPr>
         <w:t>Pearlの梯子のどの段に、どのHill基準が対応するか</w:t>
       </w:r>
     </w:p>
@@ -2324,6 +2750,9 @@
         <w:t>重要な気づき</w:t>
       </w:r>
       <w:r>
+        <w:rPr>
+          <w:b w:val="0"/>
+        </w:rPr>
         <w:t>: Hillの9基準のうち、H6/H7/H9は実は</w:t>
       </w:r>
       <w:r>
@@ -2333,11 +2762,17 @@
         <w:t>Level 1.5に属している</w:t>
       </w:r>
       <w:r>
+        <w:rPr>
+          <w:b w:val="0"/>
+        </w:rPr>
         <w:t>のです。Hillは1965年に、まだ「介入」や「反事実」の数学的定義が確立する前に、直感的にこの中間層の存在を見抜いていたと解釈できます。</w:t>
       </w:r>
     </w:p>
     <w:p>
       <w:r>
+        <w:rPr>
+          <w:b w:val="0"/>
+        </w:rPr>
         <w:t>そして、60年間この中間層には</w:t>
       </w:r>
       <w:r>
@@ -2347,6 +2782,9 @@
         <w:t>計算手法がなかった</w:t>
       </w:r>
       <w:r>
+        <w:rPr>
+          <w:b w:val="0"/>
+        </w:rPr>
         <w:t>。スペクトル因果性は、この空白を埋める最初の試みです。</w:t>
       </w:r>
     </w:p>
@@ -2355,11 +2793,17 @@
         <w:pStyle w:val="Heading1"/>
       </w:pPr>
       <w:r>
+        <w:rPr>
+          <w:b w:val="0"/>
+        </w:rPr>
         <w:t>8.5. LiNGAM vs スペクトル因果性 — 直接比較で分かったこと</w:t>
       </w:r>
     </w:p>
     <w:p>
       <w:r>
+        <w:rPr>
+          <w:b w:val="0"/>
+        </w:rPr>
         <w:t>同じ心疾患データに対して、3つの条件で因果構造を推定しました（図6）：</w:t>
       </w:r>
     </w:p>
@@ -2443,10 +2887,17 @@
             <w:r/>
             <w:r>
               <w:rPr>
+                <w:b/>
+                <w:sz w:val="18"/>
+              </w:rPr>
+              <w:t>(A)</w:t>
+            </w:r>
+            <w:r>
+              <w:rPr>
                 <w:b w:val="0"/>
                 <w:sz w:val="18"/>
               </w:rPr>
-              <w:t>**(A)** LiNGAM</w:t>
+              <w:t xml:space="preserve"> LiNGAM</w:t>
             </w:r>
           </w:p>
         </w:tc>
@@ -2499,10 +2950,17 @@
             <w:r/>
             <w:r>
               <w:rPr>
+                <w:b/>
+                <w:sz w:val="18"/>
+              </w:rPr>
+              <w:t>(B)</w:t>
+            </w:r>
+            <w:r>
+              <w:rPr>
                 <w:b w:val="0"/>
                 <w:sz w:val="18"/>
               </w:rPr>
-              <w:t>**(B)** スペクトル因果性（知識あり）</w:t>
+              <w:t xml:space="preserve"> スペクトル因果性（知識あり）</w:t>
             </w:r>
           </w:p>
         </w:tc>
@@ -2555,10 +3013,17 @@
             <w:r/>
             <w:r>
               <w:rPr>
+                <w:b/>
+                <w:sz w:val="18"/>
+              </w:rPr>
+              <w:t>(C)</w:t>
+            </w:r>
+            <w:r>
+              <w:rPr>
                 <w:b w:val="0"/>
                 <w:sz w:val="18"/>
               </w:rPr>
-              <w:t>**(C)** スペクトル因果性（知識なし）</w:t>
+              <w:t xml:space="preserve"> スペクトル因果性（知識なし）</w:t>
             </w:r>
           </w:p>
         </w:tc>
@@ -2591,10 +3056,10 @@
             <w:r/>
             <w:r>
               <w:rPr>
-                <w:b w:val="0"/>
+                <w:b/>
                 <w:sz w:val="18"/>
               </w:rPr>
-              <w:t>**辺なし（推定不能）**</w:t>
+              <w:t>辺なし（推定不能）</w:t>
             </w:r>
           </w:p>
         </w:tc>
@@ -2606,11 +3071,17 @@
         <w:pStyle w:val="Heading2"/>
       </w:pPr>
       <w:r>
+        <w:rPr>
+          <w:b w:val="0"/>
+        </w:rPr>
         <w:t>最大の発見：「情報の方向」と「介入の方向」は逆だった</w:t>
       </w:r>
     </w:p>
     <w:p>
       <w:r>
+        <w:rPr>
+          <w:b w:val="0"/>
+        </w:rPr>
         <w:t>スペクトル因果性（B）はLiNGAMとほぼ</w:t>
       </w:r>
       <w:r>
@@ -2620,6 +3091,9 @@
         <w:t>逆方向</w:t>
       </w:r>
       <w:r>
+        <w:rPr>
+          <w:b w:val="0"/>
+        </w:rPr>
         <w:t>を示しました。これはバグではなく、捉えている「因果」が違うのです：</w:t>
       </w:r>
     </w:p>
@@ -2634,6 +3108,9 @@
         <w:t>LiNGAM</w:t>
       </w:r>
       <w:r>
+        <w:rPr>
+          <w:b w:val="0"/>
+        </w:rPr>
         <w:t>: 「年齢が上がると心拍数が下がる」（</w:t>
       </w:r>
       <w:r>
@@ -2643,6 +3120,9 @@
         <w:t>原因→結果</w:t>
       </w:r>
       <w:r>
+        <w:rPr>
+          <w:b w:val="0"/>
+        </w:rPr>
         <w:t xml:space="preserve"> の方向）</w:t>
       </w:r>
     </w:p>
@@ -2657,6 +3137,9 @@
         <w:t>スペクトル因果性</w:t>
       </w:r>
       <w:r>
+        <w:rPr>
+          <w:b w:val="0"/>
+        </w:rPr>
         <w:t>: 「心拍数を見れば年齢が推測できる」（</w:t>
       </w:r>
       <w:r>
@@ -2666,6 +3149,9 @@
         <w:t>情報提供→情報受容</w:t>
       </w:r>
       <w:r>
+        <w:rPr>
+          <w:b w:val="0"/>
+        </w:rPr>
         <w:t xml:space="preserve"> の方向）</w:t>
       </w:r>
     </w:p>
@@ -2677,6 +3163,9 @@
         <w:t>臨床的な意味</w:t>
       </w:r>
       <w:r>
+        <w:rPr>
+          <w:b w:val="0"/>
+        </w:rPr>
         <w:t>: 医師は患者の最大心拍数を見て「この人は年齢の割に心機能が…」と推論します（情報フロー: 心拍数→年齢推定）。しかし生物学的には加齢が心機能を低下させます（介入因果: 年齢→心拍数）。</w:t>
       </w:r>
       <w:r>
@@ -2686,6 +3175,9 @@
         <w:t>この逆転は、Level 1.5（情報的因果）と Level 2（介入的因果）の違いを実データで初めて示した結果</w:t>
       </w:r>
       <w:r>
+        <w:rPr>
+          <w:b w:val="0"/>
+        </w:rPr>
         <w:t>です。</w:t>
       </w:r>
     </w:p>
@@ -2694,12 +3186,66 @@
         <w:pStyle w:val="Heading2"/>
       </w:pPr>
       <w:r>
+        <w:rPr>
+          <w:b w:val="0"/>
+        </w:rPr>
         <w:t>知識なし（C）の根本的限界</w:t>
       </w:r>
     </w:p>
     <w:p>
       <w:r>
-        <w:t>相関は「$X$ と $Y$ の関連の強さ」しか教えてくれず、$X \to Y$ なのか $Y \to X$ なのかは分かりません（相関は対称なので）。これが</w:t>
+        <w:rPr>
+          <w:b w:val="0"/>
+        </w:rPr>
+        <w:t>相関は「</w:t>
+      </w:r>
+      <w:r>
+        <w:rPr>
+          <w:rFonts w:ascii="Cambria Math" w:hAnsi="Cambria Math"/>
+        </w:rPr>
+        <w:t>X</w:t>
+      </w:r>
+      <w:r>
+        <w:rPr>
+          <w:b w:val="0"/>
+        </w:rPr>
+        <w:t xml:space="preserve"> と </w:t>
+      </w:r>
+      <w:r>
+        <w:rPr>
+          <w:rFonts w:ascii="Cambria Math" w:hAnsi="Cambria Math"/>
+        </w:rPr>
+        <w:t>Y</w:t>
+      </w:r>
+      <w:r>
+        <w:rPr>
+          <w:b w:val="0"/>
+        </w:rPr>
+        <w:t xml:space="preserve"> の関連の強さ」しか教えてくれず、</w:t>
+      </w:r>
+      <w:r>
+        <w:rPr>
+          <w:rFonts w:ascii="Cambria Math" w:hAnsi="Cambria Math"/>
+        </w:rPr>
+        <w:t>X → Y</w:t>
+      </w:r>
+      <w:r>
+        <w:rPr>
+          <w:b w:val="0"/>
+        </w:rPr>
+        <w:t xml:space="preserve"> なのか </w:t>
+      </w:r>
+      <w:r>
+        <w:rPr>
+          <w:rFonts w:ascii="Cambria Math" w:hAnsi="Cambria Math"/>
+        </w:rPr>
+        <w:t>Y → X</w:t>
+      </w:r>
+      <w:r>
+        <w:rPr>
+          <w:b w:val="0"/>
+        </w:rPr>
+        <w:t xml:space="preserve"> なのかは分かりません（相関は対称なので）。これが</w:t>
       </w:r>
       <w:r>
         <w:rPr>
@@ -2708,6 +3254,9 @@
         <w:t>α=0で辺が0本になった理由</w:t>
       </w:r>
       <w:r>
+        <w:rPr>
+          <w:b w:val="0"/>
+        </w:rPr>
         <w:t>です。LiNGAMはデータの「歪み」（非ガウス性）から方向を見つけるため、知識なしでもDAGを推定できます。</w:t>
       </w:r>
     </w:p>
@@ -2757,6 +3306,7 @@
       </w:pPr>
       <w:r>
         <w:rPr>
+          <w:b w:val="0"/>
           <w:i/>
           <w:sz w:val="18"/>
         </w:rPr>
@@ -2768,6 +3318,9 @@
         <w:pStyle w:val="Heading1"/>
       </w:pPr>
       <w:r>
+        <w:rPr>
+          <w:b w:val="0"/>
+        </w:rPr>
         <w:t>8.6. ドメイン知識の「量」より「質」— DAG転移点</w:t>
       </w:r>
     </w:p>
@@ -2776,11 +3329,17 @@
         <w:pStyle w:val="Heading2"/>
       </w:pPr>
       <w:r>
+        <w:rPr>
+          <w:b w:val="0"/>
+        </w:rPr>
         <w:t>知識をどれだけ混ぜるか（α）は重要ではない</w:t>
       </w:r>
     </w:p>
     <w:p>
       <w:r>
+        <w:rPr>
+          <w:b w:val="0"/>
+        </w:rPr>
         <w:t>α（知識の混合比率）を 0 → 1 まで変えてみた結果、驚くべきことが分かりました（図7左）：</w:t>
       </w:r>
     </w:p>
@@ -2789,6 +3348,9 @@
         <w:pStyle w:val="ListBullet"/>
       </w:pPr>
       <w:r>
+        <w:rPr>
+          <w:b w:val="0"/>
+        </w:rPr>
         <w:t>α = 0 → 方向性ゼロ（推定不能）</w:t>
       </w:r>
     </w:p>
@@ -2797,6 +3359,9 @@
         <w:pStyle w:val="ListBullet"/>
       </w:pPr>
       <w:r>
+        <w:rPr>
+          <w:b w:val="0"/>
+        </w:rPr>
         <w:t xml:space="preserve">α = 0.000001 → </w:t>
       </w:r>
       <w:r>
@@ -2811,6 +3376,9 @@
         <w:pStyle w:val="ListBullet"/>
       </w:pPr>
       <w:r>
+        <w:rPr>
+          <w:b w:val="0"/>
+        </w:rPr>
         <w:t>α = 0.5 → 85.9%（変わらない）</w:t>
       </w:r>
     </w:p>
@@ -2819,6 +3387,9 @@
         <w:pStyle w:val="ListBullet"/>
       </w:pPr>
       <w:r>
+        <w:rPr>
+          <w:b w:val="0"/>
+        </w:rPr>
         <w:t>α = 1.0 → 85.9%（変わらない）</w:t>
       </w:r>
     </w:p>
@@ -2830,6 +3401,9 @@
         <w:t>知識を入れるかゼロかの違いが全て</w:t>
       </w:r>
       <w:r>
+        <w:rPr>
+          <w:b w:val="0"/>
+        </w:rPr>
         <w:t>。入れる量は問題ではありません。</w:t>
       </w:r>
     </w:p>
@@ -2838,11 +3412,17 @@
         <w:pStyle w:val="Heading2"/>
       </w:pPr>
       <w:r>
+        <w:rPr>
+          <w:b w:val="0"/>
+        </w:rPr>
         <w:t>知識の「正しさ」こそが命</w:t>
       </w:r>
     </w:p>
     <w:p>
       <w:r>
+        <w:rPr>
+          <w:b w:val="0"/>
+        </w:rPr>
         <w:t>知識の方向を一定の割合でデタラメに反転させた実験（図7D）：</w:t>
       </w:r>
     </w:p>
@@ -2857,6 +3437,9 @@
         <w:t>0%反転（全部正しい）</w:t>
       </w:r>
       <w:r>
+        <w:rPr>
+          <w:b w:val="0"/>
+        </w:rPr>
         <w:t>: DAG度 86% → 高い</w:t>
       </w:r>
     </w:p>
@@ -2871,6 +3454,9 @@
         <w:t>10%反転</w:t>
       </w:r>
       <w:r>
+        <w:rPr>
+          <w:b w:val="0"/>
+        </w:rPr>
         <w:t xml:space="preserve">: DAG度 58% → </w:t>
       </w:r>
       <w:r>
@@ -2891,6 +3477,9 @@
         <w:t>30%反転</w:t>
       </w:r>
       <w:r>
+        <w:rPr>
+          <w:b w:val="0"/>
+        </w:rPr>
         <w:t xml:space="preserve">: DAG度 37% → </w:t>
       </w:r>
       <w:r>
@@ -2911,6 +3500,9 @@
         <w:t>100%反転（全部逆）</w:t>
       </w:r>
       <w:r>
+        <w:rPr>
+          <w:b w:val="0"/>
+        </w:rPr>
         <w:t xml:space="preserve">: DAG度 86% → </w:t>
       </w:r>
       <w:r>
@@ -2924,7 +3516,6 @@
       <w:pPr>
         <w:ind w:left="850"/>
       </w:pPr>
-      <w:r/>
       <w:r>
         <w:rPr>
           <w:b/>
@@ -2932,11 +3523,49 @@
         <w:t>「中途半端な誤りが最も有害」</w:t>
       </w:r>
       <w:r>
-        <w:t xml:space="preserve"> — 知識の85%以上が正しければDAGは維持される（$p_{\text{flip}}^* \approx 0.15$）</w:t>
+        <w:rPr>
+          <w:b w:val="0"/>
+        </w:rPr>
+        <w:t xml:space="preserve"> — 知識の85%以上が正しければDAGは維持される（</w:t>
+      </w:r>
+      <w:r>
+        <w:rPr>
+          <w:rFonts w:ascii="Cambria Math" w:hAnsi="Cambria Math"/>
+        </w:rPr>
+        <w:t>p</w:t>
+      </w:r>
+      <w:r>
+        <w:rPr>
+          <w:rFonts w:ascii="Cambria Math" w:hAnsi="Cambria Math"/>
+          <w:vertAlign w:val="subscript"/>
+        </w:rPr>
+        <w:t>flip</w:t>
+      </w:r>
+      <w:r>
+        <w:rPr>
+          <w:rFonts w:ascii="Cambria Math" w:hAnsi="Cambria Math"/>
+          <w:vertAlign w:val="superscript"/>
+        </w:rPr>
+        <w:t>*</w:t>
+      </w:r>
+      <w:r>
+        <w:rPr>
+          <w:rFonts w:ascii="Cambria Math" w:hAnsi="Cambria Math"/>
+        </w:rPr>
+        <w:t xml:space="preserve"> ≈ 0.15</w:t>
+      </w:r>
+      <w:r>
+        <w:rPr>
+          <w:b w:val="0"/>
+        </w:rPr>
+        <w:t>）</w:t>
       </w:r>
     </w:p>
     <w:p>
       <w:r>
+        <w:rPr>
+          <w:b w:val="0"/>
+        </w:rPr>
         <w:t>100%反転で回復するのは直感に反しますが、全部逆なら「逆向きに整合的」なDAGになるだけ。本当に有害なのは</w:t>
       </w:r>
       <w:r>
@@ -2946,6 +3575,9 @@
         <w:t>一部だけ矛盾</w:t>
       </w:r>
       <w:r>
+        <w:rPr>
+          <w:b w:val="0"/>
+        </w:rPr>
         <w:t>する情報です。</w:t>
       </w:r>
     </w:p>
@@ -2995,6 +3627,7 @@
       </w:pPr>
       <w:r>
         <w:rPr>
+          <w:b w:val="0"/>
           <w:i/>
           <w:sz w:val="18"/>
         </w:rPr>
@@ -3006,11 +3639,17 @@
         <w:pStyle w:val="Heading1"/>
       </w:pPr>
       <w:r>
+        <w:rPr>
+          <w:b w:val="0"/>
+        </w:rPr>
         <w:t>8.7. 因果上流 ≈ 治療の難しさ</w:t>
       </w:r>
     </w:p>
     <w:p>
       <w:r>
+        <w:rPr>
+          <w:b w:val="0"/>
+        </w:rPr>
         <w:t>LiNGAMで推定された因果順序を「治療しやすさ」と並べると、興味深い対応が見られます：</w:t>
       </w:r>
     </w:p>
@@ -3388,6 +4027,9 @@
         <w:t>なぜこうなるか？</w:t>
       </w:r>
       <w:r>
+        <w:rPr>
+          <w:b w:val="0"/>
+        </w:rPr>
         <w:t>: 「治療できない変数」は他の変数に一方的に影響を与えるため、自然と因果の上流（根っこ）に来ます。逆に「薬で変えやすい変数」は多くの経路から影響を受ける下流に位置します。</w:t>
       </w:r>
     </w:p>
@@ -3399,6 +4041,9 @@
         <w:t>実用的な含意</w:t>
       </w:r>
       <w:r>
+        <w:rPr>
+          <w:b w:val="0"/>
+        </w:rPr>
         <w:t>: Hodge分解の因果ポテンシャルφが低い（下流の）変数は、</w:t>
       </w:r>
       <w:r>
@@ -3408,6 +4053,9 @@
         <w:t>治療ターゲットの候補</w:t>
       </w:r>
       <w:r>
+        <w:rPr>
+          <w:b w:val="0"/>
+        </w:rPr>
         <w:t>として自動抽出できる可能性があります。</w:t>
       </w:r>
     </w:p>
@@ -3416,6 +4064,9 @@
         <w:pStyle w:val="Heading1"/>
       </w:pPr>
       <w:r>
+        <w:rPr>
+          <w:b w:val="0"/>
+        </w:rPr>
         <w:t>8.8. フィードバック（循環）をどう扱うか — 実運用への道筋</w:t>
       </w:r>
     </w:p>
@@ -3424,11 +4075,17 @@
         <w:pStyle w:val="Heading2"/>
       </w:pPr>
       <w:r>
+        <w:rPr>
+          <w:b w:val="0"/>
+        </w:rPr>
         <w:t>臨床的にはフィードバックが正しい</w:t>
       </w:r>
     </w:p>
     <w:p>
       <w:r>
+        <w:rPr>
+          <w:b w:val="0"/>
+        </w:rPr>
         <w:t>DAG（一方向因果）は数学的に便利ですが、臨床的には循環が当たり前です：</w:t>
       </w:r>
     </w:p>
@@ -3437,6 +4094,9 @@
         <w:pStyle w:val="ListBullet"/>
       </w:pPr>
       <w:r>
+        <w:rPr>
+          <w:b w:val="0"/>
+        </w:rPr>
         <w:t>運動耐容能低下 → 虚血悪化 → さらに運動能力低下 → …（フィードバックループ）</w:t>
       </w:r>
     </w:p>
@@ -3445,6 +4105,9 @@
         <w:pStyle w:val="ListBullet"/>
       </w:pPr>
       <w:r>
+        <w:rPr>
+          <w:b w:val="0"/>
+        </w:rPr>
         <w:t>高血圧 → 心筋肥大 → 虚血 → 交感神経活性化 → さらに高血圧 → …</w:t>
       </w:r>
     </w:p>
@@ -3453,11 +4116,17 @@
         <w:pStyle w:val="Heading2"/>
       </w:pPr>
       <w:r>
+        <w:rPr>
+          <w:b w:val="0"/>
+        </w:rPr>
         <w:t>辺ごとの「フィードバック率」で分類（図8C）</w:t>
       </w:r>
     </w:p>
     <w:p>
       <w:r>
+        <w:rPr>
+          <w:b w:val="0"/>
+        </w:rPr>
         <w:t>ECDアンサンブル（LiNGAMの結果をスペクトル因果性に注入）では、辺ごとに「一方向因果」か「フィードバック」かを数値化できます：</w:t>
       </w:r>
     </w:p>
@@ -3472,6 +4141,9 @@
         <w:t>Age → RestBP</w:t>
       </w:r>
       <w:r>
+        <w:rPr>
+          <w:b w:val="0"/>
+        </w:rPr>
         <w:t>: フィードバック率 0% → 純粋な一方向因果</w:t>
       </w:r>
     </w:p>
@@ -3486,6 +4158,9 @@
         <w:t>RestBP ↔ STDep</w:t>
       </w:r>
       <w:r>
+        <w:rPr>
+          <w:b w:val="0"/>
+        </w:rPr>
         <w:t>: フィードバック率 24% → 弱い循環</w:t>
       </w:r>
     </w:p>
@@ -3500,6 +4175,9 @@
         <w:t>MaxHR ↔ STDep</w:t>
       </w:r>
       <w:r>
+        <w:rPr>
+          <w:b w:val="0"/>
+        </w:rPr>
         <w:t xml:space="preserve">: フィードバック率 </w:t>
       </w:r>
       <w:r>
@@ -3509,6 +4187,9 @@
         <w:t>73%</w:t>
       </w:r>
       <w:r>
+        <w:rPr>
+          <w:b w:val="0"/>
+        </w:rPr>
         <w:t xml:space="preserve"> → </w:t>
       </w:r>
       <w:r>
@@ -3523,6 +4204,9 @@
         <w:pStyle w:val="Heading2"/>
       </w:pPr>
       <w:r>
+        <w:rPr>
+          <w:b w:val="0"/>
+        </w:rPr>
         <w:t>実運用の推奨フロー</w:t>
       </w:r>
     </w:p>
@@ -3602,6 +4286,7 @@
       </w:pPr>
       <w:r>
         <w:rPr>
+          <w:b w:val="0"/>
           <w:i/>
           <w:sz w:val="18"/>
         </w:rPr>
@@ -3613,6 +4298,9 @@
         <w:pStyle w:val="Heading1"/>
       </w:pPr>
       <w:r>
+        <w:rPr>
+          <w:b w:val="0"/>
+        </w:rPr>
         <w:t>9. まとめ: スペクトル因果性は何が新しいか</w:t>
       </w:r>
     </w:p>
@@ -3696,10 +4384,10 @@
             <w:r/>
             <w:r>
               <w:rPr>
-                <w:b w:val="0"/>
+                <w:b/>
                 <w:sz w:val="18"/>
               </w:rPr>
-              <w:t>**入力**</w:t>
+              <w:t>入力</w:t>
             </w:r>
           </w:p>
         </w:tc>
@@ -3752,10 +4440,10 @@
             <w:r/>
             <w:r>
               <w:rPr>
-                <w:b w:val="0"/>
+                <w:b/>
                 <w:sz w:val="18"/>
               </w:rPr>
-              <w:t>**出力**</w:t>
+              <w:t>出力</w:t>
             </w:r>
           </w:p>
         </w:tc>
@@ -3808,10 +4496,10 @@
             <w:r/>
             <w:r>
               <w:rPr>
-                <w:b w:val="0"/>
+                <w:b/>
                 <w:sz w:val="18"/>
               </w:rPr>
-              <w:t>**方向性の同定原理**</w:t>
+              <w:t>方向性の同定原理</w:t>
             </w:r>
           </w:p>
         </w:tc>
@@ -3864,10 +4552,10 @@
             <w:r/>
             <w:r>
               <w:rPr>
-                <w:b w:val="0"/>
+                <w:b/>
                 <w:sz w:val="18"/>
               </w:rPr>
-              <w:t>**フィードバック**</w:t>
+              <w:t>フィードバック</w:t>
             </w:r>
           </w:p>
         </w:tc>
@@ -3920,10 +4608,10 @@
             <w:r/>
             <w:r>
               <w:rPr>
-                <w:b w:val="0"/>
+                <w:b/>
                 <w:sz w:val="18"/>
               </w:rPr>
-              <w:t>**Hill基準の得意領域**</w:t>
+              <w:t>Hill基準の得意領域</w:t>
             </w:r>
           </w:p>
         </w:tc>
@@ -3976,10 +4664,10 @@
             <w:r/>
             <w:r>
               <w:rPr>
-                <w:b w:val="0"/>
+                <w:b/>
                 <w:sz w:val="18"/>
               </w:rPr>
-              <w:t>**因果の梯子**</w:t>
+              <w:t>因果の梯子</w:t>
             </w:r>
           </w:p>
         </w:tc>
@@ -4032,10 +4720,10 @@
             <w:r/>
             <w:r>
               <w:rPr>
-                <w:b w:val="0"/>
+                <w:b/>
                 <w:sz w:val="18"/>
               </w:rPr>
-              <w:t>**最適な使い方**</w:t>
+              <w:t>最適な使い方</w:t>
             </w:r>
           </w:p>
         </w:tc>
@@ -4083,6 +4771,9 @@
         <w:pStyle w:val="Heading2"/>
       </w:pPr>
       <w:r>
+        <w:rPr>
+          <w:b w:val="0"/>
+        </w:rPr>
         <w:t>一言で言うと</w:t>
       </w:r>
     </w:p>
@@ -4090,17 +4781,18 @@
       <w:pPr>
         <w:ind w:left="850"/>
       </w:pPr>
-      <w:r/>
       <w:r>
         <w:rPr>
           <w:b/>
         </w:rPr>
         <w:t>スペクトル因果性は、「データから因果を見つける」のではなく、「知識とデータを融合して因果を理解する」手法です。</w:t>
       </w:r>
-      <w:r/>
     </w:p>
     <w:p>
       <w:r>
+        <w:rPr>
+          <w:b w:val="0"/>
+        </w:rPr>
         <w:t>これは、ベテラン臨床医が日常的に行っている推論 —「この検査値を見れば、あの病態が理解できる」— を数学的に形式化したものとも言えます。</w:t>
       </w:r>
     </w:p>
@@ -4109,6 +4801,9 @@
         <w:pStyle w:val="Heading1"/>
       </w:pPr>
       <w:r>
+        <w:rPr>
+          <w:b w:val="0"/>
+        </w:rPr>
         <w:t>10. 用語集</w:t>
       </w:r>
     </w:p>
@@ -4173,10 +4868,10 @@
             <w:r/>
             <w:r>
               <w:rPr>
-                <w:b w:val="0"/>
+                <w:b/>
                 <w:sz w:val="18"/>
               </w:rPr>
-              <w:t>**スペクトル分解**</w:t>
+              <w:t>スペクトル分解</w:t>
             </w:r>
           </w:p>
         </w:tc>
@@ -4211,10 +4906,10 @@
             <w:r/>
             <w:r>
               <w:rPr>
-                <w:b w:val="0"/>
+                <w:b/>
                 <w:sz w:val="18"/>
               </w:rPr>
-              <w:t>**磁気ラプラシアン**</w:t>
+              <w:t>磁気ラプラシアン</w:t>
             </w:r>
           </w:p>
         </w:tc>
@@ -4249,10 +4944,10 @@
             <w:r/>
             <w:r>
               <w:rPr>
-                <w:b w:val="0"/>
+                <w:b/>
                 <w:sz w:val="18"/>
               </w:rPr>
-              <w:t>**Hodge分解**</w:t>
+              <w:t>Hodge分解</w:t>
             </w:r>
           </w:p>
         </w:tc>
@@ -4287,10 +4982,10 @@
             <w:r/>
             <w:r>
               <w:rPr>
-                <w:b w:val="0"/>
+                <w:b/>
                 <w:sz w:val="18"/>
               </w:rPr>
-              <w:t>**因果ポテンシャル**</w:t>
+              <w:t>因果ポテンシャル</w:t>
             </w:r>
           </w:p>
         </w:tc>
@@ -4325,10 +5020,10 @@
             <w:r/>
             <w:r>
               <w:rPr>
-                <w:b w:val="0"/>
+                <w:b/>
                 <w:sz w:val="18"/>
               </w:rPr>
-              <w:t>**ユーティリティ質問**</w:t>
+              <w:t>ユーティリティ質問</w:t>
             </w:r>
           </w:p>
         </w:tc>
@@ -4363,10 +5058,10 @@
             <w:r/>
             <w:r>
               <w:rPr>
-                <w:b w:val="0"/>
+                <w:b/>
                 <w:sz w:val="18"/>
               </w:rPr>
-              <w:t>**Eigentheme**</w:t>
+              <w:t>Eigentheme</w:t>
             </w:r>
           </w:p>
         </w:tc>
@@ -4401,10 +5096,10 @@
             <w:r/>
             <w:r>
               <w:rPr>
-                <w:b w:val="0"/>
+                <w:b/>
                 <w:sz w:val="18"/>
               </w:rPr>
-              <w:t>**SCI/SCD**</w:t>
+              <w:t>SCI/SCD</w:t>
             </w:r>
           </w:p>
         </w:tc>
@@ -4439,10 +5134,10 @@
             <w:r/>
             <w:r>
               <w:rPr>
-                <w:b w:val="0"/>
+                <w:b/>
                 <w:sz w:val="18"/>
               </w:rPr>
-              <w:t>**ECD**</w:t>
+              <w:t>ECD</w:t>
             </w:r>
           </w:p>
         </w:tc>
@@ -4477,10 +5172,10 @@
             <w:r/>
             <w:r>
               <w:rPr>
-                <w:b w:val="0"/>
+                <w:b/>
                 <w:sz w:val="18"/>
               </w:rPr>
-              <w:t>**LiNGAM**</w:t>
+              <w:t>LiNGAM</w:t>
             </w:r>
           </w:p>
         </w:tc>
@@ -4515,10 +5210,10 @@
             <w:r/>
             <w:r>
               <w:rPr>
-                <w:b w:val="0"/>
+                <w:b/>
                 <w:sz w:val="18"/>
               </w:rPr>
-              <w:t>**DAG**</w:t>
+              <w:t>DAG</w:t>
             </w:r>
           </w:p>
         </w:tc>
@@ -4553,10 +5248,10 @@
             <w:r/>
             <w:r>
               <w:rPr>
-                <w:b w:val="0"/>
+                <w:b/>
                 <w:sz w:val="18"/>
               </w:rPr>
-              <w:t>**DCG**</w:t>
+              <w:t>DCG</w:t>
             </w:r>
           </w:p>
         </w:tc>
@@ -4591,10 +5286,10 @@
             <w:r/>
             <w:r>
               <w:rPr>
-                <w:b w:val="0"/>
+                <w:b/>
                 <w:sz w:val="18"/>
               </w:rPr>
-              <w:t>**Hill の9基準**</w:t>
+              <w:t>Hill の9基準</w:t>
             </w:r>
           </w:p>
         </w:tc>
@@ -4629,10 +5324,10 @@
             <w:r/>
             <w:r>
               <w:rPr>
-                <w:b w:val="0"/>
+                <w:b/>
                 <w:sz w:val="18"/>
               </w:rPr>
-              <w:t>**α（アルファ）**</w:t>
+              <w:t>α（アルファ）</w:t>
             </w:r>
           </w:p>
         </w:tc>
@@ -4667,10 +5362,20 @@
             <w:r/>
             <w:r>
               <w:rPr>
-                <w:b w:val="0"/>
+                <w:rFonts w:ascii="Cambria Math" w:hAnsi="Cambria Math"/>
+                <w:b/>
                 <w:sz w:val="18"/>
               </w:rPr>
-              <w:t>**$p_{\text{flip}}$**</w:t>
+              <w:t>p</w:t>
+            </w:r>
+            <w:r>
+              <w:rPr>
+                <w:rFonts w:ascii="Cambria Math" w:hAnsi="Cambria Math"/>
+                <w:b/>
+                <w:sz w:val="18"/>
+                <w:vertAlign w:val="subscript"/>
+              </w:rPr>
+              <w:t>flip</w:t>
             </w:r>
           </w:p>
         </w:tc>
@@ -4705,10 +5410,10 @@
             <w:r/>
             <w:r>
               <w:rPr>
-                <w:b w:val="0"/>
+                <w:b/>
                 <w:sz w:val="18"/>
               </w:rPr>
-              <w:t>**フィードバック率**</w:t>
+              <w:t>フィードバック率</w:t>
             </w:r>
           </w:p>
         </w:tc>
@@ -4743,10 +5448,10 @@
             <w:r/>
             <w:r>
               <w:rPr>
-                <w:b w:val="0"/>
+                <w:b/>
                 <w:sz w:val="18"/>
               </w:rPr>
-              <w:t>**因果上流性**</w:t>
+              <w:t>因果上流性</w:t>
             </w:r>
           </w:p>
         </w:tc>
@@ -4776,21 +5481,31 @@
         <w:pStyle w:val="Heading1"/>
       </w:pPr>
       <w:r>
+        <w:rPr>
+          <w:b w:val="0"/>
+        </w:rPr>
         <w:t>付録: 解析の再現方法</w:t>
       </w:r>
     </w:p>
     <w:p>
       <w:r>
+        <w:rPr>
+          <w:b w:val="0"/>
+        </w:rPr>
         <w:t xml:space="preserve">本稿の全解析は </w:t>
       </w:r>
       <w:r>
         <w:rPr>
           <w:rFonts w:ascii="Courier New" w:hAnsi="Courier New"/>
+          <w:b w:val="0"/>
           <w:sz w:val="18"/>
         </w:rPr>
         <w:t>demo_spectral_causality.py</w:t>
       </w:r>
       <w:r>
+        <w:rPr>
+          <w:b w:val="0"/>
+        </w:rPr>
         <w:t xml:space="preserve"> で再現可能です。</w:t>
       </w:r>
     </w:p>
@@ -4810,6 +5525,9 @@
     </w:p>
     <w:p>
       <w:r>
+        <w:rPr>
+          <w:b w:val="0"/>
+        </w:rPr>
         <w:t>データ: UCI Heart Disease Dataset（Cleveland subset, 297名, 5連続変数）</w:t>
       </w:r>
     </w:p>
@@ -4818,6 +5536,9 @@
         <w:pStyle w:val="ListBullet"/>
       </w:pPr>
       <w:r>
+        <w:rPr>
+          <w:b w:val="0"/>
+        </w:rPr>
         <w:t>自動的にUCIリポジトリからダウンロードされます</w:t>
       </w:r>
     </w:p>
@@ -4826,6 +5547,9 @@
         <w:pStyle w:val="ListBullet"/>
       </w:pPr>
       <w:r>
+        <w:rPr>
+          <w:b w:val="0"/>
+        </w:rPr>
         <w:t>元論文: Detrano et al. (1989) American Journal of Cardiology</w:t>
       </w:r>
     </w:p>
@@ -4834,6 +5558,9 @@
         <w:pStyle w:val="Heading1"/>
       </w:pPr>
       <w:r>
+        <w:rPr>
+          <w:b w:val="0"/>
+        </w:rPr>
         <w:t>参考文献</w:t>
       </w:r>
     </w:p>
@@ -4842,15 +5569,22 @@
         <w:pStyle w:val="ListNumber"/>
       </w:pPr>
       <w:r>
+        <w:rPr>
+          <w:b w:val="0"/>
+        </w:rPr>
         <w:t xml:space="preserve">Pearl, J. (2009). </w:t>
       </w:r>
       <w:r>
         <w:rPr>
+          <w:b w:val="0"/>
           <w:i/>
         </w:rPr>
         <w:t>Causality: Models, Reasoning, and Inference</w:t>
       </w:r>
       <w:r>
+        <w:rPr>
+          <w:b w:val="0"/>
+        </w:rPr>
         <w:t xml:space="preserve"> (2nd ed.). Cambridge University Press.</w:t>
       </w:r>
     </w:p>
@@ -4859,15 +5593,22 @@
         <w:pStyle w:val="ListNumber"/>
       </w:pPr>
       <w:r>
+        <w:rPr>
+          <w:b w:val="0"/>
+        </w:rPr>
         <w:t xml:space="preserve">Hill, A.B. (1965). "The Environment and Disease: Association or Causation?" </w:t>
       </w:r>
       <w:r>
         <w:rPr>
+          <w:b w:val="0"/>
           <w:i/>
         </w:rPr>
         <w:t>Proceedings of the Royal Society of Medicine</w:t>
       </w:r>
       <w:r>
+        <w:rPr>
+          <w:b w:val="0"/>
+        </w:rPr>
         <w:t>, 58, 295-300.</w:t>
       </w:r>
     </w:p>
@@ -4876,15 +5617,22 @@
         <w:pStyle w:val="ListNumber"/>
       </w:pPr>
       <w:r>
+        <w:rPr>
+          <w:b w:val="0"/>
+        </w:rPr>
         <w:t xml:space="preserve">Shimizu, S. et al. (2006). "A Linear Non-Gaussian Acyclic Model for Causal Discovery." </w:t>
       </w:r>
       <w:r>
         <w:rPr>
+          <w:b w:val="0"/>
           <w:i/>
         </w:rPr>
         <w:t>JMLR</w:t>
       </w:r>
       <w:r>
+        <w:rPr>
+          <w:b w:val="0"/>
+        </w:rPr>
         <w:t>, 7, 2003-2030.</w:t>
       </w:r>
     </w:p>
@@ -4893,15 +5641,22 @@
         <w:pStyle w:val="ListNumber"/>
       </w:pPr>
       <w:r>
+        <w:rPr>
+          <w:b w:val="0"/>
+        </w:rPr>
         <w:t xml:space="preserve">Seifert, B., Wendler, C. &amp; Püschel, M. (2023). "Causal Fourier Analysis on Directed Acyclic Graphs and Posets." </w:t>
       </w:r>
       <w:r>
         <w:rPr>
+          <w:b w:val="0"/>
           <w:i/>
         </w:rPr>
         <w:t>IEEE Trans. Signal Processing</w:t>
       </w:r>
       <w:r>
+        <w:rPr>
+          <w:b w:val="0"/>
+        </w:rPr>
         <w:t>.</w:t>
       </w:r>
     </w:p>
@@ -4910,15 +5665,22 @@
         <w:pStyle w:val="ListNumber"/>
       </w:pPr>
       <w:r>
+        <w:rPr>
+          <w:b w:val="0"/>
+        </w:rPr>
         <w:t xml:space="preserve">Zhang, X. et al. (2022). "MGC: A Complex-Valued Graph Convolutional Network for Directed Graphs." </w:t>
       </w:r>
       <w:r>
         <w:rPr>
+          <w:b w:val="0"/>
           <w:i/>
         </w:rPr>
         <w:t>arXiv:2110.07570</w:t>
       </w:r>
       <w:r>
+        <w:rPr>
+          <w:b w:val="0"/>
+        </w:rPr>
         <w:t>.</w:t>
       </w:r>
     </w:p>
@@ -4927,15 +5689,22 @@
         <w:pStyle w:val="ListNumber"/>
       </w:pPr>
       <w:r>
+        <w:rPr>
+          <w:b w:val="0"/>
+        </w:rPr>
         <w:t xml:space="preserve">Jiang, X. et al. (2011). "Statistical ranking and combinatorial Hodge theory." </w:t>
       </w:r>
       <w:r>
         <w:rPr>
+          <w:b w:val="0"/>
           <w:i/>
         </w:rPr>
         <w:t>Mathematical Programming</w:t>
       </w:r>
       <w:r>
+        <w:rPr>
+          <w:b w:val="0"/>
+        </w:rPr>
         <w:t>, 127, 203-244.</w:t>
       </w:r>
     </w:p>
@@ -4944,15 +5713,22 @@
         <w:pStyle w:val="ListNumber"/>
       </w:pPr>
       <w:r>
+        <w:rPr>
+          <w:b w:val="0"/>
+        </w:rPr>
         <w:t xml:space="preserve">Maehara, K. &amp; Ohkawa, Y. (2019). "Modeling latent flows on single-cell data using the Hodge decomposition." </w:t>
       </w:r>
       <w:r>
         <w:rPr>
+          <w:b w:val="0"/>
           <w:i/>
         </w:rPr>
         <w:t>bioRxiv</w:t>
       </w:r>
       <w:r>
+        <w:rPr>
+          <w:b w:val="0"/>
+        </w:rPr>
         <w:t>.</w:t>
       </w:r>
     </w:p>
@@ -4961,15 +5737,22 @@
         <w:pStyle w:val="ListNumber"/>
       </w:pPr>
       <w:r>
+        <w:rPr>
+          <w:b w:val="0"/>
+        </w:rPr>
         <w:t xml:space="preserve">Kotoku, J. et al. (2020). "Causal relations of health indices inferred statistically using the DirectLiNGAM algorithm." </w:t>
       </w:r>
       <w:r>
         <w:rPr>
+          <w:b w:val="0"/>
           <w:i/>
         </w:rPr>
         <w:t>PLOS ONE</w:t>
       </w:r>
       <w:r>
+        <w:rPr>
+          <w:b w:val="0"/>
+        </w:rPr>
         <w:t>.</w:t>
       </w:r>
     </w:p>
@@ -4978,15 +5761,22 @@
         <w:pStyle w:val="ListNumber"/>
       </w:pPr>
       <w:r>
+        <w:rPr>
+          <w:b w:val="0"/>
+        </w:rPr>
         <w:t xml:space="preserve">Okuda, S. et al. (2025). "Operationalizing Longitudinal Causal Discovery Under Real-World Workflow Constraints." </w:t>
       </w:r>
       <w:r>
         <w:rPr>
+          <w:b w:val="0"/>
           <w:i/>
         </w:rPr>
         <w:t>arXiv:2602.23800</w:t>
       </w:r>
       <w:r>
+        <w:rPr>
+          <w:b w:val="0"/>
+        </w:rPr>
         <w:t>.</w:t>
       </w:r>
     </w:p>
@@ -4995,15 +5785,22 @@
         <w:pStyle w:val="ListNumber"/>
       </w:pPr>
       <w:r>
+        <w:rPr>
+          <w:b w:val="0"/>
+        </w:rPr>
         <w:t xml:space="preserve">Detrano, R. et al. (1989). "International application of a new probability algorithm for the diagnosis of coronary artery disease." </w:t>
       </w:r>
       <w:r>
         <w:rPr>
+          <w:b w:val="0"/>
           <w:i/>
         </w:rPr>
         <w:t>American Journal of Cardiology</w:t>
       </w:r>
       <w:r>
+        <w:rPr>
+          <w:b w:val="0"/>
+        </w:rPr>
         <w:t>, 64, 304-310.</w:t>
       </w:r>
     </w:p>

</xml_diff>